<commit_message>
Updated modeling scripts to handle mediation analysis. Created draft final report and presentation slides. Heavy work in the methods section determining the best way to determine ignificance for the Bayesian model. Currently the SEXIT framework seems appealing.
</commit_message>
<xml_diff>
--- a/Project1/Reports/Project1_Final_Report.docx
+++ b/Project1/Reports/Project1_Final_Report.docx
@@ -90,7 +90,10 @@
       </w:sdtPr>
       <w:sdtEndPr>
         <w:rPr>
+          <w:rFonts w:ascii="Times New Roman" w:eastAsia="Times New Roman" w:hAnsi="Times New Roman" w:cs="Times New Roman"/>
           <w:noProof/>
+          <w:kern w:val="0"/>
+          <w14:ligatures w14:val="none"/>
         </w:rPr>
       </w:sdtEndPr>
       <w:sdtContent>
@@ -574,7 +577,6 @@
         </w:p>
         <w:p>
           <w:pPr>
-            <w:spacing w:after="0" w:line="240" w:lineRule="auto"/>
             <w:contextualSpacing/>
           </w:pPr>
           <w:r>
@@ -670,46 +672,61 @@
         <w:pStyle w:val="Heading2"/>
       </w:pPr>
       <w:r>
+        <w:t>Introduction</w:t>
+      </w:r>
+      <w:bookmarkEnd w:id="0"/>
+    </w:p>
+    <w:p>
+      <w:pPr>
+        <w:spacing w:line="480" w:lineRule="auto"/>
+      </w:pPr>
+      <w:r>
+        <w:t xml:space="preserve">The data for this project comes from the Multicenter AIDS Cohort Study (MACS), which is an ongoing prospective cohort study of HIV-1 infection in homosexual and bisexual men in four major U.S. cities. </w:t>
+      </w:r>
+      <w:r>
+        <w:t xml:space="preserve">The dataset contains up to 8 years of annual follow-up on </w:t>
+      </w:r>
+      <w:r>
+        <w:t xml:space="preserve">715 </w:t>
+      </w:r>
+      <w:r>
+        <w:t xml:space="preserve">HIV-infected </w:t>
+      </w:r>
+      <w:r>
         <w:lastRenderedPageBreak/>
-        <w:t>Introduction</w:t>
-      </w:r>
-      <w:bookmarkEnd w:id="0"/>
+        <w:t>men after initiating HAART (highly active antiretroviral therapy), including longitudinal laboratory measures, quality-of-life outcomes, and demographic</w:t>
+      </w:r>
+      <w:r>
+        <w:t xml:space="preserve"> and </w:t>
+      </w:r>
+      <w:r>
+        <w:t>health information.</w:t>
+      </w:r>
     </w:p>
     <w:p>
       <w:pPr>
         <w:spacing w:line="480" w:lineRule="auto"/>
       </w:pPr>
       <w:r>
-        <w:t xml:space="preserve">The data for this project comes from the Multicenter AIDS Cohort Study (MACS), which is an ongoing prospective cohort study of HIV-1 infection in homosexual and bisexual men in four major U.S. cities. </w:t>
-      </w:r>
-      <w:r>
-        <w:t xml:space="preserve">The dataset contains up to 8 years of annual follow-up on </w:t>
-      </w:r>
-      <w:r>
-        <w:t xml:space="preserve">715 </w:t>
-      </w:r>
-      <w:r>
-        <w:t>HIV-infected men after initiating HAART (highly active antiretroviral therapy), including longitudinal laboratory measures, quality-of-life outcomes, and demographic</w:t>
-      </w:r>
-      <w:r>
-        <w:t xml:space="preserve"> and </w:t>
-      </w:r>
-      <w:r>
-        <w:t>health information.</w:t>
-      </w:r>
-    </w:p>
-    <w:p>
-      <w:pPr>
-        <w:spacing w:line="480" w:lineRule="auto"/>
-      </w:pPr>
-      <w:r>
         <w:t>The participants were seen annually with year 0 being their last untreated visit, just before starting HAART. All other visits, from year 1 to year 8, are on the treatment plan.</w:t>
       </w:r>
       <w:r>
         <w:t xml:space="preserve"> Data included four measures of treatment response. </w:t>
       </w:r>
       <w:r>
-        <w:t>The first outcome is viral load defined as the number of HIV RNA copies per milliliter of blood. The second outcome is CD4+ T-cell count, a measure of immune function.</w:t>
+        <w:t xml:space="preserve">The first outcome is viral load defined as the number of HIV RNA copies per milliliter of blood. The second outcome is CD4+ T-cell count, </w:t>
+      </w:r>
+      <w:r>
+        <w:t xml:space="preserve">which is </w:t>
+      </w:r>
+      <w:r>
+        <w:t xml:space="preserve">a measure of immune </w:t>
+      </w:r>
+      <w:r>
+        <w:t>health</w:t>
+      </w:r>
+      <w:r>
+        <w:t>.</w:t>
       </w:r>
       <w:r>
         <w:t xml:space="preserve"> The last two are </w:t>
@@ -720,30 +737,21 @@
     </w:p>
     <w:p>
       <w:pPr>
-        <w:spacing w:before="100" w:beforeAutospacing="1" w:after="100" w:afterAutospacing="1" w:line="240" w:lineRule="auto"/>
+        <w:spacing w:before="100" w:beforeAutospacing="1" w:after="100" w:afterAutospacing="1"/>
         <w:contextualSpacing/>
         <w:rPr>
-          <w:rFonts w:eastAsia="Times New Roman" w:cs="Times New Roman"/>
-          <w:color w:val="000000" w:themeColor="text1"/>
-          <w:kern w:val="0"/>
-          <w14:ligatures w14:val="none"/>
-        </w:rPr>
-      </w:pPr>
-      <w:r>
-        <w:rPr>
-          <w:rFonts w:eastAsia="Times New Roman" w:cs="Times New Roman"/>
-          <w:color w:val="000000" w:themeColor="text1"/>
-          <w:kern w:val="0"/>
-          <w14:ligatures w14:val="none"/>
+          <w:color w:val="000000" w:themeColor="text1"/>
+        </w:rPr>
+      </w:pPr>
+      <w:r>
+        <w:rPr>
+          <w:color w:val="000000" w:themeColor="text1"/>
         </w:rPr>
         <w:t xml:space="preserve">The </w:t>
       </w:r>
       <w:r>
         <w:rPr>
-          <w:rFonts w:eastAsia="Times New Roman" w:cs="Times New Roman"/>
-          <w:color w:val="000000" w:themeColor="text1"/>
-          <w:kern w:val="0"/>
-          <w14:ligatures w14:val="none"/>
+          <w:color w:val="000000" w:themeColor="text1"/>
         </w:rPr>
         <w:t>purpose of this report is to answer the following hypothesis/questions of interest:</w:t>
       </w:r>
@@ -766,14 +774,88 @@
           <w:rFonts w:asciiTheme="minorHAnsi" w:hAnsiTheme="minorHAnsi"/>
           <w:color w:val="000000" w:themeColor="text1"/>
         </w:rPr>
-        <w:t xml:space="preserve">Year-2 viral load, measured as log10 HIV RNA copies/mL, will be higher among </w:t>
-      </w:r>
+        <w:t xml:space="preserve">Year-2 viral load, measured as </w:t>
+      </w:r>
+      <m:oMath>
+        <m:sSub>
+          <m:sSubPr>
+            <m:ctrlPr>
+              <w:rPr>
+                <w:rFonts w:ascii="Cambria Math" w:eastAsiaTheme="minorHAnsi" w:hAnsi="Cambria Math" w:cstheme="minorBidi"/>
+                <w:iCs/>
+                <w:color w:val="000000" w:themeColor="text1"/>
+                <w:kern w:val="2"/>
+                <w14:ligatures w14:val="standardContextual"/>
+              </w:rPr>
+            </m:ctrlPr>
+          </m:sSubPr>
+          <m:e>
+            <m:r>
+              <m:rPr>
+                <m:sty m:val="p"/>
+              </m:rPr>
+              <w:rPr>
+                <w:rFonts w:ascii="Cambria Math" w:eastAsiaTheme="minorHAnsi" w:hAnsi="Cambria Math" w:cstheme="minorBidi"/>
+                <w:color w:val="000000" w:themeColor="text1"/>
+                <w:kern w:val="2"/>
+                <w14:ligatures w14:val="standardContextual"/>
+              </w:rPr>
+              <m:t>log</m:t>
+            </m:r>
+          </m:e>
+          <m:sub>
+            <m:r>
+              <m:rPr>
+                <m:sty m:val="p"/>
+              </m:rPr>
+              <w:rPr>
+                <w:rFonts w:ascii="Cambria Math" w:eastAsiaTheme="minorHAnsi" w:hAnsi="Cambria Math" w:cstheme="minorBidi"/>
+                <w:color w:val="000000" w:themeColor="text1"/>
+                <w:kern w:val="2"/>
+                <w14:ligatures w14:val="standardContextual"/>
+              </w:rPr>
+              <m:t>10</m:t>
+            </m:r>
+          </m:sub>
+        </m:sSub>
+      </m:oMath>
       <w:r>
         <w:rPr>
           <w:rFonts w:asciiTheme="minorHAnsi" w:hAnsiTheme="minorHAnsi"/>
-          <w:color w:val="000000" w:themeColor="text1"/>
-        </w:rPr>
-        <w:t>homosexual and bisexual mean with HIV-1</w:t>
+          <w:iCs/>
+          <w:color w:val="000000" w:themeColor="text1"/>
+          <w:kern w:val="2"/>
+          <w14:ligatures w14:val="standardContextual"/>
+        </w:rPr>
+        <w:t xml:space="preserve"> </w:t>
+      </w:r>
+      <w:r>
+        <w:rPr>
+          <w:rFonts w:asciiTheme="minorHAnsi" w:hAnsiTheme="minorHAnsi"/>
+          <w:color w:val="000000" w:themeColor="text1"/>
+        </w:rPr>
+        <w:t xml:space="preserve">HIV RNA copies/mL, will be </w:t>
+      </w:r>
+      <w:r>
+        <w:rPr>
+          <w:rFonts w:asciiTheme="minorHAnsi" w:hAnsiTheme="minorHAnsi"/>
+          <w:color w:val="000000" w:themeColor="text1"/>
+        </w:rPr>
+        <w:t>higher</w:t>
+      </w:r>
+      <w:r>
+        <w:rPr>
+          <w:rFonts w:asciiTheme="minorHAnsi" w:hAnsiTheme="minorHAnsi"/>
+          <w:color w:val="000000" w:themeColor="text1"/>
+        </w:rPr>
+        <w:t xml:space="preserve"> among </w:t>
+      </w:r>
+      <w:r>
+        <w:rPr>
+          <w:rFonts w:asciiTheme="minorHAnsi" w:hAnsiTheme="minorHAnsi"/>
+          <w:color w:val="000000" w:themeColor="text1"/>
+        </w:rPr>
+        <w:t>homosexual and bisexual men with HIV-1</w:t>
       </w:r>
       <w:r>
         <w:rPr>
@@ -843,7 +925,7 @@
           <w:rFonts w:asciiTheme="minorHAnsi" w:hAnsiTheme="minorHAnsi"/>
           <w:color w:val="000000" w:themeColor="text1"/>
         </w:rPr>
-        <w:t>homosexual and bisexual mean with HIV-1</w:t>
+        <w:t>homosexual and bisexual men with HIV-1</w:t>
       </w:r>
       <w:r>
         <w:rPr>
@@ -867,7 +949,7 @@
           <w:ilvl w:val="0"/>
           <w:numId w:val="3"/>
         </w:numPr>
-        <w:spacing w:before="100" w:beforeAutospacing="1" w:after="100" w:afterAutospacing="1" w:line="480" w:lineRule="auto"/>
+        <w:spacing w:before="100" w:beforeAutospacing="1" w:after="100" w:afterAutospacing="1" w:line="240" w:lineRule="auto"/>
         <w:rPr>
           <w:rFonts w:eastAsia="Times New Roman" w:cs="Times New Roman"/>
           <w:color w:val="000000" w:themeColor="text1"/>
@@ -875,6 +957,15 @@
           <w14:ligatures w14:val="none"/>
         </w:rPr>
       </w:pPr>
+      <w:r>
+        <w:rPr>
+          <w:rFonts w:eastAsia="Times New Roman" w:cs="Times New Roman"/>
+          <w:color w:val="000000" w:themeColor="text1"/>
+          <w:kern w:val="0"/>
+          <w14:ligatures w14:val="none"/>
+        </w:rPr>
+        <w:t>Year-2 physical and mental QOL will differ between baseline hard-drug users and non-users.</w:t>
+      </w:r>
     </w:p>
     <w:p>
       <w:pPr>
@@ -883,7 +974,7 @@
           <w:ilvl w:val="0"/>
           <w:numId w:val="3"/>
         </w:numPr>
-        <w:spacing w:before="100" w:beforeAutospacing="1" w:after="100" w:afterAutospacing="1" w:line="480" w:lineRule="auto"/>
+        <w:spacing w:after="0" w:line="240" w:lineRule="auto"/>
         <w:rPr>
           <w:rFonts w:eastAsia="Times New Roman" w:cs="Times New Roman"/>
           <w:color w:val="000000" w:themeColor="text1"/>
@@ -891,6 +982,85 @@
           <w14:ligatures w14:val="none"/>
         </w:rPr>
       </w:pPr>
+      <w:r>
+        <w:rPr>
+          <w:rFonts w:eastAsia="Times New Roman" w:cs="Times New Roman"/>
+          <w:color w:val="000000" w:themeColor="text1"/>
+          <w:kern w:val="0"/>
+          <w14:ligatures w14:val="none"/>
+        </w:rPr>
+        <w:t>A</w:t>
+      </w:r>
+      <w:r>
+        <w:rPr>
+          <w:rFonts w:eastAsia="Times New Roman" w:cs="Times New Roman"/>
+          <w:color w:val="000000" w:themeColor="text1"/>
+          <w:kern w:val="0"/>
+          <w14:ligatures w14:val="none"/>
+        </w:rPr>
+        <w:t>dherence during follow-up partially mediates the association between baseline hard drug use and Year-2 outcomes</w:t>
+      </w:r>
+      <w:r>
+        <w:rPr>
+          <w:rFonts w:eastAsia="Times New Roman" w:cs="Times New Roman"/>
+          <w:color w:val="000000" w:themeColor="text1"/>
+          <w:kern w:val="0"/>
+          <w14:ligatures w14:val="none"/>
+        </w:rPr>
+        <w:t>.</w:t>
+      </w:r>
+    </w:p>
+    <w:p>
+      <w:pPr>
+        <w:pStyle w:val="ListParagraph"/>
+        <w:numPr>
+          <w:ilvl w:val="0"/>
+          <w:numId w:val="3"/>
+        </w:numPr>
+        <w:spacing w:after="0" w:line="240" w:lineRule="auto"/>
+        <w:rPr>
+          <w:rFonts w:eastAsia="Times New Roman" w:cs="Times New Roman"/>
+          <w:color w:val="000000" w:themeColor="text1"/>
+          <w:kern w:val="0"/>
+          <w14:ligatures w14:val="none"/>
+        </w:rPr>
+      </w:pPr>
+      <w:r>
+        <w:rPr>
+          <w:rFonts w:eastAsia="Times New Roman" w:cs="Times New Roman"/>
+          <w:color w:val="000000" w:themeColor="text1"/>
+          <w:kern w:val="0"/>
+          <w14:ligatures w14:val="none"/>
+        </w:rPr>
+        <w:t xml:space="preserve">Participants missing Year-2 measurements will differ from those with complete data with respect to baseline hard drug use and baseline </w:t>
+      </w:r>
+      <w:r>
+        <w:rPr>
+          <w:rFonts w:eastAsia="Times New Roman" w:cs="Times New Roman"/>
+          <w:color w:val="000000" w:themeColor="text1"/>
+          <w:kern w:val="0"/>
+          <w14:ligatures w14:val="none"/>
+        </w:rPr>
+        <w:t>outcome measures</w:t>
+      </w:r>
+      <w:r>
+        <w:rPr>
+          <w:rFonts w:eastAsia="Times New Roman" w:cs="Times New Roman"/>
+          <w:color w:val="000000" w:themeColor="text1"/>
+          <w:kern w:val="0"/>
+          <w14:ligatures w14:val="none"/>
+        </w:rPr>
+        <w:t>, suggesting that loss to follow-up may not be completely random</w:t>
+      </w:r>
+      <w:r>
+        <w:rPr>
+          <w:rFonts w:eastAsia="Times New Roman" w:cs="Times New Roman"/>
+          <w:color w:val="000000" w:themeColor="text1"/>
+          <w:kern w:val="0"/>
+          <w14:ligatures w14:val="none"/>
+        </w:rPr>
+        <w:t>.</w:t>
+      </w:r>
     </w:p>
     <w:p/>
     <w:p>
@@ -899,84 +1069,696 @@
       </w:pPr>
       <w:bookmarkStart w:id="1" w:name="_Toc221022974"/>
       <w:r>
+        <w:t>Methods</w:t>
+      </w:r>
+      <w:bookmarkEnd w:id="1"/>
+    </w:p>
+    <w:p>
+      <w:pPr>
+        <w:pStyle w:val="Heading4"/>
+      </w:pPr>
+      <w:r>
+        <w:t>2.1 Data Cleaning</w:t>
+      </w:r>
+    </w:p>
+    <w:p>
+      <w:r>
+        <w:t xml:space="preserve">The primary exposure variable, baseline hard drug use, was coded as a binary indicator (Yes vs. No), as was </w:t>
+      </w:r>
+      <w:r>
+        <w:t xml:space="preserve">the </w:t>
+      </w:r>
+      <w:r>
+        <w:t xml:space="preserve">adherence </w:t>
+      </w:r>
+      <w:r>
+        <w:t xml:space="preserve">variable </w:t>
+      </w:r>
+      <w:r>
+        <w:t>(&lt;95% vs. ≥95%).</w:t>
+      </w:r>
+    </w:p>
+    <w:p>
+      <w:r>
+        <w:t>The r</w:t>
+      </w:r>
+      <w:r>
+        <w:t xml:space="preserve">ace/ethnicity </w:t>
+      </w:r>
+      <w:r>
+        <w:t xml:space="preserve">covariate </w:t>
+      </w:r>
+      <w:r>
+        <w:t>was</w:t>
+      </w:r>
+      <w:r>
+        <w:t xml:space="preserve"> collapsed into three categories, listed as</w:t>
+      </w:r>
+      <w:r>
+        <w:t xml:space="preserve"> </w:t>
+      </w:r>
+      <w:r>
+        <w:t>Whit</w:t>
+      </w:r>
+      <w:r>
+        <w:t>e</w:t>
+      </w:r>
+      <w:r>
+        <w:t xml:space="preserve"> non-</w:t>
+      </w:r>
+      <w:r>
+        <w:t>Hispanic, Black</w:t>
+      </w:r>
+      <w:r>
+        <w:t xml:space="preserve"> non-</w:t>
+      </w:r>
+      <w:r>
+        <w:t xml:space="preserve">Hispanic, and Hispanic. </w:t>
+      </w:r>
+      <w:r>
+        <w:t>We acknowledge that race is a social construct and that observed differences likely reflect structural inequities rather than biological differences.</w:t>
+      </w:r>
+      <w:r>
+        <w:t xml:space="preserve"> Additionally, </w:t>
+      </w:r>
+      <w:r>
+        <w:t>the objective was not to estimate</w:t>
+      </w:r>
+      <w:r>
+        <w:t xml:space="preserve"> race effects but purely adjusting for confounding. </w:t>
+      </w:r>
+    </w:p>
+    <w:p>
+      <w:r>
+        <w:t xml:space="preserve">The education covariate was collapsed into </w:t>
+      </w:r>
+      <w:r>
+        <w:t xml:space="preserve">three categories, listed as </w:t>
+      </w:r>
+      <w:r>
+        <w:t>High School or less, College, and Post-grad.</w:t>
+      </w:r>
+      <w:r>
+        <w:t xml:space="preserve"> </w:t>
+      </w:r>
+      <w:r>
+        <w:t>S</w:t>
+      </w:r>
+      <w:r>
+        <w:t>moking status was collapsed into two categories, listed as former and current.</w:t>
+      </w:r>
+    </w:p>
+    <w:p>
+      <w:r>
         <w:lastRenderedPageBreak/>
-        <w:t>Methods</w:t>
-      </w:r>
-      <w:bookmarkEnd w:id="1"/>
-    </w:p>
+        <w:t>Viral load values were highly right-skewed</w:t>
+      </w:r>
+      <w:r>
+        <w:t xml:space="preserve"> and were </w:t>
+      </w:r>
+      <w:r>
+        <w:t xml:space="preserve">transformed using </w:t>
+      </w:r>
+      <w:r>
+        <w:t xml:space="preserve">logarithm with </w:t>
+      </w:r>
+      <w:r>
+        <w:t xml:space="preserve">base-10 </w:t>
+      </w:r>
+      <w:r>
+        <w:t>for</w:t>
+      </w:r>
+      <w:r>
+        <w:t xml:space="preserve"> modeling. CD4+ T-cell counts</w:t>
+      </w:r>
+      <w:r>
+        <w:t xml:space="preserve"> and QOL outcomes</w:t>
+      </w:r>
+      <w:r>
+        <w:t xml:space="preserve"> </w:t>
+      </w:r>
+      <w:r>
+        <w:t>were kept on their</w:t>
+      </w:r>
+      <w:r>
+        <w:t xml:space="preserve"> original scale</w:t>
+      </w:r>
+      <w:r>
+        <w:t>s</w:t>
+      </w:r>
+      <w:r>
+        <w:t xml:space="preserve"> </w:t>
+      </w:r>
+      <w:r>
+        <w:t xml:space="preserve">based on </w:t>
+      </w:r>
+      <w:r>
+        <w:t>residual diagnostics</w:t>
+      </w:r>
+      <w:r>
+        <w:t xml:space="preserve"> showing no strong violations to normality or constant variance assumptions</w:t>
+      </w:r>
+      <w:r>
+        <w:t xml:space="preserve"> from preliminary </w:t>
+      </w:r>
+      <w:r>
+        <w:t xml:space="preserve">frequentist </w:t>
+      </w:r>
+      <w:r>
+        <w:t xml:space="preserve">regression models. </w:t>
+      </w:r>
+      <w:r>
+        <w:t>BMI</w:t>
+      </w:r>
+      <w:r>
+        <w:t xml:space="preserve"> values labeled as 999, -1 and any values greater than 100 were converted </w:t>
+      </w:r>
+      <w:r>
+        <w:t xml:space="preserve">to </w:t>
+      </w:r>
+      <w:r>
+        <w:t>missing values.</w:t>
+      </w:r>
+    </w:p>
+    <w:p>
+      <w:pPr>
+        <w:spacing w:after="160" w:line="278" w:lineRule="auto"/>
+      </w:pPr>
+      <w:r>
+        <w:t xml:space="preserve">The original dataset was structured in long format, with multiple rows per participant corresponding to repeated annual visits. For the purposes of this analysis, the data </w:t>
+      </w:r>
+      <w:r>
+        <w:t>was</w:t>
+      </w:r>
+      <w:r>
+        <w:t xml:space="preserve"> reshaped into a subject-level </w:t>
+      </w:r>
+      <w:r>
+        <w:t xml:space="preserve">format </w:t>
+      </w:r>
+      <w:r>
+        <w:t>that included baseline (Year 0) and Year 2 measurements. Each row in th</w:t>
+      </w:r>
+      <w:r>
+        <w:t xml:space="preserve">is </w:t>
+      </w:r>
+      <w:r>
+        <w:t xml:space="preserve">dataset therefore represents a single participant, with separate variables containing baseline and Year 2 values for outcomes and covariates. </w:t>
+      </w:r>
+    </w:p>
+    <w:p/>
     <w:p>
       <w:pPr>
         <w:pStyle w:val="Heading4"/>
       </w:pPr>
-    </w:p>
-    <w:p>
-      <w:pPr>
-        <w:pStyle w:val="Heading4"/>
-      </w:pPr>
-      <w:r>
-        <w:t>2.1 Data Cleaning</w:t>
-      </w:r>
-    </w:p>
-    <w:p>
-      <w:pPr>
-        <w:pStyle w:val="Heading4"/>
-      </w:pPr>
       <w:r>
         <w:t>2.2 Data Analysis</w:t>
       </w:r>
     </w:p>
     <w:p>
+      <w:r>
+        <w:t xml:space="preserve">Treatment response in this study will be evaluated using four outcome measures assessed two years after HAART initiation. The first outcome is viral load defined as the number of HIV RNA copies per milliliter of blood. The second outcome is CD4+ T-cell count, a measure of immune function. </w:t>
+      </w:r>
+    </w:p>
+    <w:p>
+      <w:r>
+        <w:t xml:space="preserve">In addition to laboratory outcomes, two quality-of-life </w:t>
+      </w:r>
+      <w:r>
+        <w:t xml:space="preserve">(QOL) </w:t>
+      </w:r>
+      <w:r>
+        <w:t xml:space="preserve">measures derived from the SF-36 </w:t>
+      </w:r>
+      <w:r>
+        <w:t>questionnaire</w:t>
+      </w:r>
+      <w:r>
+        <w:t xml:space="preserve"> will be examined. T</w:t>
+      </w:r>
+      <w:r>
+        <w:t>he aggregate physical health score and the aggregate mental health score, each ranging from 0 to 100, with higher scores indicating better perceived health.</w:t>
+      </w:r>
+    </w:p>
+    <w:p>
+      <w:pPr>
+        <w:spacing w:after="160" w:line="278" w:lineRule="auto"/>
+      </w:pPr>
+      <w:r>
+        <w:t xml:space="preserve">For each outcome, analyses will be conducted using </w:t>
+      </w:r>
+      <w:r>
+        <w:t xml:space="preserve">Bayesian </w:t>
+      </w:r>
+      <w:r>
+        <w:t>linear regression to assess the association between baseline hard drug use and treatment response, while adjusting for relevant covariates and potential confounders</w:t>
+      </w:r>
+      <w:r>
+        <w:t>.</w:t>
+      </w:r>
+      <w:r>
+        <w:t xml:space="preserve"> </w:t>
+      </w:r>
+      <w:r>
+        <w:t>All</w:t>
+      </w:r>
+      <w:r>
+        <w:t xml:space="preserve"> models </w:t>
+      </w:r>
+      <w:r>
+        <w:t xml:space="preserve">are </w:t>
+      </w:r>
+      <w:r>
+        <w:t xml:space="preserve">adjusted for age, BMI, smoking status, education, race/ethnicity, and baseline </w:t>
+      </w:r>
+      <w:r>
+        <w:t>outcome value</w:t>
+      </w:r>
+      <w:r>
+        <w:t>.</w:t>
+      </w:r>
+      <w:r>
+        <w:t xml:space="preserve"> </w:t>
+      </w:r>
+      <w:r>
+        <w:t xml:space="preserve">Models were estimated using the </w:t>
+      </w:r>
+      <w:r>
+        <w:rPr>
+          <w:rFonts w:eastAsiaTheme="majorEastAsia"/>
+        </w:rPr>
+        <w:t>brms</w:t>
+      </w:r>
+      <w:r>
+        <w:t xml:space="preserve"> package in R, which implements Bayesian linear models via Stan.</w:t>
+      </w:r>
+    </w:p>
+    <w:p>
+      <w:pPr>
+        <w:spacing w:after="160" w:line="278" w:lineRule="auto"/>
+      </w:pPr>
+      <w:r>
+        <w:t>Each outcome was modeled using a Gaussian likelihood, such that observed outcomes were assumed to follow a normal distribution</w:t>
+      </w:r>
+      <w:r>
+        <w:t>.</w:t>
+      </w:r>
+      <w:r>
+        <w:t xml:space="preserve"> </w:t>
+      </w:r>
+      <w:r>
+        <w:t>Weakly informative priors were specified for regression coefficients</w:t>
+      </w:r>
+      <w:r>
+        <w:t xml:space="preserve">, </w:t>
+      </w:r>
+      <w:r>
+        <w:t>including</w:t>
+      </w:r>
+      <w:r>
+        <w:t xml:space="preserve"> intercept,</w:t>
+      </w:r>
+      <w:r>
+        <w:t xml:space="preserve"> </w:t>
+      </w:r>
+      <w:r>
+        <w:t xml:space="preserve">and </w:t>
+      </w:r>
+      <w:r>
+        <w:t xml:space="preserve">were </w:t>
+      </w:r>
+      <w:r>
+        <w:t>given</w:t>
+      </w:r>
+      <w:r>
+        <w:t xml:space="preserve"> normal priors with mean </w:t>
+      </w:r>
+      <w:r>
+        <w:t>0</w:t>
+      </w:r>
+      <w:r>
+        <w:t xml:space="preserve"> and large variance (N(0, 10000)), reflecting minimal prior information about the magnitude or direction of associations. The residual </w:t>
+      </w:r>
+      <w:r>
+        <w:t>variance</w:t>
+      </w:r>
+      <w:r>
+        <w:t xml:space="preserve"> was </w:t>
+      </w:r>
+      <w:r>
+        <w:t>given</w:t>
+      </w:r>
+      <w:r>
+        <w:t xml:space="preserve"> a </w:t>
+      </w:r>
+      <w:proofErr w:type="gramStart"/>
+      <w:r>
+        <w:t>Student</w:t>
+      </w:r>
+      <w:proofErr w:type="gramEnd"/>
+      <w:r>
+        <w:t xml:space="preserve">-t prior with 3 degrees of freedom </w:t>
+      </w:r>
+      <w:r>
+        <w:t>with mean</w:t>
+      </w:r>
+      <w:r>
+        <w:t xml:space="preserve"> 0 and </w:t>
+      </w:r>
+      <w:r>
+        <w:t>large variance (Half-t(3,0,10000))</w:t>
+      </w:r>
+      <w:r>
+        <w:t xml:space="preserve">, representing a half-t prior </w:t>
+      </w:r>
+      <w:r>
+        <w:t>with heavy-tails to give less influence</w:t>
+      </w:r>
+      <w:r>
+        <w:t>.</w:t>
+      </w:r>
+    </w:p>
+    <w:p>
+      <w:pPr>
+        <w:spacing w:after="160" w:line="278" w:lineRule="auto"/>
+      </w:pPr>
+      <w:r>
+        <w:t>Sampling of the posterior was</w:t>
+      </w:r>
+      <w:r>
+        <w:t xml:space="preserve"> conducted using Hamiltonian Monte Carlo with the No-U-Turn Sampler (HMC-NUTS), the default sampling algorithm implemented in Stan. Four Markov chains were run with 2,000 iterations per </w:t>
+      </w:r>
+      <w:r>
+        <w:t>chain</w:t>
+      </w:r>
+      <w:r>
+        <w:t xml:space="preserve"> </w:t>
+      </w:r>
+      <w:r>
+        <w:t>with the</w:t>
+      </w:r>
+      <w:r>
+        <w:t xml:space="preserve"> </w:t>
+      </w:r>
+      <w:r>
+        <w:t xml:space="preserve">default </w:t>
+      </w:r>
+      <w:r>
+        <w:t xml:space="preserve">1,000 </w:t>
+      </w:r>
+      <w:r>
+        <w:t xml:space="preserve">iteration </w:t>
+      </w:r>
+      <w:r>
+        <w:t xml:space="preserve">warmup </w:t>
+      </w:r>
+      <w:r>
+        <w:t>being used</w:t>
+      </w:r>
+      <w:r>
+        <w:t>.</w:t>
+      </w:r>
+      <w:r>
+        <w:t xml:space="preserve"> </w:t>
+      </w:r>
+      <w:r>
+        <w:t>No initial values were specified, so the values were drawn uniformly from the interval (-2,2).</w:t>
+      </w:r>
+    </w:p>
+    <w:p>
+      <w:r>
+        <w:rPr>
+          <w:rFonts w:eastAsiaTheme="majorEastAsia"/>
+        </w:rPr>
+        <w:t xml:space="preserve">Following the Sequential Effect </w:t>
+      </w:r>
+      <w:proofErr w:type="spellStart"/>
+      <w:r>
+        <w:rPr>
+          <w:rFonts w:eastAsiaTheme="majorEastAsia"/>
+        </w:rPr>
+        <w:t>eXistence</w:t>
+      </w:r>
+      <w:proofErr w:type="spellEnd"/>
+      <w:r>
+        <w:rPr>
+          <w:rFonts w:eastAsiaTheme="majorEastAsia"/>
+        </w:rPr>
+        <w:t xml:space="preserve"> and </w:t>
+      </w:r>
+      <w:proofErr w:type="spellStart"/>
+      <w:r>
+        <w:rPr>
+          <w:rFonts w:eastAsiaTheme="majorEastAsia"/>
+        </w:rPr>
+        <w:t>sIgnificance</w:t>
+      </w:r>
+      <w:proofErr w:type="spellEnd"/>
+      <w:r>
+        <w:rPr>
+          <w:rFonts w:eastAsiaTheme="majorEastAsia"/>
+        </w:rPr>
+        <w:t xml:space="preserve"> Testing (SEXIT) framework, the median of the posterior distribution</w:t>
+      </w:r>
+      <w:r>
+        <w:t xml:space="preserve">, </w:t>
+      </w:r>
+      <w:r>
+        <w:rPr>
+          <w:rFonts w:eastAsiaTheme="majorEastAsia"/>
+        </w:rPr>
+        <w:t xml:space="preserve">95% </w:t>
+      </w:r>
+      <w:r>
+        <w:t>HDIs</w:t>
+      </w:r>
+      <w:r>
+        <w:t>,</w:t>
+      </w:r>
+      <w:r>
+        <w:t xml:space="preserve"> </w:t>
+      </w:r>
+      <w:r>
+        <w:rPr>
+          <w:rFonts w:eastAsiaTheme="majorEastAsia"/>
+        </w:rPr>
+        <w:t xml:space="preserve">the probability of direction </w:t>
+      </w:r>
+      <w:r>
+        <w:t>(hypothesized direction)</w:t>
+      </w:r>
+      <w:r>
+        <w:t>, and WAIC differences</w:t>
+      </w:r>
+      <w:r>
+        <w:t xml:space="preserve"> </w:t>
+      </w:r>
+      <w:r>
+        <w:t>will determine significance</w:t>
+      </w:r>
+      <w:r>
+        <w:t xml:space="preserve">. </w:t>
+      </w:r>
+      <w:r>
+        <w:t xml:space="preserve">Convergence of the Markov </w:t>
+      </w:r>
+      <w:r>
+        <w:lastRenderedPageBreak/>
+        <w:t>chains was assessed using trace plots and the Gelman–Rubin diagnostic (R̂), with values near 1 indicating adequate mixing.</w:t>
+      </w:r>
+    </w:p>
+    <w:p/>
+    <w:p>
+      <w:r>
+        <w:t xml:space="preserve">Following the Sequential Effect </w:t>
+      </w:r>
+      <w:proofErr w:type="spellStart"/>
+      <w:r>
+        <w:t>eXistence</w:t>
+      </w:r>
+      <w:proofErr w:type="spellEnd"/>
+      <w:r>
+        <w:t xml:space="preserve"> and </w:t>
+      </w:r>
+      <w:proofErr w:type="spellStart"/>
+      <w:r>
+        <w:t>sIgnificance</w:t>
+      </w:r>
+      <w:proofErr w:type="spellEnd"/>
+      <w:r>
+        <w:t xml:space="preserve"> Testing (SEXIT) framework, posterior summaries were used to evaluate evidence for effects in the hypothesized direction. For each outcome, we report the posterior median and 95% highest density interval (HDI), the probability of direction (PD) in the hypothesized direction, and model comparison via WAIC differences. In addition to statistical evidence for non-zero effects, clinical relevance was evaluated using prespecified thresholds provided by the PI: 0.5 </w:t>
+      </w:r>
+      <m:oMath>
+        <m:sSub>
+          <m:sSubPr>
+            <m:ctrlPr>
+              <w:rPr>
+                <w:rFonts w:ascii="Cambria Math" w:eastAsiaTheme="minorHAnsi" w:hAnsi="Cambria Math" w:cstheme="minorBidi"/>
+                <w:iCs/>
+                <w:color w:val="000000" w:themeColor="text1"/>
+                <w:kern w:val="2"/>
+                <w14:ligatures w14:val="standardContextual"/>
+              </w:rPr>
+            </m:ctrlPr>
+          </m:sSubPr>
+          <m:e>
+            <m:r>
+              <m:rPr>
+                <m:sty m:val="p"/>
+              </m:rPr>
+              <w:rPr>
+                <w:rFonts w:ascii="Cambria Math" w:eastAsiaTheme="minorHAnsi" w:hAnsi="Cambria Math" w:cstheme="minorBidi"/>
+                <w:color w:val="000000" w:themeColor="text1"/>
+                <w:kern w:val="2"/>
+                <w14:ligatures w14:val="standardContextual"/>
+              </w:rPr>
+              <m:t>log</m:t>
+            </m:r>
+          </m:e>
+          <m:sub>
+            <m:r>
+              <m:rPr>
+                <m:sty m:val="p"/>
+              </m:rPr>
+              <w:rPr>
+                <w:rFonts w:ascii="Cambria Math" w:eastAsiaTheme="minorHAnsi" w:hAnsi="Cambria Math" w:cstheme="minorBidi"/>
+                <w:color w:val="000000" w:themeColor="text1"/>
+                <w:kern w:val="2"/>
+                <w14:ligatures w14:val="standardContextual"/>
+              </w:rPr>
+              <m:t>10</m:t>
+            </m:r>
+          </m:sub>
+        </m:sSub>
+      </m:oMath>
+      <w:r>
+        <w:t xml:space="preserve"> copies/mL for viral load, 50 cells/mm³ for CD4 count, and 2 points for SF-36 </w:t>
+      </w:r>
+      <w:r>
+        <w:t>QOL</w:t>
+      </w:r>
+      <w:r>
+        <w:t xml:space="preserve"> scores. Convergence of Markov chains was assessed using trace plots and the Gelman–Rubin diagnostic (R̂), with values near 1 indicating adequate mixing</w:t>
+      </w:r>
+      <w:r>
+        <w:t>.</w:t>
+      </w:r>
+    </w:p>
+    <w:p/>
+    <w:p/>
+    <w:p/>
+    <w:p>
+      <w:pPr>
+        <w:spacing w:after="160" w:line="278" w:lineRule="auto"/>
+      </w:pPr>
+    </w:p>
+    <w:p>
+      <w:r>
+        <w:t xml:space="preserve">In addition to </w:t>
+      </w:r>
+      <w:r>
+        <w:t>Bayesian</w:t>
+      </w:r>
+      <w:r>
+        <w:t xml:space="preserve"> regression models, </w:t>
+      </w:r>
+      <w:r>
+        <w:t xml:space="preserve">frequentist linear </w:t>
+      </w:r>
+      <w:r>
+        <w:t xml:space="preserve">regression models will also be fit for each outcome to </w:t>
+      </w:r>
+      <w:r>
+        <w:t>allow for comparisons</w:t>
+      </w:r>
+      <w:r>
+        <w:t xml:space="preserve">. The same model structure will be used in both frameworks. </w:t>
+      </w:r>
+    </w:p>
+    <w:p/>
+    <w:p>
+      <w:r>
+        <w:t xml:space="preserve">We hypothesize that loss to follow-up between baseline and Year 2 may be related to baseline hard drug use and baseline </w:t>
+      </w:r>
+      <w:r>
+        <w:t xml:space="preserve">outcome </w:t>
+      </w:r>
+      <w:r>
+        <w:t>measures</w:t>
+      </w:r>
+      <w:r>
+        <w:t xml:space="preserve">. If participants missing Year-2 measurements differ systematically from those with complete data, complete-case analyses may yield biased estimates of the association between baseline hard drug use and treatment response. To evaluate this possibility, baseline characteristics will be compared between participants with and without Year-2 measurements, and a logistic regression model will be used to assess whether the probability of </w:t>
+      </w:r>
+      <w:r>
+        <w:t xml:space="preserve">having missing year-2 </w:t>
+      </w:r>
+      <w:r>
+        <w:t>measurements</w:t>
+      </w:r>
+      <w:r>
+        <w:t xml:space="preserve"> is associated with baseline hard drug use and </w:t>
+      </w:r>
+      <w:r>
+        <w:t>outcome</w:t>
+      </w:r>
+      <w:r>
+        <w:t>.</w:t>
+      </w:r>
+    </w:p>
+    <w:p/>
+    <w:p>
+      <w:r>
+        <w:rPr>
+          <w:highlight w:val="yellow"/>
+        </w:rPr>
+        <w:t>“</w:t>
+      </w:r>
+      <w:r>
+        <w:rPr>
+          <w:highlight w:val="yellow"/>
+        </w:rPr>
+        <w:t>To evaluate whether adherence may lie on the causal pathway between baseline hard drug use and treatment response, two regression models were fit for each outcome. The first model estimated the association between hard drug use and the outcome adjusting for covariates. The second model additionally included adherence as a predictor. Evidence consistent with mediation was assessed by examining attenuation of the hard drug use coefficient after inclusion of adherence.</w:t>
+      </w:r>
+      <w:r>
+        <w:rPr>
+          <w:highlight w:val="yellow"/>
+        </w:rPr>
+        <w:t>”</w:t>
+      </w:r>
+    </w:p>
+    <w:p/>
+    <w:p>
+      <w:pPr>
+        <w:spacing w:after="160" w:line="278" w:lineRule="auto"/>
+      </w:pPr>
+      <w:r>
+        <w:t>Participants without both baseline and Year 2 measurements were excluded from complete-case regression analyses, and retention status was retained as a separate variable to evaluate potential bias due to loss to follow-up</w:t>
+      </w:r>
+    </w:p>
+    <w:p/>
+    <w:p/>
+    <w:p>
       <w:pPr>
         <w:pStyle w:val="Heading2"/>
       </w:pPr>
       <w:bookmarkStart w:id="2" w:name="_Toc221022975"/>
       <w:r>
+        <w:lastRenderedPageBreak/>
         <w:t>Results</w:t>
       </w:r>
       <w:bookmarkEnd w:id="2"/>
     </w:p>
     <w:p>
       <w:pPr>
-        <w:rPr>
-          <w:color w:val="000000" w:themeColor="text1"/>
-        </w:rPr>
-      </w:pPr>
-      <w:r>
-        <w:rPr>
-          <w:color w:val="000000" w:themeColor="text1"/>
-        </w:rPr>
-        <w:t xml:space="preserve">Frequentist mediation analysis estimated an indirect effect of 5.4 CD4 cells (95% CI: −1.7 to 13.1), which did not reach conventional statistical significance (p=0.11). In contrast, Bayesian mediation analysis yielded a posterior mean indirect effect of 6.1 cells (95% HDI: 0.3 to 11.8), with 99% posterior probability that the effect was greater than zero. Despite differences in uncertainty quantification, both approaches suggest that adherence explains only a small proportion </w:t>
-      </w:r>
-      <w:r>
-        <w:rPr>
-          <w:color w:val="000000" w:themeColor="text1"/>
-        </w:rPr>
-        <w:t xml:space="preserve">(≈3.5%) </w:t>
-      </w:r>
-      <w:r>
-        <w:rPr>
-          <w:color w:val="000000" w:themeColor="text1"/>
-        </w:rPr>
-        <w:t>of the total association between hard drug use and immune recovery.</w:t>
-      </w:r>
-    </w:p>
-    <w:p>
-      <w:pPr>
+        <w:contextualSpacing/>
         <w:jc w:val="center"/>
-        <w:rPr>
-          <w:color w:val="000000" w:themeColor="text1"/>
-        </w:rPr>
-      </w:pPr>
-      <w:r>
-        <w:rPr>
-          <w:noProof/>
-          <w:color w:val="000000" w:themeColor="text1"/>
-        </w:rPr>
+      </w:pPr>
+      <w:r>
         <w:drawing>
-          <wp:inline distT="0" distB="0" distL="0" distR="0" wp14:anchorId="250D3CAC" wp14:editId="07DD66A2">
-            <wp:extent cx="5445358" cy="3347499"/>
-            <wp:effectExtent l="0" t="0" r="3175" b="5715"/>
-            <wp:docPr id="594901995" name="Picture 1" descr="A graph of different colored boxes&#10;&#10;AI-generated content may be incorrect."/>
+          <wp:inline distT="0" distB="0" distL="0" distR="0" wp14:anchorId="1BF16465" wp14:editId="5BA26532">
+            <wp:extent cx="5176093" cy="7150308"/>
+            <wp:effectExtent l="0" t="0" r="5715" b="0"/>
+            <wp:docPr id="1957693801" name="Picture 1" descr="A table with numbers and text&#10;&#10;AI-generated content may be incorrect."/>
             <wp:cNvGraphicFramePr>
               <a:graphicFrameLocks xmlns:a="http://schemas.openxmlformats.org/drawingml/2006/main" noChangeAspect="1"/>
             </wp:cNvGraphicFramePr>
@@ -984,7 +1766,7 @@
               <a:graphicData uri="http://schemas.openxmlformats.org/drawingml/2006/picture">
                 <pic:pic xmlns:pic="http://schemas.openxmlformats.org/drawingml/2006/picture">
                   <pic:nvPicPr>
-                    <pic:cNvPr id="594901995" name="Picture 1" descr="A graph of different colored boxes&#10;&#10;AI-generated content may be incorrect."/>
+                    <pic:cNvPr id="1957693801" name="Picture 1" descr="A table with numbers and text&#10;&#10;AI-generated content may be incorrect."/>
                     <pic:cNvPicPr/>
                   </pic:nvPicPr>
                   <pic:blipFill>
@@ -996,7 +1778,7 @@
                   <pic:spPr>
                     <a:xfrm>
                       <a:off x="0" y="0"/>
-                      <a:ext cx="5467637" cy="3361195"/>
+                      <a:ext cx="5191961" cy="7172228"/>
                     </a:xfrm>
                     <a:prstGeom prst="rect">
                       <a:avLst/>
@@ -1012,11 +1794,9 @@
     <w:p>
       <w:pPr>
         <w:pStyle w:val="Caption"/>
-        <w:rPr>
-          <w:sz w:val="21"/>
-          <w:szCs w:val="21"/>
-        </w:rPr>
-      </w:pPr>
+        <w:contextualSpacing/>
+      </w:pPr>
+      <w:bookmarkStart w:id="3" w:name="_Ref220679477"/>
       <w:r>
         <w:rPr>
           <w:b/>
@@ -1024,7 +1804,7 @@
           <w:sz w:val="21"/>
           <w:szCs w:val="21"/>
         </w:rPr>
-        <w:t xml:space="preserve">Figure </w:t>
+        <w:t xml:space="preserve">Table </w:t>
       </w:r>
       <w:r>
         <w:rPr>
@@ -1042,7 +1822,7 @@
           <w:sz w:val="21"/>
           <w:szCs w:val="21"/>
         </w:rPr>
-        <w:instrText xml:space="preserve"> SEQ Figure \* ARABIC </w:instrText>
+        <w:instrText xml:space="preserve"> SEQ Table \* ARABIC </w:instrText>
       </w:r>
       <w:r>
         <w:rPr>
@@ -1072,6 +1852,175 @@
         </w:rPr>
         <w:fldChar w:fldCharType="end"/>
       </w:r>
+      <w:bookmarkEnd w:id="3"/>
+      <w:r>
+        <w:rPr>
+          <w:b/>
+          <w:bCs/>
+          <w:sz w:val="21"/>
+          <w:szCs w:val="21"/>
+        </w:rPr>
+        <w:t>.</w:t>
+      </w:r>
+      <w:r>
+        <w:rPr>
+          <w:sz w:val="21"/>
+          <w:szCs w:val="21"/>
+        </w:rPr>
+        <w:t> </w:t>
+      </w:r>
+      <w:r>
+        <w:rPr>
+          <w:sz w:val="21"/>
+          <w:szCs w:val="21"/>
+        </w:rPr>
+        <w:t>Baseline characteristics of HIV-infected men initiating HAART, overall and stratified by baseline hard drug use</w:t>
+      </w:r>
+      <w:r>
+        <w:rPr>
+          <w:sz w:val="21"/>
+          <w:szCs w:val="21"/>
+        </w:rPr>
+        <w:t>.</w:t>
+      </w:r>
+      <w:r>
+        <w:rPr>
+          <w:sz w:val="21"/>
+          <w:szCs w:val="21"/>
+        </w:rPr>
+        <w:t xml:space="preserve"> This table represents the total number of subjects that will be used in all subsequent analyses.</w:t>
+      </w:r>
+    </w:p>
+    <w:p>
+      <w:pPr>
+        <w:pStyle w:val="Heading4"/>
+      </w:pPr>
+      <w:r>
+        <w:lastRenderedPageBreak/>
+        <w:t>3.</w:t>
+      </w:r>
+      <w:r>
+        <w:t>1</w:t>
+      </w:r>
+      <w:r>
+        <w:t xml:space="preserve"> </w:t>
+      </w:r>
+      <w:r>
+        <w:t>Treatment Response 2 years After Initiating HAART</w:t>
+      </w:r>
+    </w:p>
+    <w:p/>
+    <w:p>
+      <w:pPr>
+        <w:jc w:val="center"/>
+        <w:rPr>
+          <w:color w:val="000000" w:themeColor="text1"/>
+        </w:rPr>
+      </w:pPr>
+      <w:r>
+        <w:rPr>
+          <w:color w:val="000000" w:themeColor="text1"/>
+        </w:rPr>
+        <w:drawing>
+          <wp:inline distT="0" distB="0" distL="0" distR="0" wp14:anchorId="7528BD18" wp14:editId="2611C5B4">
+            <wp:extent cx="5162616" cy="3627620"/>
+            <wp:effectExtent l="0" t="0" r="0" b="5080"/>
+            <wp:docPr id="239772942" name="Picture 1" descr="A graph of different colored boxes&#10;&#10;AI-generated content may be incorrect."/>
+            <wp:cNvGraphicFramePr>
+              <a:graphicFrameLocks xmlns:a="http://schemas.openxmlformats.org/drawingml/2006/main" noChangeAspect="1"/>
+            </wp:cNvGraphicFramePr>
+            <a:graphic xmlns:a="http://schemas.openxmlformats.org/drawingml/2006/main">
+              <a:graphicData uri="http://schemas.openxmlformats.org/drawingml/2006/picture">
+                <pic:pic xmlns:pic="http://schemas.openxmlformats.org/drawingml/2006/picture">
+                  <pic:nvPicPr>
+                    <pic:cNvPr id="239772942" name="Picture 1" descr="A graph of different colored boxes&#10;&#10;AI-generated content may be incorrect."/>
+                    <pic:cNvPicPr/>
+                  </pic:nvPicPr>
+                  <pic:blipFill>
+                    <a:blip r:embed="rId7"/>
+                    <a:stretch>
+                      <a:fillRect/>
+                    </a:stretch>
+                  </pic:blipFill>
+                  <pic:spPr>
+                    <a:xfrm>
+                      <a:off x="0" y="0"/>
+                      <a:ext cx="5217440" cy="3666143"/>
+                    </a:xfrm>
+                    <a:prstGeom prst="rect">
+                      <a:avLst/>
+                    </a:prstGeom>
+                  </pic:spPr>
+                </pic:pic>
+              </a:graphicData>
+            </a:graphic>
+          </wp:inline>
+        </w:drawing>
+      </w:r>
+    </w:p>
+    <w:p>
+      <w:pPr>
+        <w:pStyle w:val="Caption"/>
+        <w:rPr>
+          <w:sz w:val="21"/>
+          <w:szCs w:val="21"/>
+        </w:rPr>
+      </w:pPr>
+      <w:r>
+        <w:rPr>
+          <w:b/>
+          <w:bCs/>
+          <w:sz w:val="21"/>
+          <w:szCs w:val="21"/>
+        </w:rPr>
+        <w:t xml:space="preserve">Figure </w:t>
+      </w:r>
+      <w:r>
+        <w:rPr>
+          <w:b/>
+          <w:bCs/>
+          <w:sz w:val="21"/>
+          <w:szCs w:val="21"/>
+        </w:rPr>
+        <w:fldChar w:fldCharType="begin"/>
+      </w:r>
+      <w:r>
+        <w:rPr>
+          <w:b/>
+          <w:bCs/>
+          <w:sz w:val="21"/>
+          <w:szCs w:val="21"/>
+        </w:rPr>
+        <w:instrText xml:space="preserve"> SEQ Figure \* ARABIC </w:instrText>
+      </w:r>
+      <w:r>
+        <w:rPr>
+          <w:b/>
+          <w:bCs/>
+          <w:sz w:val="21"/>
+          <w:szCs w:val="21"/>
+        </w:rPr>
+        <w:fldChar w:fldCharType="separate"/>
+      </w:r>
+      <w:r>
+        <w:rPr>
+          <w:b/>
+          <w:bCs/>
+          <w:noProof/>
+          <w:sz w:val="21"/>
+          <w:szCs w:val="21"/>
+        </w:rPr>
+        <w:t>1</w:t>
+      </w:r>
+      <w:r>
+        <w:rPr>
+          <w:b/>
+          <w:bCs/>
+          <w:sz w:val="21"/>
+          <w:szCs w:val="21"/>
+        </w:rPr>
+        <w:fldChar w:fldCharType="end"/>
+      </w:r>
       <w:r>
         <w:rPr>
           <w:b/>
@@ -1170,7 +2119,7 @@
           <w:sz w:val="24"/>
           <w:szCs w:val="24"/>
         </w:rPr>
-        <w:t>Viral load (log</w:t>
+        <w:t xml:space="preserve">Viral load </w:t>
       </w:r>
       <w:r>
         <w:rPr>
@@ -1180,7 +2129,54 @@
           <w:sz w:val="24"/>
           <w:szCs w:val="24"/>
         </w:rPr>
-        <w:t xml:space="preserve">10 </w:t>
+        <w:t>(</w:t>
+      </w:r>
+      <m:oMath>
+        <m:sSub>
+          <m:sSubPr>
+            <m:ctrlPr>
+              <w:rPr>
+                <w:rFonts w:ascii="Cambria Math" w:hAnsi="Cambria Math"/>
+                <w:iCs w:val="0"/>
+                <w:color w:val="000000" w:themeColor="text1"/>
+                <w:sz w:val="24"/>
+                <w:szCs w:val="24"/>
+              </w:rPr>
+            </m:ctrlPr>
+          </m:sSubPr>
+          <m:e>
+            <m:r>
+              <w:rPr>
+                <w:rFonts w:ascii="Cambria Math" w:hAnsi="Cambria Math"/>
+                <w:color w:val="000000" w:themeColor="text1"/>
+                <w:sz w:val="24"/>
+                <w:szCs w:val="24"/>
+              </w:rPr>
+              <m:t>log</m:t>
+            </m:r>
+          </m:e>
+          <m:sub>
+            <m:r>
+              <w:rPr>
+                <w:rFonts w:ascii="Cambria Math" w:hAnsi="Cambria Math"/>
+                <w:color w:val="000000" w:themeColor="text1"/>
+                <w:sz w:val="24"/>
+                <w:szCs w:val="24"/>
+              </w:rPr>
+              <m:t>10</m:t>
+            </m:r>
+          </m:sub>
+        </m:sSub>
+      </m:oMath>
+      <w:r>
+        <w:rPr>
+          <w:i w:val="0"/>
+          <w:iCs w:val="0"/>
+          <w:color w:val="auto"/>
+          <w:sz w:val="32"/>
+          <w:szCs w:val="32"/>
+        </w:rPr>
+        <w:t xml:space="preserve"> </w:t>
       </w:r>
       <w:r>
         <w:rPr>
@@ -1190,7 +2186,7 @@
           <w:sz w:val="24"/>
           <w:szCs w:val="24"/>
         </w:rPr>
-        <w:t xml:space="preserve">copies/mL) declined substantially </w:t>
+        <w:t>copies/mL) declined substantially following treatment initiation</w:t>
       </w:r>
       <w:r>
         <w:rPr>
@@ -1200,8 +2196,7 @@
           <w:sz w:val="24"/>
           <w:szCs w:val="24"/>
         </w:rPr>
-        <w:lastRenderedPageBreak/>
-        <w:t>following treatment initiation</w:t>
+        <w:t xml:space="preserve"> in both groups</w:t>
       </w:r>
       <w:r>
         <w:rPr>
@@ -1211,7 +2206,7 @@
           <w:sz w:val="24"/>
           <w:szCs w:val="24"/>
         </w:rPr>
-        <w:t xml:space="preserve"> in both groups</w:t>
+        <w:t>.</w:t>
       </w:r>
       <w:r>
         <w:rPr>
@@ -1221,7 +2216,7 @@
           <w:sz w:val="24"/>
           <w:szCs w:val="24"/>
         </w:rPr>
-        <w:t>.</w:t>
+        <w:t xml:space="preserve"> No apparent differences in viral load are visible at both time points</w:t>
       </w:r>
       <w:r>
         <w:rPr>
@@ -1231,7 +2226,7 @@
           <w:sz w:val="24"/>
           <w:szCs w:val="24"/>
         </w:rPr>
-        <w:t xml:space="preserve"> No apparent differences in viral load are visible at both time points</w:t>
+        <w:t>.</w:t>
       </w:r>
       <w:r>
         <w:rPr>
@@ -1241,7 +2236,7 @@
           <w:sz w:val="24"/>
           <w:szCs w:val="24"/>
         </w:rPr>
-        <w:t>.</w:t>
+        <w:t xml:space="preserve"> </w:t>
       </w:r>
       <w:r>
         <w:rPr>
@@ -1251,7 +2246,7 @@
           <w:sz w:val="24"/>
           <w:szCs w:val="24"/>
         </w:rPr>
-        <w:t xml:space="preserve"> </w:t>
+        <w:t>Physical and mental quality-of-life scores remained relatively stable over time</w:t>
       </w:r>
       <w:r>
         <w:rPr>
@@ -1261,7 +2256,7 @@
           <w:sz w:val="24"/>
           <w:szCs w:val="24"/>
         </w:rPr>
-        <w:t>Physical and mental quality-of-life scores remained relatively stable over time</w:t>
+        <w:t xml:space="preserve"> with drug users typically reporting lower QOL scores across both time points</w:t>
       </w:r>
       <w:r>
         <w:rPr>
@@ -1271,29 +2266,79 @@
           <w:sz w:val="24"/>
           <w:szCs w:val="24"/>
         </w:rPr>
-        <w:t xml:space="preserve"> with drug users typically reporting lower QOL scores across both time points</w:t>
-      </w:r>
-      <w:r>
-        <w:rPr>
-          <w:i w:val="0"/>
-          <w:iCs w:val="0"/>
-          <w:color w:val="auto"/>
-          <w:sz w:val="24"/>
-          <w:szCs w:val="24"/>
-        </w:rPr>
         <w:t>.</w:t>
       </w:r>
     </w:p>
     <w:p>
       <w:pPr>
-        <w:jc w:val="center"/>
-      </w:pPr>
-    </w:p>
-    <w:p>
-      <w:pPr>
         <w:pStyle w:val="Caption"/>
-      </w:pPr>
-      <w:bookmarkStart w:id="3" w:name="_Ref220679477"/>
+        <w:rPr>
+          <w:sz w:val="21"/>
+          <w:szCs w:val="21"/>
+        </w:rPr>
+      </w:pPr>
+    </w:p>
+    <w:p>
+      <w:pPr>
+        <w:spacing w:line="278" w:lineRule="auto"/>
+        <w:rPr>
+          <w:sz w:val="21"/>
+          <w:szCs w:val="21"/>
+        </w:rPr>
+      </w:pPr>
+      <w:r>
+        <w:rPr>
+          <w:sz w:val="21"/>
+          <w:szCs w:val="21"/>
+        </w:rPr>
+        <w:lastRenderedPageBreak/>
+        <w:drawing>
+          <wp:inline distT="0" distB="0" distL="0" distR="0" wp14:anchorId="6FD80FD0" wp14:editId="4AC68C4D">
+            <wp:extent cx="5943600" cy="2628265"/>
+            <wp:effectExtent l="0" t="0" r="0" b="635"/>
+            <wp:docPr id="2048136924" name="Picture 1" descr="A screenshot of a computer&#10;&#10;AI-generated content may be incorrect."/>
+            <wp:cNvGraphicFramePr>
+              <a:graphicFrameLocks xmlns:a="http://schemas.openxmlformats.org/drawingml/2006/main" noChangeAspect="1"/>
+            </wp:cNvGraphicFramePr>
+            <a:graphic xmlns:a="http://schemas.openxmlformats.org/drawingml/2006/main">
+              <a:graphicData uri="http://schemas.openxmlformats.org/drawingml/2006/picture">
+                <pic:pic xmlns:pic="http://schemas.openxmlformats.org/drawingml/2006/picture">
+                  <pic:nvPicPr>
+                    <pic:cNvPr id="2048136924" name="Picture 1" descr="A screenshot of a computer&#10;&#10;AI-generated content may be incorrect."/>
+                    <pic:cNvPicPr/>
+                  </pic:nvPicPr>
+                  <pic:blipFill>
+                    <a:blip r:embed="rId8"/>
+                    <a:stretch>
+                      <a:fillRect/>
+                    </a:stretch>
+                  </pic:blipFill>
+                  <pic:spPr>
+                    <a:xfrm>
+                      <a:off x="0" y="0"/>
+                      <a:ext cx="5943600" cy="2628265"/>
+                    </a:xfrm>
+                    <a:prstGeom prst="rect">
+                      <a:avLst/>
+                    </a:prstGeom>
+                  </pic:spPr>
+                </pic:pic>
+              </a:graphicData>
+            </a:graphic>
+          </wp:inline>
+        </w:drawing>
+      </w:r>
+    </w:p>
+    <w:p>
+      <w:pPr>
+        <w:pStyle w:val="Caption"/>
+        <w:contextualSpacing/>
+        <w:rPr>
+          <w:sz w:val="21"/>
+          <w:szCs w:val="21"/>
+        </w:rPr>
+      </w:pPr>
+      <w:bookmarkStart w:id="4" w:name="_Ref220679981"/>
       <w:r>
         <w:rPr>
           <w:b/>
@@ -1338,7 +2383,7 @@
           <w:sz w:val="21"/>
           <w:szCs w:val="21"/>
         </w:rPr>
-        <w:t>1</w:t>
+        <w:t>2</w:t>
       </w:r>
       <w:r>
         <w:rPr>
@@ -1349,7 +2394,7 @@
         </w:rPr>
         <w:fldChar w:fldCharType="end"/>
       </w:r>
-      <w:bookmarkEnd w:id="3"/>
+      <w:bookmarkEnd w:id="4"/>
       <w:r>
         <w:rPr>
           <w:b/>
@@ -1371,93 +2416,1306 @@
           <w:sz w:val="21"/>
           <w:szCs w:val="21"/>
         </w:rPr>
-        <w:t>Descriptive statistics for cortisol and DHEA concentrations</w:t>
+        <w:t>Baseline and covariate adjusted</w:t>
       </w:r>
       <w:r>
         <w:rPr>
           <w:sz w:val="21"/>
           <w:szCs w:val="21"/>
         </w:rPr>
-        <w:t>, timing differences between Booklet and Cap recorded times,</w:t>
+        <w:t xml:space="preserve"> differences in Year-2 treatment response between baseline hard drug users and non-users under Bayesian </w:t>
       </w:r>
       <w:r>
         <w:rPr>
           <w:sz w:val="21"/>
           <w:szCs w:val="21"/>
         </w:rPr>
-        <w:t xml:space="preserve"> and timing adherence by collection sample. </w:t>
-      </w:r>
-    </w:p>
-    <w:p>
-      <w:pPr>
-        <w:spacing w:line="480" w:lineRule="auto"/>
-      </w:pPr>
-      <w:r>
-        <w:t xml:space="preserve"> (</w:t>
-      </w:r>
-      <w:r>
-        <w:fldChar w:fldCharType="begin"/>
-      </w:r>
-      <w:r>
-        <w:instrText xml:space="preserve"> REF _Ref220679477 \h  \* MERGEFORMAT </w:instrText>
-      </w:r>
-      <w:r>
-        <w:fldChar w:fldCharType="separate"/>
-      </w:r>
-      <w:r>
-        <w:rPr>
-          <w:b/>
-          <w:bCs/>
-        </w:rPr>
-        <w:t xml:space="preserve">Table </w:t>
-      </w:r>
-      <w:r>
-        <w:rPr>
-          <w:b/>
-          <w:bCs/>
-          <w:noProof/>
-        </w:rPr>
-        <w:t>1</w:t>
-      </w:r>
-      <w:r>
-        <w:fldChar w:fldCharType="end"/>
-      </w:r>
-      <w:r>
-        <w:t>)</w:t>
-      </w:r>
-      <w:r>
-        <w:t>.</w:t>
-      </w:r>
-    </w:p>
-    <w:p>
-      <w:pPr>
-        <w:pStyle w:val="Heading4"/>
-      </w:pPr>
-      <w:r>
-        <w:t xml:space="preserve">3.2 Agreement Between Booklet and </w:t>
-      </w:r>
-      <w:r>
-        <w:t>Cap</w:t>
-      </w:r>
-      <w:r>
-        <w:t xml:space="preserve"> Timing</w:t>
-      </w:r>
-    </w:p>
-    <w:p/>
-    <w:p>
-      <w:pPr>
-        <w:jc w:val="center"/>
-      </w:pPr>
-    </w:p>
-    <w:p>
-      <w:pPr>
-        <w:pStyle w:val="Caption"/>
+        <w:t xml:space="preserve">and frequentist </w:t>
+      </w:r>
+      <w:r>
         <w:rPr>
           <w:sz w:val="21"/>
           <w:szCs w:val="21"/>
         </w:rPr>
-      </w:pPr>
-      <w:bookmarkStart w:id="4" w:name="_Ref220579249"/>
+        <w:t xml:space="preserve">regression frameworks. Estimates represent </w:t>
+      </w:r>
+      <w:r>
+        <w:rPr>
+          <w:sz w:val="21"/>
+          <w:szCs w:val="21"/>
+        </w:rPr>
+        <w:t>mean</w:t>
+      </w:r>
+      <w:r>
+        <w:rPr>
+          <w:sz w:val="21"/>
+          <w:szCs w:val="21"/>
+        </w:rPr>
+        <w:t xml:space="preserve"> differences for each outcome</w:t>
+      </w:r>
+      <w:r>
+        <w:rPr>
+          <w:sz w:val="21"/>
+          <w:szCs w:val="21"/>
+        </w:rPr>
+        <w:t xml:space="preserve">. </w:t>
+      </w:r>
+      <w:r>
+        <w:rPr>
+          <w:sz w:val="21"/>
+          <w:szCs w:val="21"/>
+        </w:rPr>
+        <w:t>Bayesian h</w:t>
+      </w:r>
+      <w:r>
+        <w:rPr>
+          <w:sz w:val="21"/>
+          <w:szCs w:val="21"/>
+        </w:rPr>
+        <w:t>ighest density intervals (</w:t>
+      </w:r>
+      <w:r>
+        <w:rPr>
+          <w:sz w:val="21"/>
+          <w:szCs w:val="21"/>
+        </w:rPr>
+        <w:t>HDI</w:t>
+      </w:r>
+      <w:r>
+        <w:rPr>
+          <w:sz w:val="21"/>
+          <w:szCs w:val="21"/>
+        </w:rPr>
+        <w:t xml:space="preserve">) </w:t>
+      </w:r>
+      <w:r>
+        <w:rPr>
+          <w:sz w:val="21"/>
+          <w:szCs w:val="21"/>
+        </w:rPr>
+        <w:t xml:space="preserve"> and frequentist c</w:t>
+      </w:r>
+      <w:r>
+        <w:rPr>
+          <w:sz w:val="21"/>
+          <w:szCs w:val="21"/>
+        </w:rPr>
+        <w:t>onfidence intervals (</w:t>
+      </w:r>
+      <w:r>
+        <w:rPr>
+          <w:sz w:val="21"/>
+          <w:szCs w:val="21"/>
+        </w:rPr>
+        <w:t>CI</w:t>
+      </w:r>
+      <w:r>
+        <w:rPr>
+          <w:sz w:val="21"/>
+          <w:szCs w:val="21"/>
+        </w:rPr>
+        <w:t xml:space="preserve">) </w:t>
+      </w:r>
+      <w:r>
+        <w:rPr>
+          <w:sz w:val="21"/>
+          <w:szCs w:val="21"/>
+        </w:rPr>
+        <w:t>are reported alongside model-based estimate</w:t>
+      </w:r>
+      <w:r>
+        <w:rPr>
+          <w:sz w:val="21"/>
+          <w:szCs w:val="21"/>
+        </w:rPr>
+        <w:t>s.</w:t>
+      </w:r>
+    </w:p>
+    <w:p>
+      <w:pPr>
+        <w:pStyle w:val="p1"/>
+        <w:rPr>
+          <w:rFonts w:asciiTheme="minorHAnsi" w:eastAsiaTheme="minorHAnsi" w:hAnsiTheme="minorHAnsi" w:cstheme="minorBidi"/>
+          <w:color w:val="000000" w:themeColor="text1"/>
+          <w:kern w:val="2"/>
+          <w14:ligatures w14:val="standardContextual"/>
+        </w:rPr>
+      </w:pPr>
+      <w:r>
+        <w:rPr>
+          <w:rFonts w:asciiTheme="minorHAnsi" w:eastAsiaTheme="minorHAnsi" w:hAnsiTheme="minorHAnsi" w:cstheme="minorBidi"/>
+          <w:color w:val="000000" w:themeColor="text1"/>
+          <w:kern w:val="2"/>
+          <w14:ligatures w14:val="standardContextual"/>
+        </w:rPr>
+        <w:t>Regression</w:t>
+      </w:r>
+      <w:r>
+        <w:rPr>
+          <w:rFonts w:asciiTheme="minorHAnsi" w:eastAsiaTheme="minorHAnsi" w:hAnsiTheme="minorHAnsi" w:cstheme="minorBidi"/>
+          <w:color w:val="000000" w:themeColor="text1"/>
+          <w:kern w:val="2"/>
+          <w14:ligatures w14:val="standardContextual"/>
+        </w:rPr>
+        <w:t xml:space="preserve"> </w:t>
+      </w:r>
+      <w:r>
+        <w:rPr>
+          <w:rFonts w:asciiTheme="minorHAnsi" w:eastAsiaTheme="minorHAnsi" w:hAnsiTheme="minorHAnsi" w:cstheme="minorBidi"/>
+          <w:color w:val="000000" w:themeColor="text1"/>
+          <w:kern w:val="2"/>
+          <w14:ligatures w14:val="standardContextual"/>
+        </w:rPr>
+        <w:t>model estimates</w:t>
+      </w:r>
+      <w:r>
+        <w:rPr>
+          <w:rFonts w:asciiTheme="minorHAnsi" w:eastAsiaTheme="minorHAnsi" w:hAnsiTheme="minorHAnsi" w:cstheme="minorBidi"/>
+          <w:color w:val="000000" w:themeColor="text1"/>
+          <w:kern w:val="2"/>
+          <w14:ligatures w14:val="standardContextual"/>
+        </w:rPr>
+        <w:t xml:space="preserve"> comparing baseline hard drug users with non-users </w:t>
+      </w:r>
+      <w:r>
+        <w:rPr>
+          <w:rFonts w:asciiTheme="minorHAnsi" w:eastAsiaTheme="minorHAnsi" w:hAnsiTheme="minorHAnsi" w:cstheme="minorBidi"/>
+          <w:color w:val="000000" w:themeColor="text1"/>
+          <w:kern w:val="2"/>
+          <w14:ligatures w14:val="standardContextual"/>
+        </w:rPr>
+        <w:t>were consistent</w:t>
+      </w:r>
+      <w:r>
+        <w:rPr>
+          <w:rFonts w:asciiTheme="minorHAnsi" w:eastAsiaTheme="minorHAnsi" w:hAnsiTheme="minorHAnsi" w:cstheme="minorBidi"/>
+          <w:color w:val="000000" w:themeColor="text1"/>
+          <w:kern w:val="2"/>
+          <w14:ligatures w14:val="standardContextual"/>
+        </w:rPr>
+        <w:t xml:space="preserve"> across frequentist and Bayesian frameworks. Hard drug users exhibited significantly lower CD4+ T-cell counts at two years following HAART initiation, with </w:t>
+      </w:r>
+      <w:r>
+        <w:rPr>
+          <w:rFonts w:asciiTheme="minorHAnsi" w:eastAsiaTheme="minorHAnsi" w:hAnsiTheme="minorHAnsi" w:cstheme="minorBidi"/>
+          <w:color w:val="000000" w:themeColor="text1"/>
+          <w:kern w:val="2"/>
+          <w14:ligatures w14:val="standardContextual"/>
+        </w:rPr>
+        <w:t xml:space="preserve">a posterior </w:t>
+      </w:r>
+      <w:r>
+        <w:rPr>
+          <w:rFonts w:asciiTheme="minorHAnsi" w:eastAsiaTheme="minorHAnsi" w:hAnsiTheme="minorHAnsi" w:cstheme="minorBidi"/>
+          <w:color w:val="000000" w:themeColor="text1"/>
+          <w:kern w:val="2"/>
+          <w14:ligatures w14:val="standardContextual"/>
+        </w:rPr>
+        <w:t>median</w:t>
+      </w:r>
+      <w:r>
+        <w:rPr>
+          <w:rFonts w:asciiTheme="minorHAnsi" w:eastAsiaTheme="minorHAnsi" w:hAnsiTheme="minorHAnsi" w:cstheme="minorBidi"/>
+          <w:color w:val="000000" w:themeColor="text1"/>
+          <w:kern w:val="2"/>
+          <w14:ligatures w14:val="standardContextual"/>
+        </w:rPr>
+        <w:t xml:space="preserve"> difference of approximately 164 cells/mm³ (95% </w:t>
+      </w:r>
+      <w:r>
+        <w:rPr>
+          <w:rFonts w:asciiTheme="minorHAnsi" w:eastAsiaTheme="minorHAnsi" w:hAnsiTheme="minorHAnsi" w:cstheme="minorBidi"/>
+          <w:color w:val="000000" w:themeColor="text1"/>
+          <w:kern w:val="2"/>
+          <w14:ligatures w14:val="standardContextual"/>
+        </w:rPr>
+        <w:t>HDI</w:t>
+      </w:r>
+      <w:r>
+        <w:rPr>
+          <w:rFonts w:asciiTheme="minorHAnsi" w:eastAsiaTheme="minorHAnsi" w:hAnsiTheme="minorHAnsi" w:cstheme="minorBidi"/>
+          <w:color w:val="000000" w:themeColor="text1"/>
+          <w:kern w:val="2"/>
+          <w14:ligatures w14:val="standardContextual"/>
+        </w:rPr>
+        <w:t>: −2</w:t>
+      </w:r>
+      <w:r>
+        <w:rPr>
+          <w:rFonts w:asciiTheme="minorHAnsi" w:eastAsiaTheme="minorHAnsi" w:hAnsiTheme="minorHAnsi" w:cstheme="minorBidi"/>
+          <w:color w:val="000000" w:themeColor="text1"/>
+          <w:kern w:val="2"/>
+          <w14:ligatures w14:val="standardContextual"/>
+        </w:rPr>
+        <w:t>63.1</w:t>
+      </w:r>
+      <w:r>
+        <w:rPr>
+          <w:rFonts w:asciiTheme="minorHAnsi" w:eastAsiaTheme="minorHAnsi" w:hAnsiTheme="minorHAnsi" w:cstheme="minorBidi"/>
+          <w:color w:val="000000" w:themeColor="text1"/>
+          <w:kern w:val="2"/>
+          <w14:ligatures w14:val="standardContextual"/>
+        </w:rPr>
+        <w:t xml:space="preserve"> to -</w:t>
+      </w:r>
+      <w:r>
+        <w:rPr>
+          <w:rFonts w:asciiTheme="minorHAnsi" w:eastAsiaTheme="minorHAnsi" w:hAnsiTheme="minorHAnsi" w:cstheme="minorBidi"/>
+          <w:color w:val="000000" w:themeColor="text1"/>
+          <w:kern w:val="2"/>
+          <w14:ligatures w14:val="standardContextual"/>
+        </w:rPr>
+        <w:t>102.7</w:t>
+      </w:r>
+      <w:r>
+        <w:rPr>
+          <w:rFonts w:asciiTheme="minorHAnsi" w:eastAsiaTheme="minorHAnsi" w:hAnsiTheme="minorHAnsi" w:cstheme="minorBidi"/>
+          <w:color w:val="000000" w:themeColor="text1"/>
+          <w:kern w:val="2"/>
+          <w14:ligatures w14:val="standardContextual"/>
+        </w:rPr>
+        <w:t xml:space="preserve">; </w:t>
+      </w:r>
+      <w:r>
+        <w:rPr>
+          <w:rFonts w:asciiTheme="minorHAnsi" w:eastAsiaTheme="minorHAnsi" w:hAnsiTheme="minorHAnsi" w:cstheme="minorBidi"/>
+          <w:color w:val="000000" w:themeColor="text1"/>
+          <w:kern w:val="2"/>
+          <w14:ligatures w14:val="standardContextual"/>
+        </w:rPr>
+        <w:t>R̂</w:t>
+      </w:r>
+      <w:r>
+        <w:rPr>
+          <w:rFonts w:asciiTheme="minorHAnsi" w:eastAsiaTheme="minorHAnsi" w:hAnsiTheme="minorHAnsi" w:cstheme="minorBidi"/>
+          <w:color w:val="000000" w:themeColor="text1"/>
+          <w:kern w:val="2"/>
+          <w14:ligatures w14:val="standardContextual"/>
+        </w:rPr>
+        <w:t>=1.00, ESS=</w:t>
+      </w:r>
+      <w:r>
+        <w:rPr>
+          <w:rFonts w:asciiTheme="minorHAnsi" w:eastAsiaTheme="minorHAnsi" w:hAnsiTheme="minorHAnsi" w:cstheme="minorBidi"/>
+          <w:color w:val="000000" w:themeColor="text1"/>
+          <w:kern w:val="2"/>
+          <w14:ligatures w14:val="standardContextual"/>
+        </w:rPr>
+        <w:t>7262</w:t>
+      </w:r>
+      <w:r>
+        <w:rPr>
+          <w:rFonts w:asciiTheme="minorHAnsi" w:eastAsiaTheme="minorHAnsi" w:hAnsiTheme="minorHAnsi" w:cstheme="minorBidi"/>
+          <w:color w:val="000000" w:themeColor="text1"/>
+          <w:kern w:val="2"/>
+          <w14:ligatures w14:val="standardContextual"/>
+        </w:rPr>
+        <w:t>; P</w:t>
+      </w:r>
+      <w:r>
+        <w:rPr>
+          <w:rFonts w:asciiTheme="minorHAnsi" w:eastAsiaTheme="minorHAnsi" w:hAnsiTheme="minorHAnsi" w:cstheme="minorBidi"/>
+          <w:color w:val="000000" w:themeColor="text1"/>
+          <w:kern w:val="2"/>
+          <w14:ligatures w14:val="standardContextual"/>
+        </w:rPr>
+        <w:t>r</w:t>
+      </w:r>
+      <w:r>
+        <w:rPr>
+          <w:rFonts w:asciiTheme="minorHAnsi" w:eastAsiaTheme="minorHAnsi" w:hAnsiTheme="minorHAnsi" w:cstheme="minorBidi"/>
+          <w:color w:val="000000" w:themeColor="text1"/>
+          <w:kern w:val="2"/>
+          <w14:ligatures w14:val="standardContextual"/>
+        </w:rPr>
+        <w:t>(β</w:t>
+      </w:r>
+      <w:r>
+        <w:rPr>
+          <w:rFonts w:asciiTheme="minorHAnsi" w:eastAsiaTheme="minorHAnsi" w:hAnsiTheme="minorHAnsi" w:cstheme="minorBidi"/>
+          <w:color w:val="000000" w:themeColor="text1"/>
+          <w:kern w:val="2"/>
+          <w14:ligatures w14:val="standardContextual"/>
+        </w:rPr>
+        <w:t>&lt;</w:t>
+      </w:r>
+      <w:r>
+        <w:rPr>
+          <w:rFonts w:asciiTheme="minorHAnsi" w:eastAsiaTheme="minorHAnsi" w:hAnsiTheme="minorHAnsi" w:cstheme="minorBidi"/>
+          <w:color w:val="000000" w:themeColor="text1"/>
+          <w:kern w:val="2"/>
+          <w14:ligatures w14:val="standardContextual"/>
+        </w:rPr>
+        <w:t>0</w:t>
+      </w:r>
+      <w:r>
+        <w:rPr>
+          <w:rFonts w:asciiTheme="minorHAnsi" w:eastAsiaTheme="minorHAnsi" w:hAnsiTheme="minorHAnsi" w:cstheme="minorBidi"/>
+          <w:color w:val="000000" w:themeColor="text1"/>
+          <w:kern w:val="2"/>
+          <w14:ligatures w14:val="standardContextual"/>
+        </w:rPr>
+        <w:t>)</w:t>
+      </w:r>
+      <w:r>
+        <w:rPr>
+          <w:rFonts w:asciiTheme="minorHAnsi" w:eastAsiaTheme="minorHAnsi" w:hAnsiTheme="minorHAnsi" w:cstheme="minorBidi"/>
+          <w:color w:val="000000" w:themeColor="text1"/>
+          <w:kern w:val="2"/>
+          <w14:ligatures w14:val="standardContextual"/>
+        </w:rPr>
+        <w:t>=1)</w:t>
+      </w:r>
+      <w:r>
+        <w:rPr>
+          <w:rFonts w:asciiTheme="minorHAnsi" w:eastAsiaTheme="minorHAnsi" w:hAnsiTheme="minorHAnsi" w:cstheme="minorBidi"/>
+          <w:color w:val="000000" w:themeColor="text1"/>
+          <w:kern w:val="2"/>
+          <w14:ligatures w14:val="standardContextual"/>
+        </w:rPr>
+        <w:t xml:space="preserve">. </w:t>
+      </w:r>
+      <w:r>
+        <w:rPr>
+          <w:rFonts w:asciiTheme="minorHAnsi" w:eastAsiaTheme="minorHAnsi" w:hAnsiTheme="minorHAnsi" w:cstheme="minorBidi"/>
+          <w:color w:val="000000" w:themeColor="text1"/>
+          <w:kern w:val="2"/>
+          <w14:ligatures w14:val="standardContextual"/>
+        </w:rPr>
+        <w:t xml:space="preserve"> </w:t>
+      </w:r>
+      <w:r>
+        <w:rPr>
+          <w:rFonts w:asciiTheme="minorHAnsi" w:eastAsiaTheme="minorHAnsi" w:hAnsiTheme="minorHAnsi" w:cstheme="minorBidi"/>
+          <w:color w:val="000000" w:themeColor="text1"/>
+          <w:kern w:val="2"/>
+          <w14:ligatures w14:val="standardContextual"/>
+        </w:rPr>
+        <w:t>The posterior probability that this difference exceeded the prespecified clinically meaningful threshold of 50 cells/mm³ was &gt;99%</w:t>
+      </w:r>
+      <w:r>
+        <w:rPr>
+          <w:rFonts w:asciiTheme="minorHAnsi" w:eastAsiaTheme="minorHAnsi" w:hAnsiTheme="minorHAnsi" w:cstheme="minorBidi"/>
+          <w:color w:val="000000" w:themeColor="text1"/>
+          <w:kern w:val="2"/>
+          <w14:ligatures w14:val="standardContextual"/>
+        </w:rPr>
+        <w:t xml:space="preserve"> (</w:t>
+      </w:r>
+      <w:r>
+        <w:rPr>
+          <w:rFonts w:asciiTheme="minorHAnsi" w:eastAsiaTheme="minorHAnsi" w:hAnsiTheme="minorHAnsi" w:cstheme="minorBidi"/>
+          <w:color w:val="000000" w:themeColor="text1"/>
+          <w:kern w:val="2"/>
+          <w14:ligatures w14:val="standardContextual"/>
+        </w:rPr>
+        <w:t>P</w:t>
+      </w:r>
+      <w:r>
+        <w:rPr>
+          <w:rFonts w:asciiTheme="minorHAnsi" w:eastAsiaTheme="minorHAnsi" w:hAnsiTheme="minorHAnsi" w:cstheme="minorBidi"/>
+          <w:color w:val="000000" w:themeColor="text1"/>
+          <w:kern w:val="2"/>
+          <w14:ligatures w14:val="standardContextual"/>
+        </w:rPr>
+        <w:t>r</w:t>
+      </w:r>
+      <w:r>
+        <w:rPr>
+          <w:rFonts w:asciiTheme="minorHAnsi" w:eastAsiaTheme="minorHAnsi" w:hAnsiTheme="minorHAnsi" w:cstheme="minorBidi"/>
+          <w:color w:val="000000" w:themeColor="text1"/>
+          <w:kern w:val="2"/>
+          <w14:ligatures w14:val="standardContextual"/>
+        </w:rPr>
+        <w:t>(</w:t>
+      </w:r>
+      <w:r>
+        <w:rPr>
+          <w:rFonts w:asciiTheme="minorHAnsi" w:eastAsiaTheme="minorHAnsi" w:hAnsiTheme="minorHAnsi" w:cstheme="minorBidi"/>
+          <w:color w:val="000000" w:themeColor="text1"/>
+          <w:kern w:val="2"/>
+          <w14:ligatures w14:val="standardContextual"/>
+        </w:rPr>
+        <w:t>|CD4|&gt;50</w:t>
+      </w:r>
+      <w:r>
+        <w:rPr>
+          <w:rFonts w:asciiTheme="minorHAnsi" w:eastAsiaTheme="minorHAnsi" w:hAnsiTheme="minorHAnsi" w:cstheme="minorBidi"/>
+          <w:color w:val="000000" w:themeColor="text1"/>
+          <w:kern w:val="2"/>
+          <w14:ligatures w14:val="standardContextual"/>
+        </w:rPr>
+        <w:t>)</w:t>
+      </w:r>
+      <w:r>
+        <w:rPr>
+          <w:rFonts w:asciiTheme="minorHAnsi" w:eastAsiaTheme="minorHAnsi" w:hAnsiTheme="minorHAnsi" w:cstheme="minorBidi"/>
+          <w:color w:val="000000" w:themeColor="text1"/>
+          <w:kern w:val="2"/>
+          <w14:ligatures w14:val="standardContextual"/>
+        </w:rPr>
+        <w:t>=</w:t>
+      </w:r>
+      <w:r>
+        <w:rPr>
+          <w:rFonts w:asciiTheme="minorHAnsi" w:eastAsiaTheme="minorHAnsi" w:hAnsiTheme="minorHAnsi" w:cstheme="minorBidi"/>
+          <w:color w:val="000000" w:themeColor="text1"/>
+          <w:kern w:val="2"/>
+          <w14:ligatures w14:val="standardContextual"/>
+        </w:rPr>
+        <w:t>0.995)</w:t>
+      </w:r>
+      <w:r>
+        <w:rPr>
+          <w:rFonts w:asciiTheme="minorHAnsi" w:eastAsiaTheme="minorHAnsi" w:hAnsiTheme="minorHAnsi" w:cstheme="minorBidi"/>
+          <w:color w:val="000000" w:themeColor="text1"/>
+          <w:kern w:val="2"/>
+          <w14:ligatures w14:val="standardContextual"/>
+        </w:rPr>
+        <w:t>.</w:t>
+      </w:r>
+    </w:p>
+    <w:p>
+      <w:pPr>
+        <w:pStyle w:val="p1"/>
+        <w:rPr>
+          <w:rFonts w:asciiTheme="minorHAnsi" w:eastAsiaTheme="minorHAnsi" w:hAnsiTheme="minorHAnsi" w:cstheme="minorBidi"/>
+          <w:color w:val="000000" w:themeColor="text1"/>
+          <w:kern w:val="2"/>
+          <w14:ligatures w14:val="standardContextual"/>
+        </w:rPr>
+      </w:pPr>
+      <w:r>
+        <w:rPr>
+          <w:rFonts w:asciiTheme="minorHAnsi" w:eastAsiaTheme="minorHAnsi" w:hAnsiTheme="minorHAnsi" w:cstheme="minorBidi"/>
+          <w:color w:val="000000" w:themeColor="text1"/>
+          <w:kern w:val="2"/>
+          <w14:ligatures w14:val="standardContextual"/>
+        </w:rPr>
+        <w:t>Hard drug users</w:t>
+      </w:r>
+      <w:r>
+        <w:rPr>
+          <w:rFonts w:asciiTheme="minorHAnsi" w:eastAsiaTheme="minorHAnsi" w:hAnsiTheme="minorHAnsi" w:cstheme="minorBidi"/>
+          <w:color w:val="000000" w:themeColor="text1"/>
+          <w:kern w:val="2"/>
+          <w14:ligatures w14:val="standardContextual"/>
+        </w:rPr>
+        <w:t xml:space="preserve"> exhibited </w:t>
+      </w:r>
+      <w:r>
+        <w:rPr>
+          <w:rFonts w:asciiTheme="minorHAnsi" w:eastAsiaTheme="minorHAnsi" w:hAnsiTheme="minorHAnsi" w:cstheme="minorBidi"/>
+          <w:color w:val="000000" w:themeColor="text1"/>
+          <w:kern w:val="2"/>
+          <w14:ligatures w14:val="standardContextual"/>
+        </w:rPr>
+        <w:t xml:space="preserve">lower </w:t>
+      </w:r>
+      <m:oMath>
+        <m:sSub>
+          <m:sSubPr>
+            <m:ctrlPr>
+              <w:rPr>
+                <w:rFonts w:ascii="Cambria Math" w:eastAsiaTheme="minorHAnsi" w:hAnsi="Cambria Math" w:cstheme="minorBidi"/>
+                <w:iCs/>
+                <w:color w:val="000000" w:themeColor="text1"/>
+                <w:kern w:val="2"/>
+                <w14:ligatures w14:val="standardContextual"/>
+              </w:rPr>
+            </m:ctrlPr>
+          </m:sSubPr>
+          <m:e>
+            <m:r>
+              <m:rPr>
+                <m:sty m:val="p"/>
+              </m:rPr>
+              <w:rPr>
+                <w:rFonts w:ascii="Cambria Math" w:eastAsiaTheme="minorHAnsi" w:hAnsi="Cambria Math" w:cstheme="minorBidi"/>
+                <w:color w:val="000000" w:themeColor="text1"/>
+                <w:kern w:val="2"/>
+                <w14:ligatures w14:val="standardContextual"/>
+              </w:rPr>
+              <m:t>log</m:t>
+            </m:r>
+          </m:e>
+          <m:sub>
+            <m:r>
+              <m:rPr>
+                <m:sty m:val="p"/>
+              </m:rPr>
+              <w:rPr>
+                <w:rFonts w:ascii="Cambria Math" w:eastAsiaTheme="minorHAnsi" w:hAnsi="Cambria Math" w:cstheme="minorBidi"/>
+                <w:color w:val="000000" w:themeColor="text1"/>
+                <w:kern w:val="2"/>
+                <w14:ligatures w14:val="standardContextual"/>
+              </w:rPr>
+              <m:t>10</m:t>
+            </m:r>
+          </m:sub>
+        </m:sSub>
+      </m:oMath>
+      <w:r>
+        <w:rPr>
+          <w:rFonts w:asciiTheme="minorHAnsi" w:eastAsiaTheme="minorHAnsi" w:hAnsiTheme="minorHAnsi" w:cstheme="minorBidi"/>
+          <w:color w:val="000000" w:themeColor="text1"/>
+          <w:kern w:val="2"/>
+          <w14:ligatures w14:val="standardContextual"/>
+        </w:rPr>
+        <w:t xml:space="preserve"> VL (viral load) </w:t>
+      </w:r>
+      <w:r>
+        <w:rPr>
+          <w:rFonts w:asciiTheme="minorHAnsi" w:eastAsiaTheme="minorHAnsi" w:hAnsiTheme="minorHAnsi" w:cstheme="minorBidi"/>
+          <w:color w:val="000000" w:themeColor="text1"/>
+          <w:kern w:val="2"/>
+          <w14:ligatures w14:val="standardContextual"/>
+        </w:rPr>
+        <w:t>at year two, with a posterior median difference of approximately of 0.</w:t>
+      </w:r>
+      <w:r>
+        <w:rPr>
+          <w:rFonts w:asciiTheme="minorHAnsi" w:eastAsiaTheme="minorHAnsi" w:hAnsiTheme="minorHAnsi" w:cstheme="minorBidi"/>
+          <w:color w:val="000000" w:themeColor="text1"/>
+          <w:kern w:val="2"/>
+          <w14:ligatures w14:val="standardContextual"/>
+        </w:rPr>
+        <w:t xml:space="preserve">1 </w:t>
+      </w:r>
+      <w:r>
+        <w:rPr>
+          <w:rFonts w:asciiTheme="minorHAnsi" w:eastAsiaTheme="minorHAnsi" w:hAnsiTheme="minorHAnsi" w:cstheme="minorBidi"/>
+          <w:color w:val="000000" w:themeColor="text1"/>
+          <w:kern w:val="2"/>
+          <w14:ligatures w14:val="standardContextual"/>
+        </w:rPr>
+        <w:t xml:space="preserve">copies/mL </w:t>
+      </w:r>
+      <w:r>
+        <w:rPr>
+          <w:rFonts w:asciiTheme="minorHAnsi" w:eastAsiaTheme="minorHAnsi" w:hAnsiTheme="minorHAnsi" w:cstheme="minorBidi"/>
+          <w:color w:val="000000" w:themeColor="text1"/>
+          <w:kern w:val="2"/>
+          <w14:ligatures w14:val="standardContextual"/>
+        </w:rPr>
+        <w:t>(</w:t>
+      </w:r>
+      <w:r>
+        <w:rPr>
+          <w:rFonts w:asciiTheme="minorHAnsi" w:eastAsiaTheme="minorHAnsi" w:hAnsiTheme="minorHAnsi" w:cstheme="minorBidi"/>
+          <w:color w:val="000000" w:themeColor="text1"/>
+          <w:kern w:val="2"/>
+          <w14:ligatures w14:val="standardContextual"/>
+        </w:rPr>
+        <w:t xml:space="preserve">95% </w:t>
+      </w:r>
+      <w:r>
+        <w:rPr>
+          <w:rFonts w:asciiTheme="minorHAnsi" w:eastAsiaTheme="minorHAnsi" w:hAnsiTheme="minorHAnsi" w:cstheme="minorBidi"/>
+          <w:color w:val="000000" w:themeColor="text1"/>
+          <w:kern w:val="2"/>
+          <w14:ligatures w14:val="standardContextual"/>
+        </w:rPr>
+        <w:t>HDI</w:t>
+      </w:r>
+      <w:r>
+        <w:rPr>
+          <w:rFonts w:asciiTheme="minorHAnsi" w:eastAsiaTheme="minorHAnsi" w:hAnsiTheme="minorHAnsi" w:cstheme="minorBidi"/>
+          <w:color w:val="000000" w:themeColor="text1"/>
+          <w:kern w:val="2"/>
+          <w14:ligatures w14:val="standardContextual"/>
+        </w:rPr>
+        <w:t>: −</w:t>
+      </w:r>
+      <w:r>
+        <w:rPr>
+          <w:rFonts w:asciiTheme="minorHAnsi" w:eastAsiaTheme="minorHAnsi" w:hAnsiTheme="minorHAnsi" w:cstheme="minorBidi"/>
+          <w:color w:val="000000" w:themeColor="text1"/>
+          <w:kern w:val="2"/>
+          <w14:ligatures w14:val="standardContextual"/>
+        </w:rPr>
+        <w:t>0.5 to 0.4</w:t>
+      </w:r>
+      <w:r>
+        <w:rPr>
+          <w:rFonts w:asciiTheme="minorHAnsi" w:eastAsiaTheme="minorHAnsi" w:hAnsiTheme="minorHAnsi" w:cstheme="minorBidi"/>
+          <w:color w:val="000000" w:themeColor="text1"/>
+          <w:kern w:val="2"/>
+          <w14:ligatures w14:val="standardContextual"/>
+        </w:rPr>
+        <w:t xml:space="preserve">; </w:t>
+      </w:r>
+      <w:r>
+        <w:rPr>
+          <w:rFonts w:asciiTheme="minorHAnsi" w:eastAsiaTheme="minorHAnsi" w:hAnsiTheme="minorHAnsi" w:cstheme="minorBidi"/>
+          <w:color w:val="000000" w:themeColor="text1"/>
+          <w:kern w:val="2"/>
+          <w14:ligatures w14:val="standardContextual"/>
+        </w:rPr>
+        <w:t>R̂=1.00, ESS=</w:t>
+      </w:r>
+      <w:r>
+        <w:rPr>
+          <w:rFonts w:asciiTheme="minorHAnsi" w:eastAsiaTheme="minorHAnsi" w:hAnsiTheme="minorHAnsi" w:cstheme="minorBidi"/>
+          <w:color w:val="000000" w:themeColor="text1"/>
+          <w:kern w:val="2"/>
+          <w14:ligatures w14:val="standardContextual"/>
+        </w:rPr>
+        <w:t>8267</w:t>
+      </w:r>
+      <w:r>
+        <w:rPr>
+          <w:rFonts w:asciiTheme="minorHAnsi" w:eastAsiaTheme="minorHAnsi" w:hAnsiTheme="minorHAnsi" w:cstheme="minorBidi"/>
+          <w:color w:val="000000" w:themeColor="text1"/>
+          <w:kern w:val="2"/>
+          <w14:ligatures w14:val="standardContextual"/>
+        </w:rPr>
+        <w:t>; P(β</w:t>
+      </w:r>
+      <w:r>
+        <w:rPr>
+          <w:rFonts w:asciiTheme="minorHAnsi" w:eastAsiaTheme="minorHAnsi" w:hAnsiTheme="minorHAnsi" w:cstheme="minorBidi"/>
+          <w:color w:val="000000" w:themeColor="text1"/>
+          <w:kern w:val="2"/>
+          <w14:ligatures w14:val="standardContextual"/>
+        </w:rPr>
+        <w:t>&gt;</w:t>
+      </w:r>
+      <w:r>
+        <w:rPr>
+          <w:rFonts w:asciiTheme="minorHAnsi" w:eastAsiaTheme="minorHAnsi" w:hAnsiTheme="minorHAnsi" w:cstheme="minorBidi"/>
+          <w:color w:val="000000" w:themeColor="text1"/>
+          <w:kern w:val="2"/>
+          <w14:ligatures w14:val="standardContextual"/>
+        </w:rPr>
+        <w:t>0</w:t>
+      </w:r>
+      <w:r>
+        <w:rPr>
+          <w:rFonts w:asciiTheme="minorHAnsi" w:eastAsiaTheme="minorHAnsi" w:hAnsiTheme="minorHAnsi" w:cstheme="minorBidi"/>
+          <w:color w:val="000000" w:themeColor="text1"/>
+          <w:kern w:val="2"/>
+          <w14:ligatures w14:val="standardContextual"/>
+        </w:rPr>
+        <w:t>)</w:t>
+      </w:r>
+      <w:r>
+        <w:rPr>
+          <w:rFonts w:asciiTheme="minorHAnsi" w:eastAsiaTheme="minorHAnsi" w:hAnsiTheme="minorHAnsi" w:cstheme="minorBidi"/>
+          <w:color w:val="000000" w:themeColor="text1"/>
+          <w:kern w:val="2"/>
+          <w14:ligatures w14:val="standardContextual"/>
+        </w:rPr>
+        <w:t>=</w:t>
+      </w:r>
+      <w:r>
+        <w:rPr>
+          <w:rFonts w:asciiTheme="minorHAnsi" w:eastAsiaTheme="minorHAnsi" w:hAnsiTheme="minorHAnsi" w:cstheme="minorBidi"/>
+          <w:color w:val="000000" w:themeColor="text1"/>
+          <w:kern w:val="2"/>
+          <w14:ligatures w14:val="standardContextual"/>
+        </w:rPr>
+        <w:t>49.3</w:t>
+      </w:r>
+      <w:r>
+        <w:rPr>
+          <w:rFonts w:asciiTheme="minorHAnsi" w:eastAsiaTheme="minorHAnsi" w:hAnsiTheme="minorHAnsi" w:cstheme="minorBidi"/>
+          <w:color w:val="000000" w:themeColor="text1"/>
+          <w:kern w:val="2"/>
+          <w14:ligatures w14:val="standardContextual"/>
+        </w:rPr>
+        <w:t>%</w:t>
+      </w:r>
+      <w:r>
+        <w:rPr>
+          <w:rFonts w:asciiTheme="minorHAnsi" w:eastAsiaTheme="minorHAnsi" w:hAnsiTheme="minorHAnsi" w:cstheme="minorBidi"/>
+          <w:color w:val="000000" w:themeColor="text1"/>
+          <w:kern w:val="2"/>
+          <w14:ligatures w14:val="standardContextual"/>
+        </w:rPr>
+        <w:t>)</w:t>
+      </w:r>
+      <w:r>
+        <w:rPr>
+          <w:rFonts w:asciiTheme="minorHAnsi" w:eastAsiaTheme="minorHAnsi" w:hAnsiTheme="minorHAnsi" w:cstheme="minorBidi"/>
+          <w:color w:val="000000" w:themeColor="text1"/>
+          <w:kern w:val="2"/>
+          <w14:ligatures w14:val="standardContextual"/>
+        </w:rPr>
+        <w:t>.</w:t>
+      </w:r>
+      <w:r>
+        <w:rPr>
+          <w:rFonts w:asciiTheme="minorHAnsi" w:eastAsiaTheme="minorHAnsi" w:hAnsiTheme="minorHAnsi" w:cstheme="minorBidi"/>
+          <w:color w:val="000000" w:themeColor="text1"/>
+          <w:kern w:val="2"/>
+          <w14:ligatures w14:val="standardContextual"/>
+        </w:rPr>
+        <w:t xml:space="preserve"> </w:t>
+      </w:r>
+      <w:r>
+        <w:rPr>
+          <w:rFonts w:asciiTheme="minorHAnsi" w:eastAsiaTheme="minorHAnsi" w:hAnsiTheme="minorHAnsi" w:cstheme="minorBidi"/>
+          <w:color w:val="000000" w:themeColor="text1"/>
+          <w:kern w:val="2"/>
+          <w14:ligatures w14:val="standardContextual"/>
+        </w:rPr>
+        <w:t xml:space="preserve">The posterior probability that this difference exceeded the prespecified clinically meaningful threshold of </w:t>
+      </w:r>
+      <w:r>
+        <w:t xml:space="preserve">0.5 </w:t>
+      </w:r>
+      <m:oMath>
+        <m:sSub>
+          <m:sSubPr>
+            <m:ctrlPr>
+              <w:rPr>
+                <w:rFonts w:ascii="Cambria Math" w:eastAsiaTheme="minorHAnsi" w:hAnsi="Cambria Math" w:cstheme="minorBidi"/>
+                <w:iCs/>
+                <w:color w:val="000000" w:themeColor="text1"/>
+                <w:kern w:val="2"/>
+                <w14:ligatures w14:val="standardContextual"/>
+              </w:rPr>
+            </m:ctrlPr>
+          </m:sSubPr>
+          <m:e>
+            <m:r>
+              <m:rPr>
+                <m:sty m:val="p"/>
+              </m:rPr>
+              <w:rPr>
+                <w:rFonts w:ascii="Cambria Math" w:eastAsiaTheme="minorHAnsi" w:hAnsi="Cambria Math" w:cstheme="minorBidi"/>
+                <w:color w:val="000000" w:themeColor="text1"/>
+                <w:kern w:val="2"/>
+                <w14:ligatures w14:val="standardContextual"/>
+              </w:rPr>
+              <m:t>log</m:t>
+            </m:r>
+          </m:e>
+          <m:sub>
+            <m:r>
+              <m:rPr>
+                <m:sty m:val="p"/>
+              </m:rPr>
+              <w:rPr>
+                <w:rFonts w:ascii="Cambria Math" w:eastAsiaTheme="minorHAnsi" w:hAnsi="Cambria Math" w:cstheme="minorBidi"/>
+                <w:color w:val="000000" w:themeColor="text1"/>
+                <w:kern w:val="2"/>
+                <w14:ligatures w14:val="standardContextual"/>
+              </w:rPr>
+              <m:t>10</m:t>
+            </m:r>
+          </m:sub>
+        </m:sSub>
+      </m:oMath>
+      <w:r>
+        <w:t xml:space="preserve"> copies/mL </w:t>
+      </w:r>
+      <w:r>
+        <w:rPr>
+          <w:rFonts w:asciiTheme="minorHAnsi" w:eastAsiaTheme="minorHAnsi" w:hAnsiTheme="minorHAnsi" w:cstheme="minorBidi"/>
+          <w:color w:val="000000" w:themeColor="text1"/>
+          <w:kern w:val="2"/>
+          <w14:ligatures w14:val="standardContextual"/>
+        </w:rPr>
+        <w:t xml:space="preserve">was </w:t>
+      </w:r>
+      <w:r>
+        <w:rPr>
+          <w:rFonts w:asciiTheme="minorHAnsi" w:eastAsiaTheme="minorHAnsi" w:hAnsiTheme="minorHAnsi" w:cstheme="minorBidi"/>
+          <w:color w:val="000000" w:themeColor="text1"/>
+          <w:kern w:val="2"/>
+          <w14:ligatures w14:val="standardContextual"/>
+        </w:rPr>
+        <w:t>2.3</w:t>
+      </w:r>
+      <w:r>
+        <w:rPr>
+          <w:rFonts w:asciiTheme="minorHAnsi" w:eastAsiaTheme="minorHAnsi" w:hAnsiTheme="minorHAnsi" w:cstheme="minorBidi"/>
+          <w:color w:val="000000" w:themeColor="text1"/>
+          <w:kern w:val="2"/>
+          <w14:ligatures w14:val="standardContextual"/>
+        </w:rPr>
+        <w:t>%</w:t>
+      </w:r>
+      <w:r>
+        <w:rPr>
+          <w:rFonts w:asciiTheme="minorHAnsi" w:eastAsiaTheme="minorHAnsi" w:hAnsiTheme="minorHAnsi" w:cstheme="minorBidi"/>
+          <w:color w:val="000000" w:themeColor="text1"/>
+          <w:kern w:val="2"/>
+          <w14:ligatures w14:val="standardContextual"/>
+        </w:rPr>
+        <w:t xml:space="preserve"> (Pr(|</w:t>
+      </w:r>
+      <w:r>
+        <w:rPr>
+          <w:rFonts w:asciiTheme="minorHAnsi" w:eastAsiaTheme="minorHAnsi" w:hAnsiTheme="minorHAnsi" w:cstheme="minorBidi"/>
+          <w:color w:val="000000" w:themeColor="text1"/>
+          <w:kern w:val="2"/>
+          <w14:ligatures w14:val="standardContextual"/>
+        </w:rPr>
+        <w:t>VL</w:t>
+      </w:r>
+      <w:r>
+        <w:rPr>
+          <w:rFonts w:asciiTheme="minorHAnsi" w:eastAsiaTheme="minorHAnsi" w:hAnsiTheme="minorHAnsi" w:cstheme="minorBidi"/>
+          <w:color w:val="000000" w:themeColor="text1"/>
+          <w:kern w:val="2"/>
+          <w14:ligatures w14:val="standardContextual"/>
+        </w:rPr>
+        <w:t>|&gt;</w:t>
+      </w:r>
+      <w:r>
+        <w:rPr>
+          <w:rFonts w:asciiTheme="minorHAnsi" w:eastAsiaTheme="minorHAnsi" w:hAnsiTheme="minorHAnsi" w:cstheme="minorBidi"/>
+          <w:color w:val="000000" w:themeColor="text1"/>
+          <w:kern w:val="2"/>
+          <w14:ligatures w14:val="standardContextual"/>
+        </w:rPr>
+        <w:t>0.5</w:t>
+      </w:r>
+      <w:r>
+        <w:rPr>
+          <w:rFonts w:asciiTheme="minorHAnsi" w:eastAsiaTheme="minorHAnsi" w:hAnsiTheme="minorHAnsi" w:cstheme="minorBidi"/>
+          <w:color w:val="000000" w:themeColor="text1"/>
+          <w:kern w:val="2"/>
+          <w14:ligatures w14:val="standardContextual"/>
+        </w:rPr>
+        <w:t>)</w:t>
+      </w:r>
+      <w:r>
+        <w:rPr>
+          <w:rFonts w:asciiTheme="minorHAnsi" w:eastAsiaTheme="minorHAnsi" w:hAnsiTheme="minorHAnsi" w:cstheme="minorBidi"/>
+          <w:color w:val="000000" w:themeColor="text1"/>
+          <w:kern w:val="2"/>
+          <w14:ligatures w14:val="standardContextual"/>
+        </w:rPr>
+        <w:t>=0</w:t>
+      </w:r>
+      <w:r>
+        <w:rPr>
+          <w:rFonts w:asciiTheme="minorHAnsi" w:eastAsiaTheme="minorHAnsi" w:hAnsiTheme="minorHAnsi" w:cstheme="minorBidi"/>
+          <w:color w:val="000000" w:themeColor="text1"/>
+          <w:kern w:val="2"/>
+          <w14:ligatures w14:val="standardContextual"/>
+        </w:rPr>
+        <w:t>.023</w:t>
+      </w:r>
+      <w:r>
+        <w:rPr>
+          <w:rFonts w:asciiTheme="minorHAnsi" w:eastAsiaTheme="minorHAnsi" w:hAnsiTheme="minorHAnsi" w:cstheme="minorBidi"/>
+          <w:color w:val="000000" w:themeColor="text1"/>
+          <w:kern w:val="2"/>
+          <w14:ligatures w14:val="standardContextual"/>
+        </w:rPr>
+        <w:t>)</w:t>
+      </w:r>
+      <w:r>
+        <w:rPr>
+          <w:rFonts w:asciiTheme="minorHAnsi" w:eastAsiaTheme="minorHAnsi" w:hAnsiTheme="minorHAnsi" w:cstheme="minorBidi"/>
+          <w:color w:val="000000" w:themeColor="text1"/>
+          <w:kern w:val="2"/>
+          <w14:ligatures w14:val="standardContextual"/>
+        </w:rPr>
+        <w:t>.</w:t>
+      </w:r>
+    </w:p>
+    <w:p>
+      <w:pPr>
+        <w:pStyle w:val="p1"/>
+        <w:rPr>
+          <w:rFonts w:asciiTheme="minorHAnsi" w:eastAsiaTheme="minorHAnsi" w:hAnsiTheme="minorHAnsi" w:cstheme="minorBidi"/>
+          <w:color w:val="000000" w:themeColor="text1"/>
+          <w:kern w:val="2"/>
+          <w14:ligatures w14:val="standardContextual"/>
+        </w:rPr>
+      </w:pPr>
+      <w:r>
+        <w:rPr>
+          <w:rFonts w:asciiTheme="minorHAnsi" w:eastAsiaTheme="minorHAnsi" w:hAnsiTheme="minorHAnsi" w:cstheme="minorBidi"/>
+          <w:color w:val="000000" w:themeColor="text1"/>
+          <w:kern w:val="2"/>
+          <w14:ligatures w14:val="standardContextual"/>
+        </w:rPr>
+        <w:t xml:space="preserve">Hard drug users also demonstrated lower physical </w:t>
+      </w:r>
+      <w:r>
+        <w:rPr>
+          <w:rFonts w:asciiTheme="minorHAnsi" w:eastAsiaTheme="minorHAnsi" w:hAnsiTheme="minorHAnsi" w:cstheme="minorBidi"/>
+          <w:color w:val="000000" w:themeColor="text1"/>
+          <w:kern w:val="2"/>
+          <w14:ligatures w14:val="standardContextual"/>
+        </w:rPr>
+        <w:t>QOL</w:t>
+      </w:r>
+      <w:r>
+        <w:rPr>
+          <w:rFonts w:asciiTheme="minorHAnsi" w:eastAsiaTheme="minorHAnsi" w:hAnsiTheme="minorHAnsi" w:cstheme="minorBidi"/>
+          <w:color w:val="000000" w:themeColor="text1"/>
+          <w:kern w:val="2"/>
+          <w14:ligatures w14:val="standardContextual"/>
+        </w:rPr>
+        <w:t xml:space="preserve"> scores at Year 2, with </w:t>
+      </w:r>
+      <w:r>
+        <w:rPr>
+          <w:rFonts w:asciiTheme="minorHAnsi" w:eastAsiaTheme="minorHAnsi" w:hAnsiTheme="minorHAnsi" w:cstheme="minorBidi"/>
+          <w:color w:val="000000" w:themeColor="text1"/>
+          <w:kern w:val="2"/>
+          <w14:ligatures w14:val="standardContextual"/>
+        </w:rPr>
+        <w:t xml:space="preserve">a </w:t>
+      </w:r>
+      <w:r>
+        <w:rPr>
+          <w:rFonts w:asciiTheme="minorHAnsi" w:eastAsiaTheme="minorHAnsi" w:hAnsiTheme="minorHAnsi" w:cstheme="minorBidi"/>
+          <w:color w:val="000000" w:themeColor="text1"/>
+          <w:kern w:val="2"/>
+          <w14:ligatures w14:val="standardContextual"/>
+        </w:rPr>
+        <w:t xml:space="preserve">posterior </w:t>
+      </w:r>
+      <w:r>
+        <w:rPr>
+          <w:rFonts w:asciiTheme="minorHAnsi" w:eastAsiaTheme="minorHAnsi" w:hAnsiTheme="minorHAnsi" w:cstheme="minorBidi"/>
+          <w:color w:val="000000" w:themeColor="text1"/>
+          <w:kern w:val="2"/>
+          <w14:ligatures w14:val="standardContextual"/>
+        </w:rPr>
+        <w:t>median</w:t>
+      </w:r>
+      <w:r>
+        <w:rPr>
+          <w:rFonts w:asciiTheme="minorHAnsi" w:eastAsiaTheme="minorHAnsi" w:hAnsiTheme="minorHAnsi" w:cstheme="minorBidi"/>
+          <w:color w:val="000000" w:themeColor="text1"/>
+          <w:kern w:val="2"/>
+          <w14:ligatures w14:val="standardContextual"/>
+        </w:rPr>
+        <w:t xml:space="preserve"> </w:t>
+      </w:r>
+      <w:r>
+        <w:rPr>
+          <w:rFonts w:asciiTheme="minorHAnsi" w:eastAsiaTheme="minorHAnsi" w:hAnsiTheme="minorHAnsi" w:cstheme="minorBidi"/>
+          <w:color w:val="000000" w:themeColor="text1"/>
+          <w:kern w:val="2"/>
+          <w14:ligatures w14:val="standardContextual"/>
+        </w:rPr>
+        <w:t xml:space="preserve">difference of approximately 3.3 points (95% </w:t>
+      </w:r>
+      <w:r>
+        <w:rPr>
+          <w:rFonts w:asciiTheme="minorHAnsi" w:eastAsiaTheme="minorHAnsi" w:hAnsiTheme="minorHAnsi" w:cstheme="minorBidi"/>
+          <w:color w:val="000000" w:themeColor="text1"/>
+          <w:kern w:val="2"/>
+          <w14:ligatures w14:val="standardContextual"/>
+        </w:rPr>
+        <w:t>HDI</w:t>
+      </w:r>
+      <w:r>
+        <w:rPr>
+          <w:rFonts w:asciiTheme="minorHAnsi" w:eastAsiaTheme="minorHAnsi" w:hAnsiTheme="minorHAnsi" w:cstheme="minorBidi"/>
+          <w:color w:val="000000" w:themeColor="text1"/>
+          <w:kern w:val="2"/>
+          <w14:ligatures w14:val="standardContextual"/>
+        </w:rPr>
+        <w:t>: −6.0</w:t>
+      </w:r>
+      <w:r>
+        <w:rPr>
+          <w:rFonts w:asciiTheme="minorHAnsi" w:eastAsiaTheme="minorHAnsi" w:hAnsiTheme="minorHAnsi" w:cstheme="minorBidi"/>
+          <w:color w:val="000000" w:themeColor="text1"/>
+          <w:kern w:val="2"/>
+          <w14:ligatures w14:val="standardContextual"/>
+        </w:rPr>
+        <w:t xml:space="preserve"> to </w:t>
+      </w:r>
+      <w:r>
+        <w:rPr>
+          <w:rFonts w:asciiTheme="minorHAnsi" w:eastAsiaTheme="minorHAnsi" w:hAnsiTheme="minorHAnsi" w:cstheme="minorBidi"/>
+          <w:color w:val="000000" w:themeColor="text1"/>
+          <w:kern w:val="2"/>
+          <w14:ligatures w14:val="standardContextual"/>
+        </w:rPr>
+        <w:t>-</w:t>
+      </w:r>
+      <w:r>
+        <w:rPr>
+          <w:rFonts w:asciiTheme="minorHAnsi" w:eastAsiaTheme="minorHAnsi" w:hAnsiTheme="minorHAnsi" w:cstheme="minorBidi"/>
+          <w:color w:val="000000" w:themeColor="text1"/>
+          <w:kern w:val="2"/>
+          <w14:ligatures w14:val="standardContextual"/>
+        </w:rPr>
+        <w:t>0.6), suggesting modest but statistically significant differences in perceived physical health.</w:t>
+      </w:r>
+      <w:r>
+        <w:rPr>
+          <w:rFonts w:asciiTheme="minorHAnsi" w:eastAsiaTheme="minorHAnsi" w:hAnsiTheme="minorHAnsi" w:cstheme="minorBidi"/>
+          <w:color w:val="000000" w:themeColor="text1"/>
+          <w:kern w:val="2"/>
+          <w14:ligatures w14:val="standardContextual"/>
+        </w:rPr>
+        <w:t xml:space="preserve"> </w:t>
+      </w:r>
+      <w:r>
+        <w:rPr>
+          <w:rFonts w:asciiTheme="minorHAnsi" w:eastAsiaTheme="minorHAnsi" w:hAnsiTheme="minorHAnsi" w:cstheme="minorBidi"/>
+          <w:color w:val="000000" w:themeColor="text1"/>
+          <w:kern w:val="2"/>
+          <w14:ligatures w14:val="standardContextual"/>
+        </w:rPr>
+        <w:t xml:space="preserve">No evidence of differences in mental quality-of-life scores was observed between groups </w:t>
+      </w:r>
+      <w:r>
+        <w:rPr>
+          <w:rFonts w:asciiTheme="minorHAnsi" w:eastAsiaTheme="minorHAnsi" w:hAnsiTheme="minorHAnsi" w:cstheme="minorBidi"/>
+          <w:color w:val="000000" w:themeColor="text1"/>
+          <w:kern w:val="2"/>
+          <w14:ligatures w14:val="standardContextual"/>
+        </w:rPr>
+        <w:t>(</w:t>
+      </w:r>
+      <w:r>
+        <w:rPr>
+          <w:rFonts w:asciiTheme="minorHAnsi" w:eastAsiaTheme="minorHAnsi" w:hAnsiTheme="minorHAnsi" w:cstheme="minorBidi"/>
+          <w:color w:val="000000" w:themeColor="text1"/>
+          <w:kern w:val="2"/>
+          <w14:ligatures w14:val="standardContextual"/>
+        </w:rPr>
+        <w:t xml:space="preserve">95% </w:t>
+      </w:r>
+      <w:r>
+        <w:rPr>
+          <w:rFonts w:asciiTheme="minorHAnsi" w:eastAsiaTheme="minorHAnsi" w:hAnsiTheme="minorHAnsi" w:cstheme="minorBidi"/>
+          <w:color w:val="000000" w:themeColor="text1"/>
+          <w:kern w:val="2"/>
+          <w14:ligatures w14:val="standardContextual"/>
+        </w:rPr>
+        <w:t>HDI</w:t>
+      </w:r>
+      <w:r>
+        <w:rPr>
+          <w:rFonts w:asciiTheme="minorHAnsi" w:eastAsiaTheme="minorHAnsi" w:hAnsiTheme="minorHAnsi" w:cstheme="minorBidi"/>
+          <w:color w:val="000000" w:themeColor="text1"/>
+          <w:kern w:val="2"/>
+          <w14:ligatures w14:val="standardContextual"/>
+        </w:rPr>
+        <w:t>: −3.7, 3.2)</w:t>
+      </w:r>
+      <w:r>
+        <w:rPr>
+          <w:rFonts w:asciiTheme="minorHAnsi" w:eastAsiaTheme="minorHAnsi" w:hAnsiTheme="minorHAnsi" w:cstheme="minorBidi"/>
+          <w:color w:val="000000" w:themeColor="text1"/>
+          <w:kern w:val="2"/>
+          <w14:ligatures w14:val="standardContextual"/>
+        </w:rPr>
+        <w:t xml:space="preserve">. </w:t>
+      </w:r>
+      <w:r>
+        <w:rPr>
+          <w:rFonts w:asciiTheme="minorHAnsi" w:eastAsiaTheme="minorHAnsi" w:hAnsiTheme="minorHAnsi" w:cstheme="minorBidi"/>
+          <w:color w:val="000000" w:themeColor="text1"/>
+          <w:kern w:val="2"/>
+          <w14:ligatures w14:val="standardContextual"/>
+        </w:rPr>
+        <w:t>The posterior probabilit</w:t>
+      </w:r>
+      <w:r>
+        <w:rPr>
+          <w:rFonts w:asciiTheme="minorHAnsi" w:eastAsiaTheme="minorHAnsi" w:hAnsiTheme="minorHAnsi" w:cstheme="minorBidi"/>
+          <w:color w:val="000000" w:themeColor="text1"/>
+          <w:kern w:val="2"/>
+          <w14:ligatures w14:val="standardContextual"/>
+        </w:rPr>
+        <w:t>ies</w:t>
+      </w:r>
+      <w:r>
+        <w:rPr>
+          <w:rFonts w:asciiTheme="minorHAnsi" w:eastAsiaTheme="minorHAnsi" w:hAnsiTheme="minorHAnsi" w:cstheme="minorBidi"/>
+          <w:color w:val="000000" w:themeColor="text1"/>
+          <w:kern w:val="2"/>
+          <w14:ligatures w14:val="standardContextual"/>
+        </w:rPr>
+        <w:t xml:space="preserve"> that </w:t>
+      </w:r>
+      <w:r>
+        <w:rPr>
+          <w:rFonts w:asciiTheme="minorHAnsi" w:eastAsiaTheme="minorHAnsi" w:hAnsiTheme="minorHAnsi" w:cstheme="minorBidi"/>
+          <w:color w:val="000000" w:themeColor="text1"/>
+          <w:kern w:val="2"/>
+          <w14:ligatures w14:val="standardContextual"/>
+        </w:rPr>
+        <w:t>these difference</w:t>
+      </w:r>
+      <w:r>
+        <w:rPr>
+          <w:rFonts w:asciiTheme="minorHAnsi" w:eastAsiaTheme="minorHAnsi" w:hAnsiTheme="minorHAnsi" w:cstheme="minorBidi"/>
+          <w:color w:val="000000" w:themeColor="text1"/>
+          <w:kern w:val="2"/>
+          <w14:ligatures w14:val="standardContextual"/>
+        </w:rPr>
+        <w:t xml:space="preserve"> exceeded the</w:t>
+      </w:r>
+      <w:r>
+        <w:rPr>
+          <w:rFonts w:asciiTheme="minorHAnsi" w:eastAsiaTheme="minorHAnsi" w:hAnsiTheme="minorHAnsi" w:cstheme="minorBidi"/>
+          <w:color w:val="000000" w:themeColor="text1"/>
+          <w:kern w:val="2"/>
+          <w14:ligatures w14:val="standardContextual"/>
+        </w:rPr>
+        <w:t>ir</w:t>
+      </w:r>
+      <w:r>
+        <w:rPr>
+          <w:rFonts w:asciiTheme="minorHAnsi" w:eastAsiaTheme="minorHAnsi" w:hAnsiTheme="minorHAnsi" w:cstheme="minorBidi"/>
+          <w:color w:val="000000" w:themeColor="text1"/>
+          <w:kern w:val="2"/>
+          <w14:ligatures w14:val="standardContextual"/>
+        </w:rPr>
+        <w:t xml:space="preserve"> prespecified clinically meaningful threshold of </w:t>
+      </w:r>
+      <w:r>
+        <w:t>2</w:t>
+      </w:r>
+      <w:r>
+        <w:t xml:space="preserve"> </w:t>
+      </w:r>
+      <w:r>
+        <w:rPr>
+          <w:rFonts w:asciiTheme="minorHAnsi" w:eastAsiaTheme="minorHAnsi" w:hAnsiTheme="minorHAnsi" w:cstheme="minorBidi"/>
+          <w:color w:val="000000" w:themeColor="text1"/>
+          <w:kern w:val="2"/>
+          <w14:ligatures w14:val="standardContextual"/>
+        </w:rPr>
+        <w:t xml:space="preserve">was </w:t>
+      </w:r>
+      <w:r>
+        <w:rPr>
+          <w:rFonts w:asciiTheme="minorHAnsi" w:eastAsiaTheme="minorHAnsi" w:hAnsiTheme="minorHAnsi" w:cstheme="minorBidi"/>
+          <w:color w:val="000000" w:themeColor="text1"/>
+          <w:kern w:val="2"/>
+          <w14:ligatures w14:val="standardContextual"/>
+        </w:rPr>
+        <w:t>83.3</w:t>
+      </w:r>
+      <w:r>
+        <w:rPr>
+          <w:rFonts w:asciiTheme="minorHAnsi" w:eastAsiaTheme="minorHAnsi" w:hAnsiTheme="minorHAnsi" w:cstheme="minorBidi"/>
+          <w:color w:val="000000" w:themeColor="text1"/>
+          <w:kern w:val="2"/>
+          <w14:ligatures w14:val="standardContextual"/>
+        </w:rPr>
+        <w:t>%</w:t>
+      </w:r>
+      <w:r>
+        <w:rPr>
+          <w:rFonts w:asciiTheme="minorHAnsi" w:eastAsiaTheme="minorHAnsi" w:hAnsiTheme="minorHAnsi" w:cstheme="minorBidi"/>
+          <w:color w:val="000000" w:themeColor="text1"/>
+          <w:kern w:val="2"/>
+          <w14:ligatures w14:val="standardContextual"/>
+        </w:rPr>
+        <w:t xml:space="preserve"> and 26%, respectively.</w:t>
+      </w:r>
+      <w:r>
+        <w:rPr>
+          <w:rFonts w:asciiTheme="minorHAnsi" w:eastAsiaTheme="minorHAnsi" w:hAnsiTheme="minorHAnsi" w:cstheme="minorBidi"/>
+          <w:color w:val="000000" w:themeColor="text1"/>
+          <w:kern w:val="2"/>
+          <w14:ligatures w14:val="standardContextual"/>
+        </w:rPr>
+        <w:t xml:space="preserve"> </w:t>
+      </w:r>
+    </w:p>
+    <w:p>
+      <w:pPr>
+        <w:pStyle w:val="Heading4"/>
+      </w:pPr>
+      <w:r>
+        <w:t>3.</w:t>
+      </w:r>
+      <w:r>
+        <w:t>2</w:t>
+      </w:r>
+      <w:r>
+        <w:t xml:space="preserve"> </w:t>
+      </w:r>
+      <w:r>
+        <w:t xml:space="preserve">Mediation </w:t>
+      </w:r>
+    </w:p>
+    <w:p>
+      <w:pPr>
+        <w:rPr>
+          <w:color w:val="000000" w:themeColor="text1"/>
+        </w:rPr>
+      </w:pPr>
+      <w:r>
+        <w:rPr>
+          <w:color w:val="000000" w:themeColor="text1"/>
+        </w:rPr>
+        <w:t xml:space="preserve">Frequentist mediation analysis estimated an indirect effect of 5.4 CD4 cells (95% CI: −1.7 to 13.1), which did not reach conventional statistical significance (p=0.11). In contrast, Bayesian mediation analysis yielded a posterior mean indirect effect of 6.1 cells (95% HDI: 0.3 to 11.8), with 99% posterior probability that the effect was greater than zero. Despite differences in </w:t>
+      </w:r>
+      <w:r>
+        <w:rPr>
+          <w:color w:val="000000" w:themeColor="text1"/>
+        </w:rPr>
+        <w:lastRenderedPageBreak/>
+        <w:t xml:space="preserve">uncertainty quantification, both approaches suggest that adherence explains only a small proportion </w:t>
+      </w:r>
+      <w:r>
+        <w:rPr>
+          <w:color w:val="000000" w:themeColor="text1"/>
+        </w:rPr>
+        <w:t xml:space="preserve">(≈3.5%) </w:t>
+      </w:r>
+      <w:r>
+        <w:rPr>
+          <w:color w:val="000000" w:themeColor="text1"/>
+        </w:rPr>
+        <w:t>of the total association between hard drug use and immune recovery.</w:t>
+      </w:r>
+    </w:p>
+    <w:p/>
+    <w:p>
+      <w:r>
+        <w:t xml:space="preserve"> </w:t>
+      </w:r>
+    </w:p>
+    <w:p/>
+    <w:p>
+      <w:pPr>
+        <w:pStyle w:val="Heading4"/>
+        <w:spacing w:line="240" w:lineRule="auto"/>
+        <w:contextualSpacing/>
+      </w:pPr>
+      <w:r>
+        <w:t>3.</w:t>
+      </w:r>
+      <w:r>
+        <w:t>3</w:t>
+      </w:r>
+      <w:r>
+        <w:t xml:space="preserve"> </w:t>
+      </w:r>
+      <w:r>
+        <w:t xml:space="preserve">Loss to Follow-up </w:t>
+      </w:r>
+    </w:p>
+    <w:p/>
+    <w:p>
+      <w:pPr>
+        <w:contextualSpacing/>
+        <w:jc w:val="center"/>
+      </w:pPr>
+    </w:p>
+    <w:p>
+      <w:pPr>
+        <w:pStyle w:val="Caption"/>
+        <w:rPr>
+          <w:sz w:val="21"/>
+          <w:szCs w:val="21"/>
+        </w:rPr>
+      </w:pPr>
+      <w:bookmarkStart w:id="5" w:name="_Ref220680029"/>
       <w:r>
         <w:rPr>
           <w:b/>
@@ -1465,7 +3723,7 @@
           <w:sz w:val="21"/>
           <w:szCs w:val="21"/>
         </w:rPr>
-        <w:t xml:space="preserve">Figure </w:t>
+        <w:t xml:space="preserve">Table </w:t>
       </w:r>
       <w:r>
         <w:rPr>
@@ -1483,7 +3741,7 @@
           <w:sz w:val="21"/>
           <w:szCs w:val="21"/>
         </w:rPr>
-        <w:instrText xml:space="preserve"> SEQ Figure \* ARABIC </w:instrText>
+        <w:instrText xml:space="preserve"> SEQ Table \* ARABIC </w:instrText>
       </w:r>
       <w:r>
         <w:rPr>
@@ -1502,7 +3760,7 @@
           <w:sz w:val="21"/>
           <w:szCs w:val="21"/>
         </w:rPr>
-        <w:t>1</w:t>
+        <w:t>3</w:t>
       </w:r>
       <w:r>
         <w:rPr>
@@ -1513,7 +3771,88 @@
         </w:rPr>
         <w:fldChar w:fldCharType="end"/>
       </w:r>
-      <w:bookmarkEnd w:id="4"/>
+      <w:bookmarkEnd w:id="5"/>
+      <w:r>
+        <w:rPr>
+          <w:sz w:val="21"/>
+          <w:szCs w:val="21"/>
+        </w:rPr>
+        <w:t xml:space="preserve">. Piece-wise linear mixed-effects models describing diurnal patterns of DHEA and cortisol </w:t>
+      </w:r>
+      <w:r>
+        <w:rPr>
+          <w:sz w:val="21"/>
+          <w:szCs w:val="21"/>
+        </w:rPr>
+        <w:t>levels</w:t>
+      </w:r>
+      <w:r>
+        <w:rPr>
+          <w:sz w:val="21"/>
+          <w:szCs w:val="21"/>
+        </w:rPr>
+        <w:t>.</w:t>
+      </w:r>
+      <w:r>
+        <w:rPr>
+          <w:sz w:val="21"/>
+          <w:szCs w:val="21"/>
+        </w:rPr>
+        <w:t xml:space="preserve"> Models included a knot at 30 minutes post waking to estimate the initial post-waking change and the subsequent rate of change over the remainder of the day, with subject-specific random intercepts accounting for repeated measures. Exponentiated coefficients represent multiplicative changes in concentration </w:t>
+      </w:r>
+      <w:r>
+        <w:rPr>
+          <w:sz w:val="21"/>
+          <w:szCs w:val="21"/>
+        </w:rPr>
+        <w:t xml:space="preserve">levels </w:t>
+      </w:r>
+      <w:r>
+        <w:rPr>
+          <w:sz w:val="21"/>
+          <w:szCs w:val="21"/>
+        </w:rPr>
+        <w:t>per minute within each time segment.</w:t>
+      </w:r>
+    </w:p>
+    <w:p>
+      <w:pPr>
+        <w:spacing w:line="480" w:lineRule="auto"/>
+      </w:pPr>
+    </w:p>
+    <w:p>
+      <w:pPr>
+        <w:spacing w:line="480" w:lineRule="auto"/>
+      </w:pPr>
+      <w:r>
+        <w:rPr>
+          <w:color w:val="000000" w:themeColor="text1"/>
+        </w:rPr>
+        <w:t xml:space="preserve"> (</w:t>
+      </w:r>
+      <w:r>
+        <w:rPr>
+          <w:color w:val="000000" w:themeColor="text1"/>
+        </w:rPr>
+        <w:fldChar w:fldCharType="begin"/>
+      </w:r>
+      <w:r>
+        <w:rPr>
+          <w:color w:val="000000" w:themeColor="text1"/>
+        </w:rPr>
+        <w:instrText xml:space="preserve"> REF _Ref220680029 \h </w:instrText>
+      </w:r>
+      <w:r>
+        <w:rPr>
+          <w:color w:val="000000" w:themeColor="text1"/>
+        </w:rPr>
+      </w:r>
+      <w:r>
+        <w:rPr>
+          <w:color w:val="000000" w:themeColor="text1"/>
+        </w:rPr>
+        <w:fldChar w:fldCharType="separate"/>
+      </w:r>
       <w:r>
         <w:rPr>
           <w:b/>
@@ -1521,128 +3860,7 @@
           <w:sz w:val="21"/>
           <w:szCs w:val="21"/>
         </w:rPr>
-        <w:t>.</w:t>
-      </w:r>
-      <w:r>
-        <w:rPr>
-          <w:sz w:val="21"/>
-          <w:szCs w:val="21"/>
-        </w:rPr>
-        <w:t xml:space="preserve">  </w:t>
-      </w:r>
-      <w:r>
-        <w:rPr>
-          <w:sz w:val="21"/>
-          <w:szCs w:val="21"/>
-        </w:rPr>
-        <w:t>Booklet</w:t>
-      </w:r>
-      <w:r>
-        <w:rPr>
-          <w:sz w:val="21"/>
-          <w:szCs w:val="21"/>
-        </w:rPr>
-        <w:t xml:space="preserve"> versus </w:t>
-      </w:r>
-      <w:r>
-        <w:rPr>
-          <w:sz w:val="21"/>
-          <w:szCs w:val="21"/>
-        </w:rPr>
-        <w:t>CAP</w:t>
-      </w:r>
-      <w:r>
-        <w:rPr>
-          <w:sz w:val="21"/>
-          <w:szCs w:val="21"/>
-        </w:rPr>
-        <w:t xml:space="preserve"> minutes since waking </w:t>
-      </w:r>
-      <w:r>
-        <w:rPr>
-          <w:sz w:val="21"/>
-          <w:szCs w:val="21"/>
-        </w:rPr>
-        <w:t>across all collection samples</w:t>
-      </w:r>
-      <w:r>
-        <w:rPr>
-          <w:sz w:val="21"/>
-          <w:szCs w:val="21"/>
-        </w:rPr>
-        <w:t>. </w:t>
-      </w:r>
-      <w:r>
-        <w:rPr>
-          <w:sz w:val="21"/>
-          <w:szCs w:val="21"/>
-        </w:rPr>
-        <w:t>The solid</w:t>
-      </w:r>
-      <w:r>
-        <w:rPr>
-          <w:sz w:val="21"/>
-          <w:szCs w:val="21"/>
-        </w:rPr>
-        <w:t xml:space="preserve"> </w:t>
-      </w:r>
-      <w:r>
-        <w:rPr>
-          <w:sz w:val="21"/>
-          <w:szCs w:val="21"/>
-        </w:rPr>
-        <w:t>line shows the fitted linear mixed-effects model with a subject-specific random intercept, while the dashed line represents perfect agreement (y = x</w:t>
-      </w:r>
-      <w:r>
-        <w:rPr>
-          <w:sz w:val="21"/>
-          <w:szCs w:val="21"/>
-        </w:rPr>
-        <w:t>)</w:t>
-      </w:r>
-      <w:r>
-        <w:rPr>
-          <w:sz w:val="21"/>
-          <w:szCs w:val="21"/>
-        </w:rPr>
-        <w:t>.</w:t>
-      </w:r>
-    </w:p>
-    <w:p>
-      <w:pPr>
-        <w:rPr>
-          <w:sz w:val="21"/>
-          <w:szCs w:val="21"/>
-        </w:rPr>
-      </w:pPr>
-    </w:p>
-    <w:p>
-      <w:pPr>
-        <w:spacing w:line="480" w:lineRule="auto"/>
-      </w:pPr>
-      <w:r>
-        <w:t xml:space="preserve"> </w:t>
-      </w:r>
-      <w:r>
-        <w:t>(</w:t>
-      </w:r>
-      <w:r>
-        <w:fldChar w:fldCharType="begin"/>
-      </w:r>
-      <w:r>
-        <w:instrText xml:space="preserve"> REF _Ref220579249 \h </w:instrText>
-      </w:r>
-      <w:r>
-        <w:fldChar w:fldCharType="separate"/>
-      </w:r>
-      <w:r>
-        <w:rPr>
-          <w:b/>
-          <w:bCs/>
-          <w:sz w:val="21"/>
-          <w:szCs w:val="21"/>
-        </w:rPr>
-        <w:t xml:space="preserve">Figure </w:t>
+        <w:t xml:space="preserve">Table </w:t>
       </w:r>
       <w:r>
         <w:rPr>
@@ -1652,530 +3870,68 @@
           <w:sz w:val="21"/>
           <w:szCs w:val="21"/>
         </w:rPr>
-        <w:t>1</w:t>
-      </w:r>
-      <w:r>
+        <w:t>3</w:t>
+      </w:r>
+      <w:r>
+        <w:rPr>
+          <w:color w:val="000000" w:themeColor="text1"/>
+        </w:rPr>
         <w:fldChar w:fldCharType="end"/>
       </w:r>
       <w:r>
-        <w:t>).</w:t>
-      </w:r>
-    </w:p>
-    <w:p>
-      <w:pPr>
-        <w:spacing w:line="240" w:lineRule="auto"/>
-        <w:contextualSpacing/>
-        <w:rPr>
-          <w:b/>
-          <w:bCs/>
-          <w:sz w:val="21"/>
-          <w:szCs w:val="21"/>
-        </w:rPr>
-      </w:pPr>
-    </w:p>
-    <w:p>
-      <w:pPr>
-        <w:spacing w:line="240" w:lineRule="auto"/>
-        <w:contextualSpacing/>
-        <w:jc w:val="center"/>
-      </w:pPr>
-    </w:p>
-    <w:p>
-      <w:pPr>
-        <w:pStyle w:val="Caption"/>
-        <w:rPr>
-          <w:sz w:val="24"/>
-          <w:szCs w:val="24"/>
-        </w:rPr>
-      </w:pPr>
-      <w:bookmarkStart w:id="5" w:name="_Ref220679981"/>
-      <w:r>
-        <w:rPr>
-          <w:b/>
-          <w:bCs/>
-          <w:sz w:val="21"/>
-          <w:szCs w:val="21"/>
-        </w:rPr>
-        <w:t xml:space="preserve">Table </w:t>
-      </w:r>
-      <w:r>
-        <w:rPr>
-          <w:b/>
-          <w:bCs/>
-          <w:sz w:val="21"/>
-          <w:szCs w:val="21"/>
-        </w:rPr>
-        <w:fldChar w:fldCharType="begin"/>
-      </w:r>
-      <w:r>
-        <w:rPr>
-          <w:b/>
-          <w:bCs/>
-          <w:sz w:val="21"/>
-          <w:szCs w:val="21"/>
-        </w:rPr>
-        <w:instrText xml:space="preserve"> SEQ Table \* ARABIC </w:instrText>
-      </w:r>
-      <w:r>
-        <w:rPr>
-          <w:b/>
-          <w:bCs/>
-          <w:sz w:val="21"/>
-          <w:szCs w:val="21"/>
-        </w:rPr>
-        <w:fldChar w:fldCharType="separate"/>
-      </w:r>
-      <w:r>
-        <w:rPr>
-          <w:b/>
-          <w:bCs/>
-          <w:noProof/>
-          <w:sz w:val="21"/>
-          <w:szCs w:val="21"/>
-        </w:rPr>
-        <w:t>2</w:t>
-      </w:r>
-      <w:r>
-        <w:rPr>
-          <w:b/>
-          <w:bCs/>
-          <w:sz w:val="21"/>
-          <w:szCs w:val="21"/>
-        </w:rPr>
-        <w:fldChar w:fldCharType="end"/>
-      </w:r>
-      <w:bookmarkEnd w:id="5"/>
-      <w:r>
-        <w:rPr>
-          <w:b/>
-          <w:bCs/>
-          <w:sz w:val="21"/>
-          <w:szCs w:val="21"/>
+        <w:rPr>
+          <w:color w:val="000000" w:themeColor="text1"/>
+        </w:rPr>
+        <w:t>)</w:t>
+      </w:r>
+      <w:r>
+        <w:rPr>
+          <w:color w:val="000000" w:themeColor="text1"/>
         </w:rPr>
         <w:t>.</w:t>
       </w:r>
-      <w:r>
-        <w:rPr>
-          <w:sz w:val="21"/>
-          <w:szCs w:val="21"/>
-        </w:rPr>
-        <w:t> </w:t>
-      </w:r>
-      <w:r>
-        <w:rPr>
-          <w:sz w:val="21"/>
-          <w:szCs w:val="21"/>
-        </w:rPr>
-        <w:t xml:space="preserve">Linear </w:t>
-      </w:r>
-      <w:r>
-        <w:rPr>
-          <w:sz w:val="21"/>
-          <w:szCs w:val="21"/>
-        </w:rPr>
-        <w:t xml:space="preserve">Mixed-effects model of timing differences between </w:t>
-      </w:r>
-      <w:r>
-        <w:rPr>
-          <w:sz w:val="21"/>
-          <w:szCs w:val="21"/>
-        </w:rPr>
-        <w:t>Booklet</w:t>
-      </w:r>
-      <w:r>
-        <w:rPr>
-          <w:sz w:val="21"/>
-          <w:szCs w:val="21"/>
-        </w:rPr>
-        <w:t xml:space="preserve"> and </w:t>
-      </w:r>
-      <w:r>
-        <w:rPr>
-          <w:sz w:val="21"/>
-          <w:szCs w:val="21"/>
-        </w:rPr>
-        <w:t>Cap</w:t>
-      </w:r>
-      <w:r>
-        <w:rPr>
-          <w:sz w:val="21"/>
-          <w:szCs w:val="21"/>
-        </w:rPr>
-        <w:t xml:space="preserve"> measurement</w:t>
-      </w:r>
-      <w:r>
-        <w:rPr>
-          <w:sz w:val="21"/>
-          <w:szCs w:val="21"/>
-        </w:rPr>
-        <w:t>s</w:t>
-      </w:r>
-      <w:r>
-        <w:rPr>
-          <w:sz w:val="21"/>
-          <w:szCs w:val="21"/>
-        </w:rPr>
-        <w:t>. </w:t>
-      </w:r>
-      <w:r>
-        <w:rPr>
-          <w:sz w:val="21"/>
-          <w:szCs w:val="21"/>
-        </w:rPr>
-        <w:t xml:space="preserve">The slope reflects the degree of </w:t>
-      </w:r>
-      <w:r>
-        <w:rPr>
-          <w:sz w:val="21"/>
-          <w:szCs w:val="21"/>
-        </w:rPr>
-        <w:t>agreement</w:t>
-      </w:r>
-      <w:r>
-        <w:rPr>
-          <w:sz w:val="21"/>
-          <w:szCs w:val="21"/>
-        </w:rPr>
-        <w:t xml:space="preserve"> in elapsed time between the two measures, while the intercept represents the average </w:t>
-      </w:r>
-      <w:r>
-        <w:rPr>
-          <w:sz w:val="21"/>
-          <w:szCs w:val="21"/>
-        </w:rPr>
-        <w:t>bias</w:t>
-      </w:r>
-      <w:r>
-        <w:rPr>
-          <w:sz w:val="21"/>
-          <w:szCs w:val="21"/>
-        </w:rPr>
-        <w:t xml:space="preserve"> between </w:t>
-      </w:r>
-      <w:r>
-        <w:rPr>
-          <w:sz w:val="21"/>
-          <w:szCs w:val="21"/>
-        </w:rPr>
-        <w:t>B</w:t>
-      </w:r>
-      <w:r>
-        <w:rPr>
-          <w:sz w:val="21"/>
-          <w:szCs w:val="21"/>
-        </w:rPr>
-        <w:t xml:space="preserve">ooklet and </w:t>
-      </w:r>
-      <w:r>
-        <w:rPr>
-          <w:sz w:val="21"/>
-          <w:szCs w:val="21"/>
-        </w:rPr>
-        <w:t>C</w:t>
-      </w:r>
-      <w:r>
-        <w:rPr>
-          <w:sz w:val="21"/>
-          <w:szCs w:val="21"/>
-        </w:rPr>
-        <w:t>ap times.</w:t>
-      </w:r>
+    </w:p>
+    <w:p>
+      <w:pPr>
+        <w:pStyle w:val="Heading2"/>
+      </w:pPr>
+      <w:bookmarkStart w:id="6" w:name="_Toc221022976"/>
+      <w:r>
+        <w:t>Discussion</w:t>
+      </w:r>
+      <w:bookmarkEnd w:id="6"/>
     </w:p>
     <w:p>
       <w:pPr>
         <w:spacing w:line="480" w:lineRule="auto"/>
       </w:pPr>
+      <w:r>
+        <w:t xml:space="preserve">***Discuss if I think we met the assumption that missingness is at least missing at random (MAR), where dropouts only depend on </w:t>
+      </w:r>
+      <w:r>
+        <w:t>our</w:t>
+      </w:r>
+      <w:r>
+        <w:t xml:space="preserve"> observed variables***</w:t>
+      </w:r>
     </w:p>
     <w:p>
       <w:pPr>
         <w:spacing w:line="480" w:lineRule="auto"/>
       </w:pPr>
-      <w:r>
-        <w:t>(</w:t>
-      </w:r>
-      <w:r>
-        <w:fldChar w:fldCharType="begin"/>
-      </w:r>
-      <w:r>
-        <w:instrText xml:space="preserve"> REF _Ref220679981 \h </w:instrText>
-      </w:r>
-      <w:r>
-        <w:fldChar w:fldCharType="separate"/>
-      </w:r>
-      <w:r>
-        <w:rPr>
-          <w:b/>
-          <w:bCs/>
-          <w:sz w:val="21"/>
-          <w:szCs w:val="21"/>
-        </w:rPr>
-        <w:t xml:space="preserve">Table </w:t>
-      </w:r>
-      <w:r>
-        <w:rPr>
-          <w:b/>
-          <w:bCs/>
-          <w:noProof/>
-          <w:sz w:val="21"/>
-          <w:szCs w:val="21"/>
-        </w:rPr>
-        <w:t>2</w:t>
-      </w:r>
-      <w:r>
-        <w:fldChar w:fldCharType="end"/>
-      </w:r>
-      <w:r>
-        <w:t>)</w:t>
-      </w:r>
-      <w:r>
-        <w:t>.</w:t>
-      </w:r>
-    </w:p>
-    <w:p>
-      <w:pPr>
-        <w:spacing w:line="480" w:lineRule="auto"/>
-      </w:pPr>
-    </w:p>
-    <w:p>
-      <w:pPr>
-        <w:pStyle w:val="Heading4"/>
-      </w:pPr>
-      <w:r>
-        <w:t>3.3 Adherence to Protocol Timing</w:t>
-      </w:r>
-    </w:p>
-    <w:p/>
-    <w:p/>
-    <w:p/>
-    <w:p>
-      <w:pPr>
-        <w:pStyle w:val="Heading4"/>
-        <w:spacing w:line="240" w:lineRule="auto"/>
-        <w:contextualSpacing/>
-      </w:pPr>
-      <w:r>
-        <w:t>3.4 Diurnal Patterns of Cortisol and DHEA</w:t>
-      </w:r>
-    </w:p>
-    <w:p/>
-    <w:p>
-      <w:pPr>
-        <w:spacing w:line="240" w:lineRule="auto"/>
-        <w:contextualSpacing/>
-        <w:jc w:val="center"/>
-      </w:pPr>
-    </w:p>
-    <w:p>
-      <w:pPr>
-        <w:pStyle w:val="Caption"/>
-        <w:rPr>
-          <w:sz w:val="21"/>
-          <w:szCs w:val="21"/>
-        </w:rPr>
-      </w:pPr>
-      <w:bookmarkStart w:id="6" w:name="_Ref220680029"/>
-      <w:r>
-        <w:rPr>
-          <w:b/>
-          <w:bCs/>
-          <w:sz w:val="21"/>
-          <w:szCs w:val="21"/>
-        </w:rPr>
-        <w:t xml:space="preserve">Table </w:t>
-      </w:r>
-      <w:r>
-        <w:rPr>
-          <w:b/>
-          <w:bCs/>
-          <w:sz w:val="21"/>
-          <w:szCs w:val="21"/>
-        </w:rPr>
-        <w:fldChar w:fldCharType="begin"/>
-      </w:r>
-      <w:r>
-        <w:rPr>
-          <w:b/>
-          <w:bCs/>
-          <w:sz w:val="21"/>
-          <w:szCs w:val="21"/>
-        </w:rPr>
-        <w:instrText xml:space="preserve"> SEQ Table \* ARABIC </w:instrText>
-      </w:r>
-      <w:r>
-        <w:rPr>
-          <w:b/>
-          <w:bCs/>
-          <w:sz w:val="21"/>
-          <w:szCs w:val="21"/>
-        </w:rPr>
-        <w:fldChar w:fldCharType="separate"/>
-      </w:r>
-      <w:r>
-        <w:rPr>
-          <w:b/>
-          <w:bCs/>
-          <w:noProof/>
-          <w:sz w:val="21"/>
-          <w:szCs w:val="21"/>
-        </w:rPr>
-        <w:t>3</w:t>
-      </w:r>
-      <w:r>
-        <w:rPr>
-          <w:b/>
-          <w:bCs/>
-          <w:sz w:val="21"/>
-          <w:szCs w:val="21"/>
-        </w:rPr>
-        <w:fldChar w:fldCharType="end"/>
-      </w:r>
-      <w:bookmarkEnd w:id="6"/>
-      <w:r>
-        <w:rPr>
-          <w:sz w:val="21"/>
-          <w:szCs w:val="21"/>
-        </w:rPr>
-        <w:t xml:space="preserve">. Piece-wise linear mixed-effects models describing diurnal patterns of DHEA and cortisol </w:t>
-      </w:r>
-      <w:r>
-        <w:rPr>
-          <w:sz w:val="21"/>
-          <w:szCs w:val="21"/>
-        </w:rPr>
-        <w:t>levels</w:t>
-      </w:r>
-      <w:r>
-        <w:rPr>
-          <w:sz w:val="21"/>
-          <w:szCs w:val="21"/>
-        </w:rPr>
-        <w:t>.</w:t>
-      </w:r>
-      <w:r>
-        <w:rPr>
-          <w:sz w:val="21"/>
-          <w:szCs w:val="21"/>
-        </w:rPr>
-        <w:t xml:space="preserve"> Models included a knot at 30 minutes post waking to estimate the initial post-waking change and the subsequent rate of change over the remainder of the day, with subject-specific random intercepts accounting for repeated measures. Exponentiated coefficients represent multiplicative changes in concentration </w:t>
-      </w:r>
-      <w:r>
-        <w:rPr>
-          <w:sz w:val="21"/>
-          <w:szCs w:val="21"/>
-        </w:rPr>
-        <w:t xml:space="preserve">levels </w:t>
-      </w:r>
-      <w:r>
-        <w:rPr>
-          <w:sz w:val="21"/>
-          <w:szCs w:val="21"/>
-        </w:rPr>
-        <w:t>per minute within each time segment.</w:t>
-      </w:r>
-    </w:p>
-    <w:p>
-      <w:pPr>
-        <w:spacing w:line="480" w:lineRule="auto"/>
-      </w:pPr>
-    </w:p>
-    <w:p>
-      <w:pPr>
-        <w:spacing w:line="480" w:lineRule="auto"/>
-      </w:pPr>
-      <w:r>
-        <w:rPr>
-          <w:color w:val="000000" w:themeColor="text1"/>
-        </w:rPr>
-        <w:t xml:space="preserve"> (</w:t>
-      </w:r>
-      <w:r>
-        <w:rPr>
-          <w:color w:val="000000" w:themeColor="text1"/>
-        </w:rPr>
-        <w:fldChar w:fldCharType="begin"/>
-      </w:r>
-      <w:r>
-        <w:rPr>
-          <w:color w:val="000000" w:themeColor="text1"/>
-        </w:rPr>
-        <w:instrText xml:space="preserve"> REF _Ref220680029 \h </w:instrText>
-      </w:r>
-      <w:r>
-        <w:rPr>
-          <w:color w:val="000000" w:themeColor="text1"/>
-        </w:rPr>
-      </w:r>
-      <w:r>
-        <w:rPr>
-          <w:color w:val="000000" w:themeColor="text1"/>
-        </w:rPr>
-        <w:fldChar w:fldCharType="separate"/>
-      </w:r>
-      <w:r>
-        <w:rPr>
-          <w:b/>
-          <w:bCs/>
-          <w:sz w:val="21"/>
-          <w:szCs w:val="21"/>
-        </w:rPr>
-        <w:t xml:space="preserve">Table </w:t>
-      </w:r>
-      <w:r>
-        <w:rPr>
-          <w:b/>
-          <w:bCs/>
-          <w:noProof/>
-          <w:sz w:val="21"/>
-          <w:szCs w:val="21"/>
-        </w:rPr>
-        <w:t>3</w:t>
-      </w:r>
-      <w:r>
-        <w:rPr>
-          <w:color w:val="000000" w:themeColor="text1"/>
-        </w:rPr>
-        <w:fldChar w:fldCharType="end"/>
-      </w:r>
-      <w:r>
-        <w:rPr>
-          <w:color w:val="000000" w:themeColor="text1"/>
-        </w:rPr>
-        <w:t>)</w:t>
-      </w:r>
-      <w:r>
-        <w:rPr>
-          <w:color w:val="000000" w:themeColor="text1"/>
-        </w:rPr>
-        <w:t>.</w:t>
-      </w:r>
     </w:p>
     <w:p>
       <w:pPr>
         <w:pStyle w:val="Heading2"/>
       </w:pPr>
-      <w:bookmarkStart w:id="7" w:name="_Toc221022976"/>
-      <w:r>
-        <w:t>Discussion</w:t>
+      <w:bookmarkStart w:id="7" w:name="_Toc221022977"/>
+      <w:r>
+        <w:t>References</w:t>
       </w:r>
       <w:bookmarkEnd w:id="7"/>
     </w:p>
     <w:p>
       <w:pPr>
-        <w:spacing w:line="480" w:lineRule="auto"/>
-      </w:pPr>
-    </w:p>
-    <w:p>
-      <w:pPr>
-        <w:pStyle w:val="Heading2"/>
-      </w:pPr>
-      <w:bookmarkStart w:id="8" w:name="_Toc221022977"/>
-      <w:r>
-        <w:t>References</w:t>
-      </w:r>
-      <w:bookmarkEnd w:id="8"/>
-    </w:p>
-    <w:p>
-      <w:pPr>
         <w:rPr>
           <w:color w:val="000000" w:themeColor="text1"/>
         </w:rPr>
@@ -2213,7 +3969,7 @@
         </w:rPr>
         <w:t xml:space="preserve"> vignette). CRAN. </w:t>
       </w:r>
-      <w:hyperlink r:id="rId7" w:tgtFrame="_new" w:history="1">
+      <w:hyperlink r:id="rId9" w:tgtFrame="_new" w:history="1">
         <w:r>
           <w:rPr>
             <w:color w:val="000000" w:themeColor="text1"/>
@@ -2248,7 +4004,7 @@
         </w:rPr>
         <w:t>(4), 301–322. </w:t>
       </w:r>
-      <w:hyperlink r:id="rId8" w:history="1">
+      <w:hyperlink r:id="rId10" w:history="1">
         <w:r>
           <w:rPr>
             <w:rStyle w:val="Hyperlink"/>
@@ -2258,11 +4014,6 @@
       </w:hyperlink>
     </w:p>
     <w:p>
-      <w:pPr>
-        <w:rPr>
-          <w:color w:val="000000" w:themeColor="text1"/>
-        </w:rPr>
-      </w:pPr>
       <w:proofErr w:type="spellStart"/>
       <w:r>
         <w:rPr>
@@ -2291,7 +4042,7 @@
         </w:rPr>
         <w:t>(8), 1463–1465. </w:t>
       </w:r>
-      <w:hyperlink r:id="rId9" w:tgtFrame="_new" w:history="1">
+      <w:hyperlink r:id="rId11" w:tgtFrame="_new" w:history="1">
         <w:r>
           <w:rPr>
             <w:rStyle w:val="Hyperlink"/>
@@ -2306,37 +4057,339 @@
           <w:color w:val="000000" w:themeColor="text1"/>
         </w:rPr>
       </w:pPr>
-    </w:p>
-    <w:p>
-      <w:pPr>
-        <w:pStyle w:val="Heading2"/>
-      </w:pPr>
-      <w:bookmarkStart w:id="9" w:name="_Toc221022978"/>
-      <w:r>
-        <w:t>Reproducibility Statement</w:t>
-      </w:r>
-      <w:bookmarkEnd w:id="9"/>
-    </w:p>
-    <w:p>
-      <w:r>
-        <w:t xml:space="preserve">The statistical code used in this analysis is available </w:t>
-      </w:r>
-      <w:r>
-        <w:t>on my GitHub under the Code directory at</w:t>
-      </w:r>
-      <w:r>
-        <w:t xml:space="preserve">: </w:t>
-      </w:r>
-      <w:hyperlink r:id="rId10" w:history="1">
+      <w:r>
+        <w:rPr>
+          <w:color w:val="000000" w:themeColor="text1"/>
+        </w:rPr>
+        <w:t>Statistical Inference at WIS. (n.d.).</w:t>
+      </w:r>
+      <w:r>
+        <w:rPr>
+          <w:rFonts w:eastAsiaTheme="majorEastAsia"/>
+          <w:color w:val="000000" w:themeColor="text1"/>
+        </w:rPr>
+        <w:t> </w:t>
+      </w:r>
+      <w:r>
+        <w:rPr>
+          <w:rFonts w:eastAsiaTheme="majorEastAsia"/>
+          <w:i/>
+          <w:iCs/>
+          <w:color w:val="000000" w:themeColor="text1"/>
+        </w:rPr>
+        <w:t>Model comparison in practice</w:t>
+      </w:r>
+      <w:r>
+        <w:rPr>
+          <w:color w:val="000000" w:themeColor="text1"/>
+        </w:rPr>
+        <w:t>.</w:t>
+      </w:r>
+      <w:r>
+        <w:rPr>
+          <w:rFonts w:eastAsiaTheme="majorEastAsia"/>
+          <w:color w:val="000000" w:themeColor="text1"/>
+        </w:rPr>
+        <w:t> </w:t>
+      </w:r>
+      <w:hyperlink r:id="rId12" w:tgtFrame="_new" w:history="1">
+        <w:r>
+          <w:rPr>
+            <w:rStyle w:val="Hyperlink"/>
+            <w:rFonts w:eastAsiaTheme="majorEastAsia"/>
+          </w:rPr>
+          <w:t>https://wis-stats.github.io/lessons/model_assessment/model_comparison_in_practice.html</w:t>
+        </w:r>
+      </w:hyperlink>
+    </w:p>
+    <w:p>
+      <w:pPr>
+        <w:rPr>
+          <w:color w:val="000000" w:themeColor="text1"/>
+        </w:rPr>
+      </w:pPr>
+      <w:r>
+        <w:rPr>
+          <w:color w:val="000000" w:themeColor="text1"/>
+        </w:rPr>
+        <w:t>Clark, M. (n.d.).</w:t>
+      </w:r>
+      <w:r>
+        <w:rPr>
+          <w:rFonts w:eastAsiaTheme="majorEastAsia"/>
+          <w:color w:val="000000" w:themeColor="text1"/>
+        </w:rPr>
+        <w:t> </w:t>
+      </w:r>
+      <w:r>
+        <w:rPr>
+          <w:rFonts w:eastAsiaTheme="majorEastAsia"/>
+          <w:i/>
+          <w:iCs/>
+          <w:color w:val="000000" w:themeColor="text1"/>
+        </w:rPr>
+        <w:t>Model diagnostics</w:t>
+      </w:r>
+      <w:r>
+        <w:rPr>
+          <w:color w:val="000000" w:themeColor="text1"/>
+        </w:rPr>
+        <w:t>.</w:t>
+      </w:r>
+      <w:r>
+        <w:rPr>
+          <w:rFonts w:eastAsiaTheme="majorEastAsia"/>
+          <w:color w:val="000000" w:themeColor="text1"/>
+        </w:rPr>
+        <w:t> </w:t>
+      </w:r>
+      <w:r>
+        <w:rPr>
+          <w:rFonts w:eastAsiaTheme="majorEastAsia"/>
+          <w:i/>
+          <w:iCs/>
+          <w:color w:val="000000" w:themeColor="text1"/>
+        </w:rPr>
+        <w:t>Easy Bayes</w:t>
+      </w:r>
+      <w:r>
+        <w:rPr>
+          <w:color w:val="000000" w:themeColor="text1"/>
+        </w:rPr>
+        <w:t>.</w:t>
+      </w:r>
+      <w:r>
+        <w:rPr>
+          <w:rFonts w:eastAsiaTheme="majorEastAsia"/>
+          <w:color w:val="000000" w:themeColor="text1"/>
+        </w:rPr>
+        <w:t> </w:t>
+      </w:r>
+      <w:hyperlink r:id="rId13" w:tgtFrame="_new" w:history="1">
+        <w:r>
+          <w:rPr>
+            <w:rStyle w:val="Hyperlink"/>
+            <w:rFonts w:eastAsiaTheme="majorEastAsia"/>
+          </w:rPr>
+          <w:t>https://m-clark.github.io/easy-bayes/model-diagnostics.html</w:t>
+        </w:r>
+      </w:hyperlink>
+    </w:p>
+    <w:p>
+      <w:pPr>
+        <w:rPr>
+          <w:color w:val="000000" w:themeColor="text1"/>
+        </w:rPr>
+      </w:pPr>
+      <w:r>
+        <w:rPr>
+          <w:color w:val="000000" w:themeColor="text1"/>
+        </w:rPr>
+        <w:t xml:space="preserve">He, M. (n.d.). </w:t>
+      </w:r>
+      <w:r>
+        <w:rPr>
+          <w:i/>
+          <w:iCs/>
+          <w:color w:val="000000" w:themeColor="text1"/>
+        </w:rPr>
+        <w:t>Model diagnostics</w:t>
+      </w:r>
+      <w:r>
+        <w:rPr>
+          <w:color w:val="000000" w:themeColor="text1"/>
+        </w:rPr>
+        <w:t xml:space="preserve">. In </w:t>
+      </w:r>
+      <w:r>
+        <w:rPr>
+          <w:i/>
+          <w:iCs/>
+          <w:color w:val="000000" w:themeColor="text1"/>
+        </w:rPr>
+        <w:t>Course handouts for Bayesian data analysis class</w:t>
+      </w:r>
+      <w:r>
+        <w:rPr>
+          <w:color w:val="000000" w:themeColor="text1"/>
+        </w:rPr>
+        <w:t xml:space="preserve">. </w:t>
+      </w:r>
+      <w:hyperlink r:id="rId14" w:history="1">
         <w:r>
           <w:rPr>
             <w:rStyle w:val="Hyperlink"/>
           </w:rPr>
-          <w:t>https://github.com/rysummers/BIOS6624-Class/tree/main/Project0</w:t>
+          <w:t>https://bookdown.org/marklhc/notes_bookdown/model-diagnostics.html</w:t>
         </w:r>
       </w:hyperlink>
     </w:p>
     <w:p>
+      <w:pPr>
+        <w:spacing w:after="160" w:line="278" w:lineRule="auto"/>
+        <w:rPr>
+          <w:color w:val="000000" w:themeColor="text1"/>
+        </w:rPr>
+      </w:pPr>
+      <w:r>
+        <w:rPr>
+          <w:color w:val="000000" w:themeColor="text1"/>
+        </w:rPr>
+        <w:lastRenderedPageBreak/>
+        <w:t xml:space="preserve">Makowski, D., </w:t>
+      </w:r>
+      <w:proofErr w:type="spellStart"/>
+      <w:r>
+        <w:rPr>
+          <w:color w:val="000000" w:themeColor="text1"/>
+        </w:rPr>
+        <w:t>Lüdecke</w:t>
+      </w:r>
+      <w:proofErr w:type="spellEnd"/>
+      <w:r>
+        <w:rPr>
+          <w:color w:val="000000" w:themeColor="text1"/>
+        </w:rPr>
+        <w:t xml:space="preserve">, D., Ben-Shachar, M. S., Patil, I., Wilson, M. K., &amp; Wiernik, B. M. (n.d.). </w:t>
+      </w:r>
+      <w:r>
+        <w:rPr>
+          <w:i/>
+          <w:iCs/>
+          <w:color w:val="000000" w:themeColor="text1"/>
+        </w:rPr>
+        <w:t xml:space="preserve">Sequential Effect </w:t>
+      </w:r>
+      <w:proofErr w:type="spellStart"/>
+      <w:r>
+        <w:rPr>
+          <w:i/>
+          <w:iCs/>
+          <w:color w:val="000000" w:themeColor="text1"/>
+        </w:rPr>
+        <w:t>eXistence</w:t>
+      </w:r>
+      <w:proofErr w:type="spellEnd"/>
+      <w:r>
+        <w:rPr>
+          <w:i/>
+          <w:iCs/>
+          <w:color w:val="000000" w:themeColor="text1"/>
+        </w:rPr>
+        <w:t xml:space="preserve"> and </w:t>
+      </w:r>
+      <w:proofErr w:type="spellStart"/>
+      <w:r>
+        <w:rPr>
+          <w:i/>
+          <w:iCs/>
+          <w:color w:val="000000" w:themeColor="text1"/>
+        </w:rPr>
+        <w:t>sIgnificance</w:t>
+      </w:r>
+      <w:proofErr w:type="spellEnd"/>
+      <w:r>
+        <w:rPr>
+          <w:i/>
+          <w:iCs/>
+          <w:color w:val="000000" w:themeColor="text1"/>
+        </w:rPr>
+        <w:t xml:space="preserve"> Testing (SEXIT)</w:t>
+      </w:r>
+      <w:r>
+        <w:rPr>
+          <w:color w:val="000000" w:themeColor="text1"/>
+        </w:rPr>
+        <w:t xml:space="preserve">. </w:t>
+      </w:r>
+      <w:proofErr w:type="spellStart"/>
+      <w:r>
+        <w:rPr>
+          <w:rFonts w:eastAsiaTheme="majorEastAsia"/>
+          <w:color w:val="000000" w:themeColor="text1"/>
+        </w:rPr>
+        <w:t>bayestestR</w:t>
+      </w:r>
+      <w:proofErr w:type="spellEnd"/>
+      <w:r>
+        <w:rPr>
+          <w:color w:val="000000" w:themeColor="text1"/>
+        </w:rPr>
+        <w:t xml:space="preserve">. </w:t>
+      </w:r>
+      <w:hyperlink r:id="rId15" w:history="1">
+        <w:r>
+          <w:rPr>
+            <w:rStyle w:val="Hyperlink"/>
+          </w:rPr>
+          <w:t>https://easystats.github.io/bayestestR/reference/sexit.html</w:t>
+        </w:r>
+      </w:hyperlink>
+    </w:p>
+    <w:p>
+      <w:pPr>
+        <w:spacing w:after="160" w:line="278" w:lineRule="auto"/>
+        <w:rPr>
+          <w:color w:val="000000" w:themeColor="text1"/>
+        </w:rPr>
+      </w:pPr>
+    </w:p>
+    <w:p>
+      <w:pPr>
+        <w:rPr>
+          <w:color w:val="000000" w:themeColor="text1"/>
+        </w:rPr>
+      </w:pPr>
+    </w:p>
+    <w:p>
+      <w:pPr>
+        <w:rPr>
+          <w:color w:val="000000" w:themeColor="text1"/>
+        </w:rPr>
+      </w:pPr>
+    </w:p>
+    <w:p>
+      <w:pPr>
+        <w:pStyle w:val="Heading2"/>
+      </w:pPr>
+      <w:bookmarkStart w:id="8" w:name="_Toc221022978"/>
+      <w:r>
+        <w:t>Reproducibility Statement</w:t>
+      </w:r>
+      <w:bookmarkEnd w:id="8"/>
+    </w:p>
+    <w:p>
+      <w:r>
+        <w:t xml:space="preserve">The statistical code used in this analysis is available </w:t>
+      </w:r>
+      <w:r>
+        <w:t>on my GitHub under the Code directory at</w:t>
+      </w:r>
+      <w:r>
+        <w:t xml:space="preserve">: </w:t>
+      </w:r>
+      <w:hyperlink r:id="rId16" w:history="1">
+        <w:r>
+          <w:rPr>
+            <w:rStyle w:val="Hyperlink"/>
+          </w:rPr>
+          <w:t>https://github.com/rysummers/BIOS6624-Class/tr</w:t>
+        </w:r>
+        <w:r>
+          <w:rPr>
+            <w:rStyle w:val="Hyperlink"/>
+          </w:rPr>
+          <w:t>e</w:t>
+        </w:r>
+        <w:r>
+          <w:rPr>
+            <w:rStyle w:val="Hyperlink"/>
+          </w:rPr>
+          <w:t>e/main/Project1</w:t>
+        </w:r>
+      </w:hyperlink>
+    </w:p>
+    <w:p>
       <w:r>
         <w:t>Raw data are not tracked in this repository</w:t>
       </w:r>
@@ -2346,7 +4399,6 @@
     </w:p>
     <w:p>
       <w:r>
-        <w:lastRenderedPageBreak/>
         <w:t xml:space="preserve">Link to data on local drive: </w:t>
       </w:r>
       <w:r>
@@ -3408,6 +5460,15 @@
   <w:style w:type="paragraph" w:default="1" w:styleId="Normal">
     <w:name w:val="Normal"/>
     <w:qFormat/>
+    <w:rsid w:val="00BA2BDE"/>
+    <w:pPr>
+      <w:spacing w:after="0" w:line="240" w:lineRule="auto"/>
+    </w:pPr>
+    <w:rPr>
+      <w:rFonts w:ascii="Times New Roman" w:eastAsia="Times New Roman" w:hAnsi="Times New Roman" w:cs="Times New Roman"/>
+      <w:kern w:val="0"/>
+      <w14:ligatures w14:val="none"/>
+    </w:rPr>
   </w:style>
   <w:style w:type="paragraph" w:styleId="Heading1">
     <w:name w:val="heading 1"/>
@@ -3420,14 +5481,16 @@
     <w:pPr>
       <w:keepNext/>
       <w:keepLines/>
-      <w:spacing w:before="360" w:after="80"/>
+      <w:spacing w:before="360" w:after="80" w:line="278" w:lineRule="auto"/>
       <w:outlineLvl w:val="0"/>
     </w:pPr>
     <w:rPr>
       <w:rFonts w:asciiTheme="majorHAnsi" w:eastAsiaTheme="majorEastAsia" w:hAnsiTheme="majorHAnsi" w:cstheme="majorBidi"/>
       <w:color w:val="0F4761" w:themeColor="accent1" w:themeShade="BF"/>
+      <w:kern w:val="2"/>
       <w:sz w:val="40"/>
       <w:szCs w:val="40"/>
+      <w14:ligatures w14:val="standardContextual"/>
     </w:rPr>
   </w:style>
   <w:style w:type="paragraph" w:styleId="Heading2">
@@ -3442,14 +5505,16 @@
     <w:pPr>
       <w:keepNext/>
       <w:keepLines/>
-      <w:spacing w:before="160" w:after="80"/>
+      <w:spacing w:before="160" w:after="80" w:line="278" w:lineRule="auto"/>
       <w:outlineLvl w:val="1"/>
     </w:pPr>
     <w:rPr>
       <w:rFonts w:asciiTheme="majorHAnsi" w:eastAsiaTheme="majorEastAsia" w:hAnsiTheme="majorHAnsi" w:cstheme="majorBidi"/>
       <w:color w:val="0F4761" w:themeColor="accent1" w:themeShade="BF"/>
+      <w:kern w:val="2"/>
       <w:sz w:val="32"/>
       <w:szCs w:val="32"/>
+      <w14:ligatures w14:val="standardContextual"/>
     </w:rPr>
   </w:style>
   <w:style w:type="paragraph" w:styleId="Heading3">
@@ -3464,14 +5529,16 @@
     <w:pPr>
       <w:keepNext/>
       <w:keepLines/>
-      <w:spacing w:before="160" w:after="80"/>
+      <w:spacing w:before="160" w:after="80" w:line="278" w:lineRule="auto"/>
       <w:outlineLvl w:val="2"/>
     </w:pPr>
     <w:rPr>
-      <w:rFonts w:eastAsiaTheme="majorEastAsia" w:cstheme="majorBidi"/>
+      <w:rFonts w:asciiTheme="minorHAnsi" w:eastAsiaTheme="majorEastAsia" w:hAnsiTheme="minorHAnsi" w:cstheme="majorBidi"/>
       <w:color w:val="0F4761" w:themeColor="accent1" w:themeShade="BF"/>
+      <w:kern w:val="2"/>
       <w:sz w:val="28"/>
       <w:szCs w:val="28"/>
+      <w14:ligatures w14:val="standardContextual"/>
     </w:rPr>
   </w:style>
   <w:style w:type="paragraph" w:styleId="Heading4">
@@ -3486,14 +5553,16 @@
     <w:pPr>
       <w:keepNext/>
       <w:keepLines/>
-      <w:spacing w:before="80" w:after="40"/>
+      <w:spacing w:before="80" w:after="40" w:line="278" w:lineRule="auto"/>
       <w:outlineLvl w:val="3"/>
     </w:pPr>
     <w:rPr>
-      <w:rFonts w:eastAsiaTheme="majorEastAsia" w:cstheme="majorBidi"/>
+      <w:rFonts w:asciiTheme="minorHAnsi" w:eastAsiaTheme="majorEastAsia" w:hAnsiTheme="minorHAnsi" w:cstheme="majorBidi"/>
       <w:i/>
       <w:iCs/>
       <w:color w:val="0F4761" w:themeColor="accent1" w:themeShade="BF"/>
+      <w:kern w:val="2"/>
+      <w14:ligatures w14:val="standardContextual"/>
     </w:rPr>
   </w:style>
   <w:style w:type="paragraph" w:styleId="Heading5">
@@ -3509,12 +5578,14 @@
     <w:pPr>
       <w:keepNext/>
       <w:keepLines/>
-      <w:spacing w:before="80" w:after="40"/>
+      <w:spacing w:before="80" w:after="40" w:line="278" w:lineRule="auto"/>
       <w:outlineLvl w:val="4"/>
     </w:pPr>
     <w:rPr>
-      <w:rFonts w:eastAsiaTheme="majorEastAsia" w:cstheme="majorBidi"/>
+      <w:rFonts w:asciiTheme="minorHAnsi" w:eastAsiaTheme="majorEastAsia" w:hAnsiTheme="minorHAnsi" w:cstheme="majorBidi"/>
       <w:color w:val="0F4761" w:themeColor="accent1" w:themeShade="BF"/>
+      <w:kern w:val="2"/>
+      <w14:ligatures w14:val="standardContextual"/>
     </w:rPr>
   </w:style>
   <w:style w:type="paragraph" w:styleId="Heading6">
@@ -3530,14 +5601,16 @@
     <w:pPr>
       <w:keepNext/>
       <w:keepLines/>
-      <w:spacing w:before="40" w:after="0"/>
+      <w:spacing w:before="40" w:line="278" w:lineRule="auto"/>
       <w:outlineLvl w:val="5"/>
     </w:pPr>
     <w:rPr>
-      <w:rFonts w:eastAsiaTheme="majorEastAsia" w:cstheme="majorBidi"/>
+      <w:rFonts w:asciiTheme="minorHAnsi" w:eastAsiaTheme="majorEastAsia" w:hAnsiTheme="minorHAnsi" w:cstheme="majorBidi"/>
       <w:i/>
       <w:iCs/>
       <w:color w:val="595959" w:themeColor="text1" w:themeTint="A6"/>
+      <w:kern w:val="2"/>
+      <w14:ligatures w14:val="standardContextual"/>
     </w:rPr>
   </w:style>
   <w:style w:type="paragraph" w:styleId="Heading7">
@@ -3553,12 +5626,14 @@
     <w:pPr>
       <w:keepNext/>
       <w:keepLines/>
-      <w:spacing w:before="40" w:after="0"/>
+      <w:spacing w:before="40" w:line="278" w:lineRule="auto"/>
       <w:outlineLvl w:val="6"/>
     </w:pPr>
     <w:rPr>
-      <w:rFonts w:eastAsiaTheme="majorEastAsia" w:cstheme="majorBidi"/>
+      <w:rFonts w:asciiTheme="minorHAnsi" w:eastAsiaTheme="majorEastAsia" w:hAnsiTheme="minorHAnsi" w:cstheme="majorBidi"/>
       <w:color w:val="595959" w:themeColor="text1" w:themeTint="A6"/>
+      <w:kern w:val="2"/>
+      <w14:ligatures w14:val="standardContextual"/>
     </w:rPr>
   </w:style>
   <w:style w:type="paragraph" w:styleId="Heading8">
@@ -3574,14 +5649,16 @@
     <w:pPr>
       <w:keepNext/>
       <w:keepLines/>
-      <w:spacing w:after="0"/>
+      <w:spacing w:line="278" w:lineRule="auto"/>
       <w:outlineLvl w:val="7"/>
     </w:pPr>
     <w:rPr>
-      <w:rFonts w:eastAsiaTheme="majorEastAsia" w:cstheme="majorBidi"/>
+      <w:rFonts w:asciiTheme="minorHAnsi" w:eastAsiaTheme="majorEastAsia" w:hAnsiTheme="minorHAnsi" w:cstheme="majorBidi"/>
       <w:i/>
       <w:iCs/>
       <w:color w:val="272727" w:themeColor="text1" w:themeTint="D8"/>
+      <w:kern w:val="2"/>
+      <w14:ligatures w14:val="standardContextual"/>
     </w:rPr>
   </w:style>
   <w:style w:type="paragraph" w:styleId="Heading9">
@@ -3597,12 +5674,14 @@
     <w:pPr>
       <w:keepNext/>
       <w:keepLines/>
-      <w:spacing w:after="0"/>
+      <w:spacing w:line="278" w:lineRule="auto"/>
       <w:outlineLvl w:val="8"/>
     </w:pPr>
     <w:rPr>
-      <w:rFonts w:eastAsiaTheme="majorEastAsia" w:cstheme="majorBidi"/>
+      <w:rFonts w:asciiTheme="minorHAnsi" w:eastAsiaTheme="majorEastAsia" w:hAnsiTheme="minorHAnsi" w:cstheme="majorBidi"/>
       <w:color w:val="272727" w:themeColor="text1" w:themeTint="D8"/>
+      <w:kern w:val="2"/>
+      <w14:ligatures w14:val="standardContextual"/>
     </w:rPr>
   </w:style>
   <w:style w:type="character" w:default="1" w:styleId="DefaultParagraphFont">
@@ -3756,7 +5835,7 @@
     <w:qFormat/>
     <w:rsid w:val="00FB74D0"/>
     <w:pPr>
-      <w:spacing w:after="80" w:line="240" w:lineRule="auto"/>
+      <w:spacing w:after="80"/>
       <w:contextualSpacing/>
     </w:pPr>
     <w:rPr>
@@ -3765,6 +5844,7 @@
       <w:kern w:val="28"/>
       <w:sz w:val="56"/>
       <w:szCs w:val="56"/>
+      <w14:ligatures w14:val="standardContextual"/>
     </w:rPr>
   </w:style>
   <w:style w:type="character" w:customStyle="1" w:styleId="TitleChar">
@@ -3793,13 +5873,16 @@
       <w:numPr>
         <w:ilvl w:val="1"/>
       </w:numPr>
+      <w:spacing w:after="160" w:line="278" w:lineRule="auto"/>
     </w:pPr>
     <w:rPr>
-      <w:rFonts w:eastAsiaTheme="majorEastAsia" w:cstheme="majorBidi"/>
+      <w:rFonts w:asciiTheme="minorHAnsi" w:eastAsiaTheme="majorEastAsia" w:hAnsiTheme="minorHAnsi" w:cstheme="majorBidi"/>
       <w:color w:val="595959" w:themeColor="text1" w:themeTint="A6"/>
       <w:spacing w:val="15"/>
+      <w:kern w:val="2"/>
       <w:sz w:val="28"/>
       <w:szCs w:val="28"/>
+      <w14:ligatures w14:val="standardContextual"/>
     </w:rPr>
   </w:style>
   <w:style w:type="character" w:customStyle="1" w:styleId="SubtitleChar">
@@ -3825,13 +5908,16 @@
     <w:qFormat/>
     <w:rsid w:val="00FB74D0"/>
     <w:pPr>
-      <w:spacing w:before="160"/>
+      <w:spacing w:before="160" w:after="160" w:line="278" w:lineRule="auto"/>
       <w:jc w:val="center"/>
     </w:pPr>
     <w:rPr>
+      <w:rFonts w:asciiTheme="minorHAnsi" w:eastAsiaTheme="minorHAnsi" w:hAnsiTheme="minorHAnsi" w:cstheme="minorBidi"/>
       <w:i/>
       <w:iCs/>
       <w:color w:val="404040" w:themeColor="text1" w:themeTint="BF"/>
+      <w:kern w:val="2"/>
+      <w14:ligatures w14:val="standardContextual"/>
     </w:rPr>
   </w:style>
   <w:style w:type="character" w:customStyle="1" w:styleId="QuoteChar">
@@ -3853,9 +5939,15 @@
     <w:qFormat/>
     <w:rsid w:val="00FB74D0"/>
     <w:pPr>
+      <w:spacing w:after="160" w:line="278" w:lineRule="auto"/>
       <w:ind w:left="720"/>
       <w:contextualSpacing/>
     </w:pPr>
+    <w:rPr>
+      <w:rFonts w:asciiTheme="minorHAnsi" w:eastAsiaTheme="minorHAnsi" w:hAnsiTheme="minorHAnsi" w:cstheme="minorBidi"/>
+      <w:kern w:val="2"/>
+      <w14:ligatures w14:val="standardContextual"/>
+    </w:rPr>
   </w:style>
   <w:style w:type="character" w:styleId="IntenseEmphasis">
     <w:name w:val="Intense Emphasis"/>
@@ -3882,14 +5974,17 @@
         <w:top w:val="single" w:sz="4" w:space="10" w:color="0F4761" w:themeColor="accent1" w:themeShade="BF"/>
         <w:bottom w:val="single" w:sz="4" w:space="10" w:color="0F4761" w:themeColor="accent1" w:themeShade="BF"/>
       </w:pBdr>
-      <w:spacing w:before="360" w:after="360"/>
+      <w:spacing w:before="360" w:after="360" w:line="278" w:lineRule="auto"/>
       <w:ind w:left="864" w:right="864"/>
       <w:jc w:val="center"/>
     </w:pPr>
     <w:rPr>
+      <w:rFonts w:asciiTheme="minorHAnsi" w:eastAsiaTheme="minorHAnsi" w:hAnsiTheme="minorHAnsi" w:cstheme="minorBidi"/>
       <w:i/>
       <w:iCs/>
       <w:color w:val="0F4761" w:themeColor="accent1" w:themeShade="BF"/>
+      <w:kern w:val="2"/>
+      <w14:ligatures w14:val="standardContextual"/>
     </w:rPr>
   </w:style>
   <w:style w:type="character" w:customStyle="1" w:styleId="IntenseQuoteChar">
@@ -3926,13 +6021,8 @@
     <w:unhideWhenUsed/>
     <w:rsid w:val="006D1CA8"/>
     <w:pPr>
-      <w:spacing w:before="100" w:beforeAutospacing="1" w:after="100" w:afterAutospacing="1" w:line="240" w:lineRule="auto"/>
+      <w:spacing w:before="100" w:beforeAutospacing="1" w:after="100" w:afterAutospacing="1"/>
     </w:pPr>
-    <w:rPr>
-      <w:rFonts w:ascii="Times New Roman" w:eastAsia="Times New Roman" w:hAnsi="Times New Roman" w:cs="Times New Roman"/>
-      <w:kern w:val="0"/>
-      <w14:ligatures w14:val="none"/>
-    </w:rPr>
   </w:style>
   <w:style w:type="character" w:customStyle="1" w:styleId="apple-converted-space">
     <w:name w:val="apple-converted-space"/>
@@ -3972,14 +6062,17 @@
     <w:qFormat/>
     <w:rsid w:val="0002461F"/>
     <w:pPr>
-      <w:spacing w:after="200" w:line="240" w:lineRule="auto"/>
+      <w:spacing w:after="200"/>
     </w:pPr>
     <w:rPr>
+      <w:rFonts w:asciiTheme="minorHAnsi" w:eastAsiaTheme="minorHAnsi" w:hAnsiTheme="minorHAnsi" w:cstheme="minorBidi"/>
       <w:i/>
       <w:iCs/>
       <w:color w:val="0E2841" w:themeColor="text2"/>
+      <w:kern w:val="2"/>
       <w:sz w:val="18"/>
       <w:szCs w:val="18"/>
+      <w14:ligatures w14:val="standardContextual"/>
     </w:rPr>
   </w:style>
   <w:style w:type="character" w:styleId="PlaceholderText">
@@ -4050,14 +6143,17 @@
     <w:unhideWhenUsed/>
     <w:rsid w:val="00A65C67"/>
     <w:pPr>
-      <w:spacing w:before="120" w:after="0"/>
+      <w:spacing w:before="120" w:line="278" w:lineRule="auto"/>
       <w:ind w:left="240"/>
     </w:pPr>
     <w:rPr>
+      <w:rFonts w:asciiTheme="minorHAnsi" w:eastAsiaTheme="minorHAnsi" w:hAnsiTheme="minorHAnsi" w:cstheme="minorBidi"/>
       <w:b/>
       <w:bCs/>
+      <w:kern w:val="2"/>
       <w:sz w:val="22"/>
       <w:szCs w:val="22"/>
+      <w14:ligatures w14:val="standardContextual"/>
     </w:rPr>
   </w:style>
   <w:style w:type="paragraph" w:styleId="TOC1">
@@ -4070,13 +6166,16 @@
     <w:unhideWhenUsed/>
     <w:rsid w:val="00A65C67"/>
     <w:pPr>
-      <w:spacing w:before="120" w:after="0"/>
+      <w:spacing w:before="120" w:line="278" w:lineRule="auto"/>
     </w:pPr>
     <w:rPr>
+      <w:rFonts w:asciiTheme="minorHAnsi" w:eastAsiaTheme="minorHAnsi" w:hAnsiTheme="minorHAnsi" w:cstheme="minorBidi"/>
       <w:b/>
       <w:bCs/>
       <w:i/>
       <w:iCs/>
+      <w:kern w:val="2"/>
+      <w14:ligatures w14:val="standardContextual"/>
     </w:rPr>
   </w:style>
   <w:style w:type="paragraph" w:styleId="TOC3">
@@ -4089,12 +6188,15 @@
     <w:unhideWhenUsed/>
     <w:rsid w:val="00A65C67"/>
     <w:pPr>
-      <w:spacing w:after="0"/>
+      <w:spacing w:line="278" w:lineRule="auto"/>
       <w:ind w:left="480"/>
     </w:pPr>
     <w:rPr>
+      <w:rFonts w:asciiTheme="minorHAnsi" w:eastAsiaTheme="minorHAnsi" w:hAnsiTheme="minorHAnsi" w:cstheme="minorBidi"/>
+      <w:kern w:val="2"/>
       <w:sz w:val="20"/>
       <w:szCs w:val="20"/>
+      <w14:ligatures w14:val="standardContextual"/>
     </w:rPr>
   </w:style>
   <w:style w:type="paragraph" w:styleId="TOC4">
@@ -4107,12 +6209,15 @@
     <w:unhideWhenUsed/>
     <w:rsid w:val="00A65C67"/>
     <w:pPr>
-      <w:spacing w:after="0"/>
+      <w:spacing w:line="278" w:lineRule="auto"/>
       <w:ind w:left="720"/>
     </w:pPr>
     <w:rPr>
+      <w:rFonts w:asciiTheme="minorHAnsi" w:eastAsiaTheme="minorHAnsi" w:hAnsiTheme="minorHAnsi" w:cstheme="minorBidi"/>
+      <w:kern w:val="2"/>
       <w:sz w:val="20"/>
       <w:szCs w:val="20"/>
+      <w14:ligatures w14:val="standardContextual"/>
     </w:rPr>
   </w:style>
   <w:style w:type="paragraph" w:styleId="TOC5">
@@ -4125,12 +6230,15 @@
     <w:unhideWhenUsed/>
     <w:rsid w:val="00A65C67"/>
     <w:pPr>
-      <w:spacing w:after="0"/>
+      <w:spacing w:line="278" w:lineRule="auto"/>
       <w:ind w:left="960"/>
     </w:pPr>
     <w:rPr>
+      <w:rFonts w:asciiTheme="minorHAnsi" w:eastAsiaTheme="minorHAnsi" w:hAnsiTheme="minorHAnsi" w:cstheme="minorBidi"/>
+      <w:kern w:val="2"/>
       <w:sz w:val="20"/>
       <w:szCs w:val="20"/>
+      <w14:ligatures w14:val="standardContextual"/>
     </w:rPr>
   </w:style>
   <w:style w:type="paragraph" w:styleId="TOC6">
@@ -4143,12 +6251,15 @@
     <w:unhideWhenUsed/>
     <w:rsid w:val="00A65C67"/>
     <w:pPr>
-      <w:spacing w:after="0"/>
+      <w:spacing w:line="278" w:lineRule="auto"/>
       <w:ind w:left="1200"/>
     </w:pPr>
     <w:rPr>
+      <w:rFonts w:asciiTheme="minorHAnsi" w:eastAsiaTheme="minorHAnsi" w:hAnsiTheme="minorHAnsi" w:cstheme="minorBidi"/>
+      <w:kern w:val="2"/>
       <w:sz w:val="20"/>
       <w:szCs w:val="20"/>
+      <w14:ligatures w14:val="standardContextual"/>
     </w:rPr>
   </w:style>
   <w:style w:type="paragraph" w:styleId="TOC7">
@@ -4161,12 +6272,15 @@
     <w:unhideWhenUsed/>
     <w:rsid w:val="00A65C67"/>
     <w:pPr>
-      <w:spacing w:after="0"/>
+      <w:spacing w:line="278" w:lineRule="auto"/>
       <w:ind w:left="1440"/>
     </w:pPr>
     <w:rPr>
+      <w:rFonts w:asciiTheme="minorHAnsi" w:eastAsiaTheme="minorHAnsi" w:hAnsiTheme="minorHAnsi" w:cstheme="minorBidi"/>
+      <w:kern w:val="2"/>
       <w:sz w:val="20"/>
       <w:szCs w:val="20"/>
+      <w14:ligatures w14:val="standardContextual"/>
     </w:rPr>
   </w:style>
   <w:style w:type="paragraph" w:styleId="TOC8">
@@ -4179,12 +6293,15 @@
     <w:unhideWhenUsed/>
     <w:rsid w:val="00A65C67"/>
     <w:pPr>
-      <w:spacing w:after="0"/>
+      <w:spacing w:line="278" w:lineRule="auto"/>
       <w:ind w:left="1680"/>
     </w:pPr>
     <w:rPr>
+      <w:rFonts w:asciiTheme="minorHAnsi" w:eastAsiaTheme="minorHAnsi" w:hAnsiTheme="minorHAnsi" w:cstheme="minorBidi"/>
+      <w:kern w:val="2"/>
       <w:sz w:val="20"/>
       <w:szCs w:val="20"/>
+      <w14:ligatures w14:val="standardContextual"/>
     </w:rPr>
   </w:style>
   <w:style w:type="paragraph" w:styleId="TOC9">
@@ -4197,12 +6314,15 @@
     <w:unhideWhenUsed/>
     <w:rsid w:val="00A65C67"/>
     <w:pPr>
-      <w:spacing w:after="0"/>
+      <w:spacing w:line="278" w:lineRule="auto"/>
       <w:ind w:left="1920"/>
     </w:pPr>
     <w:rPr>
+      <w:rFonts w:asciiTheme="minorHAnsi" w:eastAsiaTheme="minorHAnsi" w:hAnsiTheme="minorHAnsi" w:cstheme="minorBidi"/>
+      <w:kern w:val="2"/>
       <w:sz w:val="20"/>
       <w:szCs w:val="20"/>
+      <w14:ligatures w14:val="standardContextual"/>
     </w:rPr>
   </w:style>
   <w:style w:type="paragraph" w:customStyle="1" w:styleId="p1">
@@ -4210,18 +6330,87 @@
     <w:basedOn w:val="Normal"/>
     <w:rsid w:val="00E36448"/>
     <w:pPr>
-      <w:spacing w:before="100" w:beforeAutospacing="1" w:after="100" w:afterAutospacing="1" w:line="240" w:lineRule="auto"/>
+      <w:spacing w:before="100" w:beforeAutospacing="1" w:after="100" w:afterAutospacing="1"/>
     </w:pPr>
-    <w:rPr>
-      <w:rFonts w:ascii="Times New Roman" w:eastAsia="Times New Roman" w:hAnsi="Times New Roman" w:cs="Times New Roman"/>
-      <w:kern w:val="0"/>
-      <w14:ligatures w14:val="none"/>
-    </w:rPr>
   </w:style>
   <w:style w:type="character" w:customStyle="1" w:styleId="s1">
     <w:name w:val="s1"/>
     <w:basedOn w:val="DefaultParagraphFont"/>
     <w:rsid w:val="00E36448"/>
+  </w:style>
+  <w:style w:type="character" w:styleId="FollowedHyperlink">
+    <w:name w:val="FollowedHyperlink"/>
+    <w:basedOn w:val="DefaultParagraphFont"/>
+    <w:uiPriority w:val="99"/>
+    <w:semiHidden/>
+    <w:unhideWhenUsed/>
+    <w:rsid w:val="00A165A5"/>
+    <w:rPr>
+      <w:color w:val="96607D" w:themeColor="followedHyperlink"/>
+      <w:u w:val="single"/>
+    </w:rPr>
+  </w:style>
+  <w:style w:type="paragraph" w:customStyle="1" w:styleId="p2">
+    <w:name w:val="p2"/>
+    <w:basedOn w:val="Normal"/>
+    <w:rsid w:val="00CA420F"/>
+    <w:pPr>
+      <w:spacing w:before="100" w:beforeAutospacing="1" w:after="100" w:afterAutospacing="1"/>
+    </w:pPr>
+  </w:style>
+  <w:style w:type="paragraph" w:styleId="HTMLPreformatted">
+    <w:name w:val="HTML Preformatted"/>
+    <w:basedOn w:val="Normal"/>
+    <w:link w:val="HTMLPreformattedChar"/>
+    <w:uiPriority w:val="99"/>
+    <w:semiHidden/>
+    <w:unhideWhenUsed/>
+    <w:rsid w:val="00DF528E"/>
+    <w:pPr>
+      <w:tabs>
+        <w:tab w:val="left" w:pos="916"/>
+        <w:tab w:val="left" w:pos="1832"/>
+        <w:tab w:val="left" w:pos="2748"/>
+        <w:tab w:val="left" w:pos="3664"/>
+        <w:tab w:val="left" w:pos="4580"/>
+        <w:tab w:val="left" w:pos="5496"/>
+        <w:tab w:val="left" w:pos="6412"/>
+        <w:tab w:val="left" w:pos="7328"/>
+        <w:tab w:val="left" w:pos="8244"/>
+        <w:tab w:val="left" w:pos="9160"/>
+        <w:tab w:val="left" w:pos="10076"/>
+        <w:tab w:val="left" w:pos="10992"/>
+        <w:tab w:val="left" w:pos="11908"/>
+        <w:tab w:val="left" w:pos="12824"/>
+        <w:tab w:val="left" w:pos="13740"/>
+        <w:tab w:val="left" w:pos="14656"/>
+      </w:tabs>
+    </w:pPr>
+    <w:rPr>
+      <w:rFonts w:ascii="Courier New" w:hAnsi="Courier New" w:cs="Courier New"/>
+      <w:sz w:val="20"/>
+      <w:szCs w:val="20"/>
+    </w:rPr>
+  </w:style>
+  <w:style w:type="character" w:customStyle="1" w:styleId="HTMLPreformattedChar">
+    <w:name w:val="HTML Preformatted Char"/>
+    <w:basedOn w:val="DefaultParagraphFont"/>
+    <w:link w:val="HTMLPreformatted"/>
+    <w:uiPriority w:val="99"/>
+    <w:semiHidden/>
+    <w:rsid w:val="00DF528E"/>
+    <w:rPr>
+      <w:rFonts w:ascii="Courier New" w:eastAsia="Times New Roman" w:hAnsi="Courier New" w:cs="Courier New"/>
+      <w:kern w:val="0"/>
+      <w:sz w:val="20"/>
+      <w:szCs w:val="20"/>
+      <w14:ligatures w14:val="none"/>
+    </w:rPr>
+  </w:style>
+  <w:style w:type="character" w:customStyle="1" w:styleId="gnj4oy0cpi">
+    <w:name w:val="gnj4oy0cpi"/>
+    <w:basedOn w:val="DefaultParagraphFont"/>
+    <w:rsid w:val="00DF528E"/>
   </w:style>
 </w:styles>
 </file>

</xml_diff>

<commit_message>
Final touches on final report, presentation slides, and code.
</commit_message>
<xml_diff>
--- a/Project1/Reports/Project1_Final_Report.docx
+++ b/Project1/Reports/Project1_Final_Report.docx
@@ -529,7 +529,7 @@
                 <w:noProof/>
                 <w:webHidden/>
               </w:rPr>
-              <w:t>13</w:t>
+              <w:t>14</w:t>
             </w:r>
             <w:r>
               <w:rPr>
@@ -617,7 +617,7 @@
                 <w:noProof/>
                 <w:webHidden/>
               </w:rPr>
-              <w:t>14</w:t>
+              <w:t>15</w:t>
             </w:r>
             <w:r>
               <w:rPr>
@@ -738,20 +738,34 @@
     </w:p>
     <w:p>
       <w:pPr>
-        <w:spacing w:line="480" w:lineRule="auto"/>
+        <w:spacing w:before="100" w:beforeAutospacing="1" w:after="100" w:afterAutospacing="1" w:line="480" w:lineRule="auto"/>
+      </w:pPr>
+      <w:r>
         <w:rPr>
           <w:rFonts w:eastAsiaTheme="minorHAnsi"/>
           <w:kern w:val="2"/>
           <w14:ligatures w14:val="standardContextual"/>
         </w:rPr>
-      </w:pPr>
+        <w:t xml:space="preserve">The data for this project comes from the Multicenter AIDS Cohort Study (MACS), which is an ongoing prospective cohort study of HIV-1 infection in homosexual and bisexual men in four major U.S. cities. </w:t>
+      </w:r>
       <w:r>
         <w:rPr>
           <w:rFonts w:eastAsiaTheme="minorHAnsi"/>
           <w:kern w:val="2"/>
           <w14:ligatures w14:val="standardContextual"/>
         </w:rPr>
-        <w:t xml:space="preserve">The data for this project comes from the Multicenter AIDS Cohort Study (MACS), which is an ongoing prospective cohort study of HIV-1 infection in homosexual and bisexual men in four major U.S. cities. </w:t>
+        <w:t xml:space="preserve">The dataset contains up to 8 years of annual follow-up on 715 HIV-infected men after initiating HAART (highly active antiretroviral therapy), including longitudinal </w:t>
+      </w:r>
+      <w:r>
+        <w:t>laboratory measures, quality-of-life outcomes, and demographic and health information.</w:t>
+      </w:r>
+    </w:p>
+    <w:p>
+      <w:pPr>
+        <w:spacing w:before="100" w:beforeAutospacing="1" w:after="100" w:afterAutospacing="1" w:line="480" w:lineRule="auto"/>
+      </w:pPr>
+      <w:r>
+        <w:t>The participants were seen annually with year 0 being their last untreated visit, just before starting HAART. All other</w:t>
       </w:r>
       <w:r>
         <w:rPr>
@@ -759,35 +773,31 @@
           <w:kern w:val="2"/>
           <w14:ligatures w14:val="standardContextual"/>
         </w:rPr>
-        <w:t>The dataset contains up to 8 years of annual follow-up on 715 HIV-infected men after initiating HAART (highly active antiretroviral therapy), including longitudinal laboratory measures, quality-of-life outcomes, and demographic and health information.</w:t>
-      </w:r>
-    </w:p>
-    <w:p>
-      <w:pPr>
-        <w:spacing w:line="480" w:lineRule="auto"/>
+        <w:t xml:space="preserve"> visits, from year 1 to year 8, are on the treatment plan.</w:t>
+      </w:r>
+      <w:r>
         <w:rPr>
           <w:rFonts w:eastAsiaTheme="minorHAnsi"/>
           <w:kern w:val="2"/>
           <w14:ligatures w14:val="standardContextual"/>
         </w:rPr>
-      </w:pPr>
-    </w:p>
-    <w:p>
-      <w:pPr>
-        <w:spacing w:line="480" w:lineRule="auto"/>
+        <w:t xml:space="preserve"> Data included four measures of treatment response. The first outcome is viral load defined as the number of HIV RNA copies per milliliter of blood. The second outcome is CD4+ T-cell count, </w:t>
+      </w:r>
+      <w:r>
         <w:rPr>
           <w:rFonts w:eastAsiaTheme="minorHAnsi"/>
           <w:kern w:val="2"/>
           <w14:ligatures w14:val="standardContextual"/>
         </w:rPr>
-      </w:pPr>
+        <w:t xml:space="preserve">which is </w:t>
+      </w:r>
       <w:r>
         <w:rPr>
           <w:rFonts w:eastAsiaTheme="minorHAnsi"/>
           <w:kern w:val="2"/>
           <w14:ligatures w14:val="standardContextual"/>
         </w:rPr>
-        <w:t>The participants were seen annually with year 0 being their last untreated visit, just before starting HAART. All other visits, from year 1 to year 8, are on the treatment plan.</w:t>
+        <w:t xml:space="preserve">a measure of immune </w:t>
       </w:r>
       <w:r>
         <w:rPr>
@@ -795,7 +805,7 @@
           <w:kern w:val="2"/>
           <w14:ligatures w14:val="standardContextual"/>
         </w:rPr>
-        <w:t xml:space="preserve"> Data included four measures of treatment response. The first outcome is viral load defined as the number of HIV RNA copies per milliliter of blood. The second outcome is CD4+ T-cell count, </w:t>
+        <w:t>health</w:t>
       </w:r>
       <w:r>
         <w:rPr>
@@ -803,15 +813,23 @@
           <w:kern w:val="2"/>
           <w14:ligatures w14:val="standardContextual"/>
         </w:rPr>
-        <w:t xml:space="preserve">which is </w:t>
-      </w:r>
-      <w:r>
+        <w:t xml:space="preserve">. The last two are quality-of-life (QOL) measures derived from the SF-36 instrument. The aggregate physical health score and the aggregate mental health score, each </w:t>
+      </w:r>
+      <w:r>
+        <w:t>ranging from 0 to 100, with higher scores indicating better perceived health.</w:t>
+      </w:r>
+    </w:p>
+    <w:p>
+      <w:pPr>
+        <w:spacing w:before="100" w:beforeAutospacing="1" w:after="100" w:afterAutospacing="1" w:line="480" w:lineRule="auto"/>
         <w:rPr>
           <w:rFonts w:eastAsiaTheme="minorHAnsi"/>
           <w:kern w:val="2"/>
           <w14:ligatures w14:val="standardContextual"/>
         </w:rPr>
-        <w:t xml:space="preserve">a measure of immune </w:t>
+      </w:pPr>
+      <w:r>
+        <w:t>The purpose</w:t>
       </w:r>
       <w:r>
         <w:rPr>
@@ -819,44 +837,7 @@
           <w:kern w:val="2"/>
           <w14:ligatures w14:val="standardContextual"/>
         </w:rPr>
-        <w:t>health</w:t>
-      </w:r>
-      <w:r>
-        <w:rPr>
-          <w:rFonts w:eastAsiaTheme="minorHAnsi"/>
-          <w:kern w:val="2"/>
-          <w14:ligatures w14:val="standardContextual"/>
-        </w:rPr>
-        <w:t>. The last two are quality-of-life (QOL) measures derived from the SF-36 instrument. The aggregate physical health score and the aggregate mental health score, each ranging from 0 to 100, with higher scores indicating better perceived health.</w:t>
-      </w:r>
-    </w:p>
-    <w:p>
-      <w:pPr>
-        <w:spacing w:line="480" w:lineRule="auto"/>
-        <w:rPr>
-          <w:rFonts w:eastAsiaTheme="minorHAnsi"/>
-          <w:kern w:val="2"/>
-          <w14:ligatures w14:val="standardContextual"/>
-        </w:rPr>
-      </w:pPr>
-    </w:p>
-    <w:p>
-      <w:pPr>
-        <w:spacing w:before="100" w:beforeAutospacing="1" w:after="100" w:afterAutospacing="1"/>
-        <w:contextualSpacing/>
-        <w:rPr>
-          <w:rFonts w:eastAsiaTheme="minorHAnsi"/>
-          <w:kern w:val="2"/>
-          <w14:ligatures w14:val="standardContextual"/>
-        </w:rPr>
-      </w:pPr>
-      <w:r>
-        <w:rPr>
-          <w:rFonts w:eastAsiaTheme="minorHAnsi"/>
-          <w:kern w:val="2"/>
-          <w14:ligatures w14:val="standardContextual"/>
-        </w:rPr>
-        <w:t>The purpose of this report is to answer the following hypothesis/questions of interest:</w:t>
+        <w:t xml:space="preserve"> of this report is to answer the following hypothesis/questions of interest:</w:t>
       </w:r>
     </w:p>
     <w:p>
@@ -933,13 +914,13 @@
         <w:rPr>
           <w:color w:val="000000" w:themeColor="text1"/>
         </w:rPr>
-        <w:t xml:space="preserve">HIV RNA copies/mL, will be </w:t>
-      </w:r>
-      <w:r>
-        <w:rPr>
-          <w:color w:val="000000" w:themeColor="text1"/>
-        </w:rPr>
-        <w:t>higher</w:t>
+        <w:t xml:space="preserve">HIV RNA copies/mL, will </w:t>
+      </w:r>
+      <w:r>
+        <w:rPr>
+          <w:color w:val="000000" w:themeColor="text1"/>
+        </w:rPr>
+        <w:t>differ</w:t>
       </w:r>
       <w:r>
         <w:rPr>
@@ -982,13 +963,13 @@
         <w:rPr>
           <w:color w:val="000000" w:themeColor="text1"/>
         </w:rPr>
-        <w:t xml:space="preserve">Year-2 CD4+ T-cell counts, will be </w:t>
-      </w:r>
-      <w:r>
-        <w:rPr>
-          <w:color w:val="000000" w:themeColor="text1"/>
-        </w:rPr>
-        <w:t>lower</w:t>
+        <w:t xml:space="preserve">Year-2 CD4+ T-cell counts, will </w:t>
+      </w:r>
+      <w:r>
+        <w:rPr>
+          <w:color w:val="000000" w:themeColor="text1"/>
+        </w:rPr>
+        <w:t>differ</w:t>
       </w:r>
       <w:r>
         <w:rPr>
@@ -1101,10 +1082,9 @@
         <w:t>2.1 Data Cleaning</w:t>
       </w:r>
     </w:p>
-    <w:p/>
-    <w:p>
-      <w:pPr>
-        <w:spacing w:line="480" w:lineRule="auto"/>
+    <w:p>
+      <w:pPr>
+        <w:spacing w:before="100" w:beforeAutospacing="1" w:after="100" w:afterAutospacing="1" w:line="480" w:lineRule="auto"/>
       </w:pPr>
       <w:r>
         <w:t>The original dataset was structured in long format with repeated annual visits per participant. For this analysis, data were reshaped to a subject-level format including baseline (Year 0) and Year 2 measurements. Each row therefore represented a single participant with baseline covariates and Year 2 outcomes.</w:t>
@@ -1112,13 +1092,7 @@
     </w:p>
     <w:p>
       <w:pPr>
-        <w:spacing w:line="480" w:lineRule="auto"/>
-      </w:pPr>
-    </w:p>
-    <w:p>
-      <w:pPr>
-        <w:spacing w:line="480" w:lineRule="auto"/>
-        <w:contextualSpacing/>
+        <w:spacing w:before="100" w:beforeAutospacing="1" w:after="100" w:afterAutospacing="1" w:line="480" w:lineRule="auto"/>
       </w:pPr>
       <w:r>
         <w:t xml:space="preserve">Baseline hard drug use was coded as a binary indicator (Yes vs. No). Adherence during follow-up was dichotomized (&lt;95% vs. ≥95%). Follow-up status was defined as a binary variable indicating whether participants had complete baseline and Year 2 data required for </w:t>
@@ -1138,14 +1112,7 @@
     </w:p>
     <w:p>
       <w:pPr>
-        <w:spacing w:line="480" w:lineRule="auto"/>
-        <w:contextualSpacing/>
-      </w:pPr>
-    </w:p>
-    <w:p>
-      <w:pPr>
-        <w:spacing w:line="480" w:lineRule="auto"/>
-        <w:contextualSpacing/>
+        <w:spacing w:before="100" w:beforeAutospacing="1" w:after="100" w:afterAutospacing="1" w:line="480" w:lineRule="auto"/>
       </w:pPr>
       <w:r>
         <w:t xml:space="preserve">The race/ethnicity covariate </w:t>
@@ -1235,14 +1202,7 @@
     </w:p>
     <w:p>
       <w:pPr>
-        <w:spacing w:line="480" w:lineRule="auto"/>
-        <w:contextualSpacing/>
-      </w:pPr>
-    </w:p>
-    <w:p>
-      <w:pPr>
-        <w:spacing w:line="480" w:lineRule="auto"/>
-        <w:contextualSpacing/>
+        <w:spacing w:before="100" w:beforeAutospacing="1" w:after="100" w:afterAutospacing="1" w:line="480" w:lineRule="auto"/>
       </w:pPr>
       <w:r>
         <w:t>Participants without both baseline and Year 2 measurements were excluded from complete-case regression analyses.</w:t>
@@ -1711,14 +1671,17 @@
         <w:jc w:val="center"/>
       </w:pPr>
       <w:r>
-        <w:rPr>
-          <w:noProof/>
-        </w:rPr>
         <w:drawing>
-          <wp:inline distT="0" distB="0" distL="0" distR="0" wp14:anchorId="1BF16465" wp14:editId="5BA26532">
-            <wp:extent cx="5176093" cy="7150308"/>
-            <wp:effectExtent l="0" t="0" r="5715" b="0"/>
-            <wp:docPr id="1957693801" name="Picture 1" descr="A table with numbers and text&#10;&#10;AI-generated content may be incorrect."/>
+          <wp:inline distT="0" distB="0" distL="0" distR="0" wp14:anchorId="2F874BD3" wp14:editId="6CD50EA1">
+            <wp:extent cx="5044190" cy="7343613"/>
+            <wp:effectExtent l="0" t="0" r="0" b="0"/>
+            <wp:docPr id="5" name="Picture 4" descr="A table of numbers and text&#10;&#10;AI-generated content may be incorrect.">
+              <a:extLst xmlns:a="http://schemas.openxmlformats.org/drawingml/2006/main">
+                <a:ext uri="{FF2B5EF4-FFF2-40B4-BE49-F238E27FC236}">
+                  <a16:creationId xmlns:a16="http://schemas.microsoft.com/office/drawing/2014/main" id="{34F9E3E6-3B52-9F5B-7D2C-EEA89A8243B3}"/>
+                </a:ext>
+              </a:extLst>
+            </wp:docPr>
             <wp:cNvGraphicFramePr>
               <a:graphicFrameLocks xmlns:a="http://schemas.openxmlformats.org/drawingml/2006/main" noChangeAspect="1"/>
             </wp:cNvGraphicFramePr>
@@ -1726,8 +1689,16 @@
               <a:graphicData uri="http://schemas.openxmlformats.org/drawingml/2006/picture">
                 <pic:pic xmlns:pic="http://schemas.openxmlformats.org/drawingml/2006/picture">
                   <pic:nvPicPr>
-                    <pic:cNvPr id="1957693801" name="Picture 1" descr="A table with numbers and text&#10;&#10;AI-generated content may be incorrect."/>
-                    <pic:cNvPicPr/>
+                    <pic:cNvPr id="5" name="Picture 4" descr="A table of numbers and text&#10;&#10;AI-generated content may be incorrect.">
+                      <a:extLst>
+                        <a:ext uri="{FF2B5EF4-FFF2-40B4-BE49-F238E27FC236}">
+                          <a16:creationId xmlns:a16="http://schemas.microsoft.com/office/drawing/2014/main" id="{34F9E3E6-3B52-9F5B-7D2C-EEA89A8243B3}"/>
+                        </a:ext>
+                      </a:extLst>
+                    </pic:cNvPr>
+                    <pic:cNvPicPr>
+                      <a:picLocks noChangeAspect="1"/>
+                    </pic:cNvPicPr>
                   </pic:nvPicPr>
                   <pic:blipFill>
                     <a:blip r:embed="rId8"/>
@@ -1738,7 +1709,7 @@
                   <pic:spPr>
                     <a:xfrm>
                       <a:off x="0" y="0"/>
-                      <a:ext cx="5191961" cy="7172228"/>
+                      <a:ext cx="5084261" cy="7401951"/>
                     </a:xfrm>
                     <a:prstGeom prst="rect">
                       <a:avLst/>
@@ -1858,6 +1829,9 @@
       <w:r>
         <w:lastRenderedPageBreak/>
         <w:t>Of 715 participants, 463 (65%) had complete Year 2 outcome data and were included in regression analyses. Baseline hard drug users reported lower physical and mental QOL scores and lower CD4 counts compared with non-users. Viral load, age, BMI, and race/ethnicity distributions were similar between groups.</w:t>
+      </w:r>
+      <w:r>
+        <w:t xml:space="preserve"> All but one of the hard drug users had adherence below 95%</w:t>
       </w:r>
     </w:p>
     <w:p>
@@ -2777,7 +2751,6 @@
         </w:rPr>
         <w:t xml:space="preserve"> statistics and ESS all demonstrated good mixing and convergence </w:t>
       </w:r>
-      <w:proofErr w:type="spellStart"/>
       <w:r>
         <w:rPr>
           <w:rFonts w:eastAsiaTheme="minorHAnsi"/>
@@ -2785,9 +2758,8 @@
           <w:kern w:val="2"/>
           <w14:ligatures w14:val="standardContextual"/>
         </w:rPr>
-        <w:t>criterias</w:t>
-      </w:r>
-      <w:proofErr w:type="spellEnd"/>
+        <w:t>criteria</w:t>
+      </w:r>
       <w:r>
         <w:rPr>
           <w:rFonts w:eastAsiaTheme="minorHAnsi"/>
@@ -2795,7 +2767,27 @@
           <w:kern w:val="2"/>
           <w14:ligatures w14:val="standardContextual"/>
         </w:rPr>
-        <w:t xml:space="preserve"> (supplementary).</w:t>
+        <w:t xml:space="preserve"> (</w:t>
+      </w:r>
+      <w:hyperlink w:anchor="_Supplementary" w:history="1">
+        <w:r>
+          <w:rPr>
+            <w:rStyle w:val="Hyperlink"/>
+            <w:rFonts w:eastAsiaTheme="minorHAnsi"/>
+            <w:kern w:val="2"/>
+            <w14:ligatures w14:val="standardContextual"/>
+          </w:rPr>
+          <w:t>supplementary</w:t>
+        </w:r>
+      </w:hyperlink>
+      <w:r>
+        <w:rPr>
+          <w:rFonts w:eastAsiaTheme="minorHAnsi"/>
+          <w:color w:val="000000" w:themeColor="text1"/>
+          <w:kern w:val="2"/>
+          <w14:ligatures w14:val="standardContextual"/>
+        </w:rPr>
+        <w:t>).</w:t>
       </w:r>
       <w:r>
         <w:t xml:space="preserve"> </w:t>
@@ -3464,11 +3456,6 @@
       <w:pPr>
         <w:spacing w:before="100" w:beforeAutospacing="1" w:after="100" w:afterAutospacing="1" w:line="480" w:lineRule="auto"/>
       </w:pPr>
-    </w:p>
-    <w:p>
-      <w:pPr>
-        <w:spacing w:before="100" w:beforeAutospacing="1" w:after="100" w:afterAutospacing="1" w:line="480" w:lineRule="auto"/>
-      </w:pPr>
       <w:r>
         <w:t xml:space="preserve">Loss to follow-up was associated with lower baseline physical QOL and younger age, but not with baseline laboratory measures, and this pattern was consistent across hard drug users and non-users. </w:t>
       </w:r>
@@ -3547,28 +3534,25 @@
         <w:t xml:space="preserve"> Second, adherence was measured as a binary variable (&lt;95% vs  ≥95%) and may be too simplistic for proper classification. Because of this, </w:t>
       </w:r>
       <w:r>
-        <w:t xml:space="preserve">mediation was evaluated using an exploratory attenuation approach rather than a formal causal </w:t>
-      </w:r>
+        <w:t>mediation was evaluated using an exploratory attenuation approach rather than a formal causal mediation framework.</w:t>
+      </w:r>
+      <w:r>
+        <w:t xml:space="preserve"> There was a relatively small number of baseline hard drug users (36)</w:t>
+      </w:r>
+      <w:r>
+        <w:t>, which may not contain enough power to accurately make comparisons.</w:t>
+      </w:r>
+    </w:p>
+    <w:p>
+      <w:pPr>
+        <w:spacing w:line="480" w:lineRule="auto"/>
+      </w:pPr>
       <w:r>
         <w:lastRenderedPageBreak/>
-        <w:t>mediation framework.</w:t>
-      </w:r>
-      <w:r>
-        <w:t xml:space="preserve"> There was a relatively small number of baseline hard drug users (36)</w:t>
-      </w:r>
-      <w:r>
-        <w:t>, which may not contain enough power to accurately make comparisons.</w:t>
-      </w:r>
-    </w:p>
-    <w:p>
-      <w:pPr>
-        <w:spacing w:line="480" w:lineRule="auto"/>
-      </w:pPr>
-      <w:r>
         <w:t>Lastly, the i</w:t>
       </w:r>
       <w:r>
-        <w:t xml:space="preserve">nterpretation of SF-36 physical and mental QOL scores is limited because meaningful clinical interpretation typically requires comparison to age-, sex-, and population-specific normative data. </w:t>
+        <w:t xml:space="preserve">nterpretation of SF-36 physical and mental QOL scores is limited because meaningful clinical interpretation typically requires comparison to age-, sex-, and population-specific data. </w:t>
       </w:r>
     </w:p>
     <w:p>
@@ -3665,14 +3649,18 @@
         <w:pStyle w:val="Heading2"/>
       </w:pPr>
     </w:p>
+    <w:p>
+      <w:pPr>
+        <w:pStyle w:val="Heading2"/>
+      </w:pPr>
+    </w:p>
     <w:p/>
-    <w:p/>
-    <w:p/>
     <w:p>
       <w:pPr>
         <w:pStyle w:val="Heading2"/>
       </w:pPr>
       <w:r>
+        <w:lastRenderedPageBreak/>
         <w:t>References</w:t>
       </w:r>
       <w:bookmarkEnd w:id="6"/>
@@ -4281,32 +4269,11 @@
     </w:p>
     <w:p>
       <w:pPr>
-        <w:spacing w:after="160" w:line="278" w:lineRule="auto"/>
-        <w:rPr>
-          <w:color w:val="000000" w:themeColor="text1"/>
-        </w:rPr>
-      </w:pPr>
-    </w:p>
-    <w:p>
-      <w:pPr>
-        <w:rPr>
-          <w:color w:val="000000" w:themeColor="text1"/>
-        </w:rPr>
-      </w:pPr>
-    </w:p>
-    <w:p>
-      <w:pPr>
-        <w:rPr>
-          <w:color w:val="000000" w:themeColor="text1"/>
-        </w:rPr>
-      </w:pPr>
-    </w:p>
-    <w:p>
-      <w:pPr>
         <w:pStyle w:val="Heading2"/>
       </w:pPr>
       <w:bookmarkStart w:id="7" w:name="_Toc221022978"/>
       <w:r>
+        <w:lastRenderedPageBreak/>
         <w:t>Reproducibility Statement</w:t>
       </w:r>
       <w:bookmarkEnd w:id="7"/>
@@ -4356,6 +4323,8 @@
       <w:pPr>
         <w:pStyle w:val="Heading2"/>
       </w:pPr>
+      <w:bookmarkStart w:id="8" w:name="_Supplementary"/>
+      <w:bookmarkEnd w:id="8"/>
       <w:r>
         <w:t>S</w:t>
       </w:r>

</xml_diff>

<commit_message>
Final edits to report, presentation, and code.
</commit_message>
<xml_diff>
--- a/Project1/Reports/Project1_Final_Report.docx
+++ b/Project1/Reports/Project1_Final_Report.docx
@@ -252,21 +252,7 @@
                 <w:rStyle w:val="Hyperlink"/>
                 <w:noProof/>
               </w:rPr>
-              <w:t>Met</w:t>
-            </w:r>
-            <w:r>
-              <w:rPr>
-                <w:rStyle w:val="Hyperlink"/>
-                <w:noProof/>
-              </w:rPr>
-              <w:t>h</w:t>
-            </w:r>
-            <w:r>
-              <w:rPr>
-                <w:rStyle w:val="Hyperlink"/>
-                <w:noProof/>
-              </w:rPr>
-              <w:t>ods</w:t>
+              <w:t>Methods</w:t>
             </w:r>
             <w:r>
               <w:rPr>
@@ -562,21 +548,7 @@
                 <w:rStyle w:val="Hyperlink"/>
                 <w:noProof/>
               </w:rPr>
-              <w:t>Reproducib</w:t>
-            </w:r>
-            <w:r>
-              <w:rPr>
-                <w:rStyle w:val="Hyperlink"/>
-                <w:noProof/>
-              </w:rPr>
-              <w:t>i</w:t>
-            </w:r>
-            <w:r>
-              <w:rPr>
-                <w:rStyle w:val="Hyperlink"/>
-                <w:noProof/>
-              </w:rPr>
-              <w:t>lity Statement</w:t>
+              <w:t>Reproducibility Statement</w:t>
             </w:r>
             <w:r>
               <w:rPr>
@@ -1429,10 +1401,7 @@
         <w:t>1000</w:t>
       </w:r>
       <w:r>
-        <w:t xml:space="preserve"> </w:t>
-      </w:r>
-      <w:r>
-        <w:t>(</w:t>
+        <w:t xml:space="preserve"> (</w:t>
       </w:r>
       <w:proofErr w:type="spellStart"/>
       <w:r>
@@ -1577,58 +1546,34 @@
         <w:pStyle w:val="Heading4"/>
       </w:pPr>
       <w:r>
-        <w:t>2.2</w:t>
-      </w:r>
-      <w:r>
-        <w:t>.1</w:t>
+        <w:t xml:space="preserve">2.2.1 Mediation </w:t>
+      </w:r>
+    </w:p>
+    <w:p/>
+    <w:p>
+      <w:pPr>
+        <w:spacing w:line="480" w:lineRule="auto"/>
+      </w:pPr>
+      <w:r>
+        <w:t xml:space="preserve">To evaluate whether adherence mediated the association between baseline hard drug use and Year 2 outcomes, two models were fit for each outcome: (1) a total-effect model excluding adherence, and (2) a direct-effect model including adherence. </w:t>
+      </w:r>
+      <w:r>
+        <w:t>Evidence consistent with mediation was assessed by examining attenuation of the hard drug use coefficient after inclusion of adherence.</w:t>
       </w:r>
       <w:r>
         <w:t xml:space="preserve"> </w:t>
       </w:r>
       <w:r>
-        <w:t>Mediation</w:t>
-      </w:r>
-      <w:r>
-        <w:t xml:space="preserve"> </w:t>
+        <w:t>The proportion mediated was calculated as (TE − DE) / TE. This approach represents an exploratory difference-in-coefficients method and does not constitute a formal causal mediation analysis.</w:t>
       </w:r>
     </w:p>
     <w:p/>
     <w:p>
       <w:pPr>
-        <w:spacing w:line="480" w:lineRule="auto"/>
-      </w:pPr>
-      <w:r>
-        <w:t xml:space="preserve">To evaluate whether adherence mediated the association between baseline hard drug use and Year 2 outcomes, two models were fit for each outcome: (1) a total-effect model excluding adherence, and (2) a direct-effect model including adherence. </w:t>
-      </w:r>
-      <w:r>
-        <w:t>Evidence consistent with mediation was assessed by examining attenuation of the hard drug use coefficient after inclusion of adherence.</w:t>
-      </w:r>
-      <w:r>
-        <w:t xml:space="preserve"> </w:t>
-      </w:r>
-      <w:r>
-        <w:t>The proportion mediated was calculated as (TE − DE) / TE. This approach represents an exploratory difference-in-coefficients method and does not constitute a formal causal mediation analysis.</w:t>
-      </w:r>
-    </w:p>
-    <w:p/>
-    <w:p>
-      <w:pPr>
         <w:pStyle w:val="Heading4"/>
       </w:pPr>
       <w:r>
-        <w:t>2.2.</w:t>
-      </w:r>
-      <w:r>
-        <w:t>2</w:t>
-      </w:r>
-      <w:r>
-        <w:t xml:space="preserve"> </w:t>
-      </w:r>
-      <w:r>
-        <w:t>Loss to Follow-up</w:t>
-      </w:r>
-      <w:r>
-        <w:t xml:space="preserve"> </w:t>
+        <w:t xml:space="preserve">2.2.2 Loss to Follow-up </w:t>
       </w:r>
     </w:p>
     <w:p/>
@@ -1671,6 +1616,9 @@
         <w:jc w:val="center"/>
       </w:pPr>
       <w:r>
+        <w:rPr>
+          <w:noProof/>
+        </w:rPr>
         <w:drawing>
           <wp:inline distT="0" distB="0" distL="0" distR="0" wp14:anchorId="2F874BD3" wp14:editId="6CD50EA1">
             <wp:extent cx="5044190" cy="7343613"/>
@@ -2046,9 +1994,6 @@
           </m:sSubPr>
           <m:e>
             <m:r>
-              <m:rPr>
-                <m:sty m:val="p"/>
-              </m:rPr>
               <w:rPr>
                 <w:rFonts w:ascii="Cambria Math" w:eastAsiaTheme="minorHAnsi" w:hAnsi="Cambria Math"/>
                 <w:color w:val="000000" w:themeColor="text1"/>
@@ -2062,9 +2007,6 @@
           </m:e>
           <m:sub>
             <m:r>
-              <m:rPr>
-                <m:sty m:val="p"/>
-              </m:rPr>
               <w:rPr>
                 <w:rFonts w:ascii="Cambria Math" w:eastAsiaTheme="minorHAnsi" w:hAnsi="Cambria Math"/>
                 <w:color w:val="000000" w:themeColor="text1"/>
@@ -2073,21 +2015,7 @@
                 <w:szCs w:val="24"/>
                 <w14:ligatures w14:val="standardContextual"/>
               </w:rPr>
-              <m:t>10</m:t>
-            </m:r>
-            <m:r>
-              <m:rPr>
-                <m:sty m:val="p"/>
-              </m:rPr>
-              <w:rPr>
-                <w:rFonts w:ascii="Cambria Math" w:eastAsiaTheme="minorHAnsi" w:hAnsi="Cambria Math"/>
-                <w:color w:val="000000" w:themeColor="text1"/>
-                <w:kern w:val="2"/>
-                <w:sz w:val="24"/>
-                <w:szCs w:val="24"/>
-                <w14:ligatures w14:val="standardContextual"/>
-              </w:rPr>
-              <m:t xml:space="preserve"> </m:t>
+              <m:t xml:space="preserve">10 </m:t>
             </m:r>
           </m:sub>
         </m:sSub>
@@ -2832,14 +2760,11 @@
         <w:jc w:val="center"/>
       </w:pPr>
       <w:r>
-        <w:rPr>
-          <w:noProof/>
-        </w:rPr>
         <w:drawing>
-          <wp:inline distT="0" distB="0" distL="0" distR="0" wp14:anchorId="555AAA6B" wp14:editId="1248AF21">
-            <wp:extent cx="5943600" cy="2755900"/>
+          <wp:inline distT="0" distB="0" distL="0" distR="0" wp14:anchorId="56C35A4F" wp14:editId="75A7A9B6">
+            <wp:extent cx="5943600" cy="2794635"/>
             <wp:effectExtent l="0" t="0" r="0" b="0"/>
-            <wp:docPr id="519790853" name="Picture 1" descr="A screenshot of a computer&#10;&#10;AI-generated content may be incorrect."/>
+            <wp:docPr id="1459037590" name="Picture 1" descr="A screenshot of a computer&#10;&#10;AI-generated content may be incorrect."/>
             <wp:cNvGraphicFramePr>
               <a:graphicFrameLocks xmlns:a="http://schemas.openxmlformats.org/drawingml/2006/main" noChangeAspect="1"/>
             </wp:cNvGraphicFramePr>
@@ -2847,7 +2772,7 @@
               <a:graphicData uri="http://schemas.openxmlformats.org/drawingml/2006/picture">
                 <pic:pic xmlns:pic="http://schemas.openxmlformats.org/drawingml/2006/picture">
                   <pic:nvPicPr>
-                    <pic:cNvPr id="297571299" name="Picture 1" descr="A screenshot of a computer&#10;&#10;AI-generated content may be incorrect."/>
+                    <pic:cNvPr id="1459037590" name="Picture 1" descr="A screenshot of a computer&#10;&#10;AI-generated content may be incorrect."/>
                     <pic:cNvPicPr/>
                   </pic:nvPicPr>
                   <pic:blipFill>
@@ -2859,7 +2784,7 @@
                   <pic:spPr>
                     <a:xfrm>
                       <a:off x="0" y="0"/>
-                      <a:ext cx="5943600" cy="2755900"/>
+                      <a:ext cx="5943600" cy="2794635"/>
                     </a:xfrm>
                     <a:prstGeom prst="rect">
                       <a:avLst/>
@@ -2978,7 +2903,7 @@
         <w:t>, except for mental QOL</w:t>
       </w:r>
       <w:r>
-        <w:t>. These findings indicate inconsistent mediation (suppression) and provide little evidence that adherence mediates the relationship between baseline hard drug use and treatment outcomes.</w:t>
+        <w:t>. These findings indicate inconsistent mediation and provide little evidence that adherence mediates the relationship between baseline hard drug use and treatment outcomes.</w:t>
       </w:r>
     </w:p>
     <w:p>
@@ -3010,6 +2935,7 @@
       </w:pPr>
       <w:r>
         <w:rPr>
+          <w:noProof/>
           <w:sz w:val="21"/>
           <w:szCs w:val="21"/>
         </w:rPr>
@@ -3188,10 +3114,10 @@
           <w:szCs w:val="21"/>
         </w:rPr>
         <w:drawing>
-          <wp:inline distT="0" distB="0" distL="0" distR="0" wp14:anchorId="14ED4613" wp14:editId="0CE5F88D">
-            <wp:extent cx="5943600" cy="1071880"/>
-            <wp:effectExtent l="0" t="0" r="0" b="0"/>
-            <wp:docPr id="1638632439" name="Picture 1" descr="A screenshot of a computer&#10;&#10;AI-generated content may be incorrect."/>
+          <wp:inline distT="0" distB="0" distL="0" distR="0" wp14:anchorId="73BD4520" wp14:editId="7C8B01CC">
+            <wp:extent cx="5943600" cy="1076325"/>
+            <wp:effectExtent l="0" t="0" r="0" b="3175"/>
+            <wp:docPr id="2024647551" name="Picture 1" descr="A screenshot of a graph&#10;&#10;AI-generated content may be incorrect."/>
             <wp:cNvGraphicFramePr>
               <a:graphicFrameLocks xmlns:a="http://schemas.openxmlformats.org/drawingml/2006/main" noChangeAspect="1"/>
             </wp:cNvGraphicFramePr>
@@ -3199,7 +3125,7 @@
               <a:graphicData uri="http://schemas.openxmlformats.org/drawingml/2006/picture">
                 <pic:pic xmlns:pic="http://schemas.openxmlformats.org/drawingml/2006/picture">
                   <pic:nvPicPr>
-                    <pic:cNvPr id="1638632439" name="Picture 1" descr="A screenshot of a computer&#10;&#10;AI-generated content may be incorrect."/>
+                    <pic:cNvPr id="2024647551" name="Picture 1" descr="A screenshot of a graph&#10;&#10;AI-generated content may be incorrect."/>
                     <pic:cNvPicPr/>
                   </pic:nvPicPr>
                   <pic:blipFill>
@@ -3211,7 +3137,7 @@
                   <pic:spPr>
                     <a:xfrm>
                       <a:off x="0" y="0"/>
-                      <a:ext cx="5943600" cy="1071880"/>
+                      <a:ext cx="5943600" cy="1076325"/>
                     </a:xfrm>
                     <a:prstGeom prst="rect">
                       <a:avLst/>
@@ -3508,36 +3434,61 @@
         <w:t xml:space="preserve"> </w:t>
       </w:r>
       <w:r>
-        <w:t>Limitations</w:t>
+        <w:t xml:space="preserve">Limitations </w:t>
+      </w:r>
+    </w:p>
+    <w:p>
+      <w:pPr>
+        <w:spacing w:before="100" w:beforeAutospacing="1" w:after="100" w:afterAutospacing="1" w:line="480" w:lineRule="auto"/>
+      </w:pPr>
+      <w:r>
+        <w:t xml:space="preserve">Several limitations should be noted. First, the observational design </w:t>
+      </w:r>
+      <w:r>
+        <w:t xml:space="preserve">of this study can suffer from bias due to exposure of interest not being randomly assigned and unmeasured confounders, </w:t>
+      </w:r>
+      <w:r>
+        <w:t>which may lead to misleading associations</w:t>
+      </w:r>
+      <w:r>
+        <w:t>.</w:t>
+      </w:r>
+      <w:r>
+        <w:t xml:space="preserve"> Second, adherence was measured as a binary variable (&lt;95% vs  ≥95%) and </w:t>
+      </w:r>
+      <w:r>
+        <w:t>only one subject was observed for the &lt;95% grouping</w:t>
+      </w:r>
+      <w:r>
+        <w:t xml:space="preserve">. </w:t>
+      </w:r>
+      <w:r>
+        <w:t xml:space="preserve">This was likely a reason for the negative proportion mediated, so adherence could not be reliably </w:t>
+      </w:r>
+      <w:r>
+        <w:t>evaluated and should be treated as descriptive</w:t>
+      </w:r>
+      <w:r>
+        <w:t xml:space="preserve">. </w:t>
+      </w:r>
+      <w:r>
+        <w:t xml:space="preserve">Because of this, </w:t>
+      </w:r>
+      <w:r>
+        <w:t>mediation was evaluated using an exploratory attenuation approach rather than a formal causal mediation framework.</w:t>
       </w:r>
       <w:r>
         <w:t xml:space="preserve"> </w:t>
       </w:r>
-    </w:p>
-    <w:p>
-      <w:pPr>
-        <w:spacing w:before="100" w:beforeAutospacing="1" w:after="100" w:afterAutospacing="1" w:line="480" w:lineRule="auto"/>
-      </w:pPr>
-      <w:r>
-        <w:t xml:space="preserve">Several limitations should be noted. First, the observational design </w:t>
-      </w:r>
-      <w:r>
-        <w:t xml:space="preserve">of this study can suffer from bias due to exposure of interest not being randomly assigned and unmeasured confounders, </w:t>
-      </w:r>
-      <w:r>
-        <w:t>which may lead to misleading associations</w:t>
-      </w:r>
-      <w:r>
-        <w:t>.</w:t>
-      </w:r>
-      <w:r>
-        <w:t xml:space="preserve"> Second, adherence was measured as a binary variable (&lt;95% vs  ≥95%) and may be too simplistic for proper classification. Because of this, </w:t>
-      </w:r>
-      <w:r>
-        <w:t>mediation was evaluated using an exploratory attenuation approach rather than a formal causal mediation framework.</w:t>
-      </w:r>
-      <w:r>
-        <w:t xml:space="preserve"> There was a relatively small number of baseline hard drug users (36)</w:t>
+      <w:r>
+        <w:t>Third, t</w:t>
+      </w:r>
+      <w:r>
+        <w:t xml:space="preserve">here </w:t>
+      </w:r>
+      <w:r>
+        <w:lastRenderedPageBreak/>
+        <w:t>was a relatively small number of baseline hard drug users (36)</w:t>
       </w:r>
       <w:r>
         <w:t>, which may not contain enough power to accurately make comparisons.</w:t>
@@ -3548,7 +3499,6 @@
         <w:spacing w:line="480" w:lineRule="auto"/>
       </w:pPr>
       <w:r>
-        <w:lastRenderedPageBreak/>
         <w:t>Lastly, the i</w:t>
       </w:r>
       <w:r>
@@ -3561,10 +3511,7 @@
         <w:contextualSpacing/>
       </w:pPr>
       <w:r>
-        <w:t>4.</w:t>
-      </w:r>
-      <w:r>
-        <w:t>2</w:t>
+        <w:t>4.2</w:t>
       </w:r>
       <w:r>
         <w:t xml:space="preserve"> </w:t>
@@ -3644,16 +3591,7 @@
         <w:pStyle w:val="Heading2"/>
       </w:pPr>
     </w:p>
-    <w:p>
-      <w:pPr>
-        <w:pStyle w:val="Heading2"/>
-      </w:pPr>
-    </w:p>
-    <w:p>
-      <w:pPr>
-        <w:pStyle w:val="Heading2"/>
-      </w:pPr>
-    </w:p>
+    <w:p/>
     <w:p/>
     <w:p>
       <w:pPr>
@@ -4326,10 +4264,7 @@
       <w:bookmarkStart w:id="8" w:name="_Supplementary"/>
       <w:bookmarkEnd w:id="8"/>
       <w:r>
-        <w:t>S</w:t>
-      </w:r>
-      <w:r>
-        <w:t>upplementary</w:t>
+        <w:t>Supplementary</w:t>
       </w:r>
     </w:p>
     <w:p>
@@ -6089,6 +6024,7 @@
   <w:style w:type="character" w:default="1" w:styleId="DefaultParagraphFont">
     <w:name w:val="Default Paragraph Font"/>
     <w:uiPriority w:val="1"/>
+    <w:semiHidden/>
     <w:unhideWhenUsed/>
   </w:style>
   <w:style w:type="table" w:default="1" w:styleId="TableNormal">

</xml_diff>